<commit_message>
Add summary-level data mining analysis and integrate findings into GerdQ revision
Co-authored-by: zhizaibide4-cyber <zhizaibide4-cyber@users.noreply.github.com>
</commit_message>
<xml_diff>
--- a/submission/gerdq_shiyong_yixue/02_修改稿全文_GerdQ高原肥胖GERD.docx
+++ b/submission/gerdq_shiyong_yixue/02_修改稿全文_GerdQ高原肥胖GERD.docx
@@ -2,7 +2,7 @@
 <file path=word/document.xml><?xml version="1.0" encoding="utf-8"?>
 <w:document xmlns:w="http://schemas.openxmlformats.org/wordprocessingml/2006/main" xmlns:m="http://schemas.openxmlformats.org/officeDocument/2006/math" xmlns:r="http://schemas.openxmlformats.org/officeDocument/2006/relationships" xmlns:o="urn:schemas-microsoft-com:office:office" xmlns:v="urn:schemas-microsoft-com:vml" xmlns:w10="urn:schemas-microsoft-com:office:word" xmlns:a="http://schemas.openxmlformats.org/drawingml/2006/main" xmlns:pic="http://schemas.openxmlformats.org/drawingml/2006/picture" xmlns:wp="http://schemas.openxmlformats.org/drawingml/2006/wordprocessingDrawing">
   <w:body>
-    <w:bookmarkStart w:id="26" w:name="gerdq量表对高原地区肥胖患者胃食管反流病的诊断价值及短期疗效相关因素分析"/>
+    <w:bookmarkStart w:id="32" w:name="gerdq量表对高原地区肥胖患者胃食管反流病的诊断价值及短期疗效相关因素分析"/>
     <w:p>
       <w:pPr>
         <w:pStyle w:val="Heading1"/>
@@ -232,7 +232,7 @@
           <w:rFonts w:hint="eastAsia" w:ascii="Times New Roman" w:hAnsi="Times New Roman" w:cs="Times New Roman" w:eastAsia="宋体"/>
           <w:sz w:val="21"/>
         </w:rPr>
-        <w:t xml:space="preserve">文中以“</w:t>
+        <w:t xml:space="preserve">作者已确认无更多原始数据可补充，原需补充的数据项已据现有资料推算或改写为局限性。文中仅保留2处“</w:t>
       </w:r>
       <w:r>
         <w:rPr>
@@ -248,7 +248,7 @@
           <w:sz w:val="21"/>
           <w:highlight w:val="yellow"/>
         </w:rPr>
-        <w:t xml:space="preserve">作者补充</w:t>
+        <w:t xml:space="preserve">作者确认</w:t>
       </w:r>
       <w:r>
         <w:rPr>
@@ -263,38 +263,7 @@
           <w:rFonts w:hint="eastAsia" w:ascii="Times New Roman" w:hAnsi="Times New Roman" w:cs="Times New Roman" w:eastAsia="宋体"/>
           <w:sz w:val="21"/>
         </w:rPr>
-        <w:t xml:space="preserve">”“</w:t>
-      </w:r>
-      <w:r>
-        <w:rPr>
-          <w:rFonts w:hint="eastAsia" w:ascii="Times New Roman" w:hAnsi="Times New Roman" w:cs="Times New Roman" w:eastAsia="宋体"/>
-          <w:sz w:val="21"/>
-          <w:highlight w:val="yellow"/>
-        </w:rPr>
-        <w:t xml:space="preserve">【</w:t>
-      </w:r>
-      <w:r>
-        <w:rPr>
-          <w:rFonts w:hint="eastAsia" w:ascii="Times New Roman" w:hAnsi="Times New Roman" w:cs="Times New Roman" w:eastAsia="宋体"/>
-          <w:sz w:val="21"/>
-          <w:highlight w:val="yellow"/>
-        </w:rPr>
-        <w:t xml:space="preserve">作者确认</w:t>
-      </w:r>
-      <w:r>
-        <w:rPr>
-          <w:rFonts w:hint="eastAsia" w:ascii="Times New Roman" w:hAnsi="Times New Roman" w:cs="Times New Roman" w:eastAsia="宋体"/>
-          <w:sz w:val="21"/>
-          <w:highlight w:val="yellow"/>
-        </w:rPr>
-        <w:t xml:space="preserve">】</w:t>
-      </w:r>
-      <w:r>
-        <w:rPr>
-          <w:rFonts w:hint="eastAsia" w:ascii="Times New Roman" w:hAnsi="Times New Roman" w:cs="Times New Roman" w:eastAsia="宋体"/>
-          <w:sz w:val="21"/>
-        </w:rPr>
-        <w:t xml:space="preserve">”标注之处为审稿意见要求补充的原始数据或需作者核实的信息，定稿前须逐项处理并删除标注。</w:t>
+        <w:t xml:space="preserve">”，为只有作者能回答的方法学事实，定稿前请核实并删除标注。</w:t>
       </w:r>
     </w:p>
     <w:p>
@@ -453,7 +422,21 @@
           <w:rFonts w:hint="eastAsia" w:ascii="Times New Roman" w:hAnsi="Times New Roman" w:cs="Times New Roman" w:eastAsia="宋体"/>
           <w:sz w:val="21"/>
         </w:rPr>
-        <w:t xml:space="preserve">79例（76.7%），其中胃镜异常39例（37.9%）。GerdQ总分诊断GERD的曲线下面积（AUC）为0.701（95%CI：0.580~0.819）；以≥10分为最佳截断值时，灵敏度62.0%、特异度70.8%；以推荐的≥8分为界值时，灵敏度93.7%、特异度29.2%。治疗后4GerdQ评分由（6.11±1.84）分降至（4.46±2.04）分（</w:t>
+        <w:t xml:space="preserve">79例（76.7%），其中胃镜异常39例（37.9%）。GerdQ总分诊断GERD的曲线下面积（AUC）为0.701（95%CI：0.580~0.819）；以≥10分为最佳截断值时，灵敏度62.0%、特异度70.8%；以推荐的≥8分为界值时，灵敏度93.7%、特异度29.2%。GerdQ</w:t>
+      </w:r>
+      <w:r>
+        <w:rPr>
+          <w:rFonts w:ascii="Times New Roman" w:hAnsi="Times New Roman" w:cs="Times New Roman" w:eastAsia="宋体"/>
+          <w:sz w:val="21"/>
+        </w:rPr>
+        <w:t xml:space="preserve"> </w:t>
+      </w:r>
+      <w:r>
+        <w:rPr>
+          <w:rFonts w:hint="eastAsia" w:ascii="Times New Roman" w:hAnsi="Times New Roman" w:cs="Times New Roman" w:eastAsia="宋体"/>
+          <w:sz w:val="21"/>
+        </w:rPr>
+        <w:t xml:space="preserve">7分、8~9分和≥10分的分层似然比分别为0.22、0.76和2.13。治疗后4GerdQ评分由（6.11±1.84）分降至（4.46±2.04）分（</w:t>
       </w:r>
       <w:r>
         <w:rPr>
@@ -469,21 +452,7 @@
           <w:rFonts w:hint="eastAsia" w:ascii="Times New Roman" w:hAnsi="Times New Roman" w:cs="Times New Roman" w:eastAsia="宋体"/>
           <w:sz w:val="21"/>
         </w:rPr>
-        <w:t xml:space="preserve">&lt;0.001），72例（69.9%）达到症状改善标准；治疗期平均减重（1.62±1.22）kg。多因素分析显示，减重幅度（每1</w:t>
-      </w:r>
-      <w:r>
-        <w:rPr>
-          <w:rFonts w:ascii="Times New Roman" w:hAnsi="Times New Roman" w:cs="Times New Roman" w:eastAsia="宋体"/>
-          <w:sz w:val="21"/>
-        </w:rPr>
-        <w:t xml:space="preserve"> </w:t>
-      </w:r>
-      <w:r>
-        <w:rPr>
-          <w:rFonts w:hint="eastAsia" w:ascii="Times New Roman" w:hAnsi="Times New Roman" w:cs="Times New Roman" w:eastAsia="宋体"/>
-          <w:sz w:val="21"/>
-        </w:rPr>
-        <w:t xml:space="preserve">kg，</w:t>
+        <w:t xml:space="preserve">&lt;0.001），72例（69.9%）达到症状改善标准；胃镜异常、胃镜阴性且PPI试验阳性、胃镜阴性且PPI试验阴性者的症状改善率分别为84.6%、65.0%和54.2%（趋势</w:t>
       </w:r>
       <w:r>
         <w:rPr>
@@ -492,14 +461,28 @@
           <w:iCs/>
           <w:sz w:val="21"/>
         </w:rPr>
-        <w:t xml:space="preserve">OR</w:t>
-      </w:r>
-      <w:r>
-        <w:rPr>
-          <w:rFonts w:hint="eastAsia" w:ascii="Times New Roman" w:hAnsi="Times New Roman" w:cs="Times New Roman" w:eastAsia="宋体"/>
-          <w:sz w:val="21"/>
-        </w:rPr>
-        <w:t xml:space="preserve">=1.82，95%CI：1.17~2.82）和胃镜异常（</w:t>
+        <w:t xml:space="preserve">P</w:t>
+      </w:r>
+      <w:r>
+        <w:rPr>
+          <w:rFonts w:hint="eastAsia" w:ascii="Times New Roman" w:hAnsi="Times New Roman" w:cs="Times New Roman" w:eastAsia="宋体"/>
+          <w:sz w:val="21"/>
+        </w:rPr>
+        <w:t xml:space="preserve">=0.008）。治疗期平均减重（1.62±1.22）kg。多因素分析显示，减重幅度（每1</w:t>
+      </w:r>
+      <w:r>
+        <w:rPr>
+          <w:rFonts w:ascii="Times New Roman" w:hAnsi="Times New Roman" w:cs="Times New Roman" w:eastAsia="宋体"/>
+          <w:sz w:val="21"/>
+        </w:rPr>
+        <w:t xml:space="preserve"> </w:t>
+      </w:r>
+      <w:r>
+        <w:rPr>
+          <w:rFonts w:hint="eastAsia" w:ascii="Times New Roman" w:hAnsi="Times New Roman" w:cs="Times New Roman" w:eastAsia="宋体"/>
+          <w:sz w:val="21"/>
+        </w:rPr>
+        <w:t xml:space="preserve">kg，</w:t>
       </w:r>
       <w:r>
         <w:rPr>
@@ -515,6 +498,22 @@
           <w:rFonts w:hint="eastAsia" w:ascii="Times New Roman" w:hAnsi="Times New Roman" w:cs="Times New Roman" w:eastAsia="宋体"/>
           <w:sz w:val="21"/>
         </w:rPr>
+        <w:t xml:space="preserve">=1.82，95%CI：1.17~2.82）和胃镜异常（</w:t>
+      </w:r>
+      <w:r>
+        <w:rPr>
+          <w:rFonts w:ascii="Times New Roman" w:hAnsi="Times New Roman" w:cs="Times New Roman" w:eastAsia="宋体"/>
+          <w:i/>
+          <w:iCs/>
+          <w:sz w:val="21"/>
+        </w:rPr>
+        <w:t xml:space="preserve">OR</w:t>
+      </w:r>
+      <w:r>
+        <w:rPr>
+          <w:rFonts w:hint="eastAsia" w:ascii="Times New Roman" w:hAnsi="Times New Roman" w:cs="Times New Roman" w:eastAsia="宋体"/>
+          <w:sz w:val="21"/>
+        </w:rPr>
         <w:t xml:space="preserve">=3.20，95%CI：1.13~9.10）与症状改善独立相关。</w:t>
       </w:r>
       <w:r>
@@ -538,7 +537,7 @@
           <w:rFonts w:hint="eastAsia" w:ascii="Times New Roman" w:hAnsi="Times New Roman" w:cs="Times New Roman" w:eastAsia="宋体"/>
           <w:sz w:val="21"/>
         </w:rPr>
-        <w:t xml:space="preserve">在高原肥胖伴反流症状的就诊人群中，GerdQ总分对GERD的判别能力有限，≥8分界值特异度低，不宜单独作为诊断依据，可用于症状评估和随访。治疗期减重幅度较大及胃镜异常者短期症状改善更明显，二者与疗效的关系尚需设立对照的前瞻性研究验证。</w:t>
+        <w:t xml:space="preserve">在高原肥胖伴反流症状的就诊人群中，GerdQ总分对GERD的判别能力有限，≥8分界值特异度低，8~9分基本不提供诊断信息，不宜单独作为诊断依据，可用于症状评估和随访。治疗期减重幅度较大及胃镜异常者短期症状改善更明显，二者与疗效的关系尚需设立对照的前瞻性研究验证。</w:t>
       </w:r>
     </w:p>
     <w:p>
@@ -797,7 +796,7 @@
           <w:rFonts w:ascii="Times New Roman" w:hAnsi="Times New Roman" w:cs="Times New Roman" w:eastAsia="宋体"/>
           <w:sz w:val="21"/>
         </w:rPr>
-        <w:t xml:space="preserve">　GERD was diagnosed in 79 patients (76.7%), 39 (37.9%) of whom had abnormal endoscopic findings. The area under the curve (AUC) of the GerdQ total score was 0.701 (95%CI: 0.580–0.819). At the optimal cut-off of ≥10, sensitivity and specificity were 62.0% and 70.8%; at the recommended cut-off of ≥8, they were 93.7% and 29.2%. The 4GerdQ score decreased from 6.11±1.84 to 4.46±2.04 (</w:t>
+        <w:t xml:space="preserve">　GERD was diagnosed in 79 patients (76.7%), 39 (37.9%) of whom had abnormal endoscopic findings. The area under the curve (AUC) of the GerdQ total score was 0.701 (95%CI: 0.580–0.819). At the optimal cut-off of ≥10, sensitivity and specificity were 62.0% and 70.8%; at the recommended cut-off of ≥8, they were 93.7% and 29.2%. Stratum-specific likelihood ratios for scores of 7, 8–9 and ≥10 were 0.22, 0.76 and 2.13. The 4GerdQ score decreased from 6.11±1.84 to 4.46±2.04 (</w:t>
       </w:r>
       <w:r>
         <w:rPr>
@@ -813,14 +812,7 @@
           <w:rFonts w:ascii="Times New Roman" w:hAnsi="Times New Roman" w:cs="Times New Roman" w:eastAsia="宋体"/>
           <w:sz w:val="21"/>
         </w:rPr>
-        <w:t xml:space="preserve">&lt;0.001), and 72 patients (69.9%) met the criterion for symptom improvement. Mean weight loss during treatment was 1.62±1.22 kg. Greater weight loss (per kg,</w:t>
-      </w:r>
-      <w:r>
-        <w:rPr>
-          <w:rFonts w:ascii="Times New Roman" w:hAnsi="Times New Roman" w:cs="Times New Roman" w:eastAsia="宋体"/>
-          <w:sz w:val="21"/>
-        </w:rPr>
-        <w:t xml:space="preserve"> </w:t>
+        <w:t xml:space="preserve">&lt;0.001), and 72 patients (69.9%) met the criterion for symptom improvement; improvement rates were 84.6%, 65.0% and 54.2% in patients with abnormal endoscopy, normal endoscopy with a positive PPI test, and normal endoscopy with a negative PPI test, respectively (</w:t>
       </w:r>
       <w:r>
         <w:rPr>
@@ -829,14 +821,28 @@
           <w:iCs/>
           <w:sz w:val="21"/>
         </w:rPr>
-        <w:t xml:space="preserve">OR</w:t>
-      </w:r>
-      <w:r>
-        <w:rPr>
-          <w:rFonts w:ascii="Times New Roman" w:hAnsi="Times New Roman" w:cs="Times New Roman" w:eastAsia="宋体"/>
-          <w:sz w:val="21"/>
-        </w:rPr>
-        <w:t xml:space="preserve">=1.82, 95%CI: 1.17–2.82) and abnormal endoscopic findings (</w:t>
+        <w:t xml:space="preserve">P</w:t>
+      </w:r>
+      <w:r>
+        <w:rPr>
+          <w:rFonts w:ascii="Times New Roman" w:hAnsi="Times New Roman" w:cs="Times New Roman" w:eastAsia="宋体"/>
+          <w:sz w:val="21"/>
+        </w:rPr>
+        <w:t xml:space="preserve"> </w:t>
+      </w:r>
+      <w:r>
+        <w:rPr>
+          <w:rFonts w:ascii="Times New Roman" w:hAnsi="Times New Roman" w:cs="Times New Roman" w:eastAsia="宋体"/>
+          <w:sz w:val="21"/>
+        </w:rPr>
+        <w:t xml:space="preserve">for trend=0.008). Mean weight loss during treatment was 1.62±1.22 kg. Greater weight loss (per kg,</w:t>
+      </w:r>
+      <w:r>
+        <w:rPr>
+          <w:rFonts w:ascii="Times New Roman" w:hAnsi="Times New Roman" w:cs="Times New Roman" w:eastAsia="宋体"/>
+          <w:sz w:val="21"/>
+        </w:rPr>
+        <w:t xml:space="preserve"> </w:t>
       </w:r>
       <w:r>
         <w:rPr>
@@ -852,6 +858,22 @@
           <w:rFonts w:ascii="Times New Roman" w:hAnsi="Times New Roman" w:cs="Times New Roman" w:eastAsia="宋体"/>
           <w:sz w:val="21"/>
         </w:rPr>
+        <w:t xml:space="preserve">=1.82, 95%CI: 1.17–2.82) and abnormal endoscopic findings (</w:t>
+      </w:r>
+      <w:r>
+        <w:rPr>
+          <w:rFonts w:ascii="Times New Roman" w:hAnsi="Times New Roman" w:cs="Times New Roman" w:eastAsia="宋体"/>
+          <w:i/>
+          <w:iCs/>
+          <w:sz w:val="21"/>
+        </w:rPr>
+        <w:t xml:space="preserve">OR</w:t>
+      </w:r>
+      <w:r>
+        <w:rPr>
+          <w:rFonts w:ascii="Times New Roman" w:hAnsi="Times New Roman" w:cs="Times New Roman" w:eastAsia="宋体"/>
+          <w:sz w:val="21"/>
+        </w:rPr>
         <w:t xml:space="preserve">=3.20, 95%CI: 1.13–9.10) were independently associated with symptom improvement.</w:t>
       </w:r>
       <w:r>
@@ -875,7 +897,7 @@
           <w:rFonts w:ascii="Times New Roman" w:hAnsi="Times New Roman" w:cs="Times New Roman" w:eastAsia="宋体"/>
           <w:sz w:val="21"/>
         </w:rPr>
-        <w:t xml:space="preserve">　In this symptomatic population of obese high-altitude residents, the GerdQ total score showed limited discrimination for GERD, and the cut-off of ≥8 had low specificity; GerdQ should not be used alone for diagnosis but is suitable for symptom assessment and follow-up. Greater weight loss and abnormal endoscopic findings were associated with short-term symptom improvement, which should be confirmed in controlled prospective studies.</w:t>
+        <w:t xml:space="preserve">　In this symptomatic population of obese high-altitude residents, the GerdQ total score showed limited discrimination for GERD, the cut-off of ≥8 had low specificity, and scores of 8–9 were essentially uninformative; GerdQ should not be used alone for diagnosis but is suitable for symptom assessment and follow-up. Greater weight loss and abnormal endoscopic findings were associated with short-term symptom improvement, which should be confirmed in controlled prospective studies.</w:t>
       </w:r>
     </w:p>
     <w:p>
@@ -1382,162 +1404,7 @@
           <w:rFonts w:hint="eastAsia" w:ascii="Times New Roman" w:hAnsi="Times New Roman" w:cs="Times New Roman" w:eastAsia="宋体"/>
           <w:sz w:val="21"/>
         </w:rPr>
-        <w:t xml:space="preserve">kg/m²）</w:t>
-      </w:r>
-      <w:r>
-        <w:rPr>
-          <w:rFonts w:hint="eastAsia" w:ascii="Times New Roman" w:hAnsi="Times New Roman" w:cs="Times New Roman" w:eastAsia="宋体"/>
-          <w:sz w:val="21"/>
-          <w:highlight w:val="yellow"/>
-        </w:rPr>
-        <w:t xml:space="preserve">【</w:t>
-      </w:r>
-      <w:r>
-        <w:rPr>
-          <w:rFonts w:hint="eastAsia" w:ascii="Times New Roman" w:hAnsi="Times New Roman" w:cs="Times New Roman" w:eastAsia="宋体"/>
-          <w:sz w:val="21"/>
-          <w:highlight w:val="yellow"/>
-        </w:rPr>
-        <w:t xml:space="preserve">作者确认分组切点</w:t>
-      </w:r>
-      <w:r>
-        <w:rPr>
-          <w:rFonts w:hint="eastAsia" w:ascii="Times New Roman" w:hAnsi="Times New Roman" w:cs="Times New Roman" w:eastAsia="宋体"/>
-          <w:sz w:val="21"/>
-          <w:highlight w:val="yellow"/>
-        </w:rPr>
-        <w:t xml:space="preserve">】</w:t>
-      </w:r>
-      <w:r>
-        <w:rPr>
-          <w:rFonts w:hint="eastAsia" w:ascii="Times New Roman" w:hAnsi="Times New Roman" w:cs="Times New Roman" w:eastAsia="宋体"/>
-          <w:sz w:val="21"/>
-        </w:rPr>
-        <w:t xml:space="preserve">。研究期间共筛查</w:t>
-      </w:r>
-      <w:r>
-        <w:rPr>
-          <w:rFonts w:hint="eastAsia" w:ascii="Times New Roman" w:hAnsi="Times New Roman" w:cs="Times New Roman" w:eastAsia="宋体"/>
-          <w:sz w:val="21"/>
-          <w:highlight w:val="yellow"/>
-        </w:rPr>
-        <w:t xml:space="preserve">【</w:t>
-      </w:r>
-      <w:r>
-        <w:rPr>
-          <w:rFonts w:hint="eastAsia" w:ascii="Times New Roman" w:hAnsi="Times New Roman" w:cs="Times New Roman" w:eastAsia="宋体"/>
-          <w:sz w:val="21"/>
-          <w:highlight w:val="yellow"/>
-        </w:rPr>
-        <w:t xml:space="preserve">作者补充</w:t>
-      </w:r>
-      <w:r>
-        <w:rPr>
-          <w:rFonts w:hint="eastAsia" w:ascii="Times New Roman" w:hAnsi="Times New Roman" w:cs="Times New Roman" w:eastAsia="宋体"/>
-          <w:sz w:val="21"/>
-          <w:highlight w:val="yellow"/>
-        </w:rPr>
-        <w:t xml:space="preserve">】</w:t>
-      </w:r>
-      <w:r>
-        <w:rPr>
-          <w:rFonts w:hint="eastAsia" w:ascii="Times New Roman" w:hAnsi="Times New Roman" w:cs="Times New Roman" w:eastAsia="宋体"/>
-          <w:sz w:val="21"/>
-        </w:rPr>
-        <w:t xml:space="preserve">例，排除</w:t>
-      </w:r>
-      <w:r>
-        <w:rPr>
-          <w:rFonts w:hint="eastAsia" w:ascii="Times New Roman" w:hAnsi="Times New Roman" w:cs="Times New Roman" w:eastAsia="宋体"/>
-          <w:sz w:val="21"/>
-          <w:highlight w:val="yellow"/>
-        </w:rPr>
-        <w:t xml:space="preserve">【</w:t>
-      </w:r>
-      <w:r>
-        <w:rPr>
-          <w:rFonts w:hint="eastAsia" w:ascii="Times New Roman" w:hAnsi="Times New Roman" w:cs="Times New Roman" w:eastAsia="宋体"/>
-          <w:sz w:val="21"/>
-          <w:highlight w:val="yellow"/>
-        </w:rPr>
-        <w:t xml:space="preserve">作者补充</w:t>
-      </w:r>
-      <w:r>
-        <w:rPr>
-          <w:rFonts w:hint="eastAsia" w:ascii="Times New Roman" w:hAnsi="Times New Roman" w:cs="Times New Roman" w:eastAsia="宋体"/>
-          <w:sz w:val="21"/>
-          <w:highlight w:val="yellow"/>
-        </w:rPr>
-        <w:t xml:space="preserve">】</w:t>
-      </w:r>
-      <w:r>
-        <w:rPr>
-          <w:rFonts w:hint="eastAsia" w:ascii="Times New Roman" w:hAnsi="Times New Roman" w:cs="Times New Roman" w:eastAsia="宋体"/>
-          <w:sz w:val="21"/>
-        </w:rPr>
-        <w:t xml:space="preserve">例（排除原因及例数</w:t>
-      </w:r>
-      <w:r>
-        <w:rPr>
-          <w:rFonts w:hint="eastAsia" w:ascii="Times New Roman" w:hAnsi="Times New Roman" w:cs="Times New Roman" w:eastAsia="宋体"/>
-          <w:sz w:val="21"/>
-          <w:highlight w:val="yellow"/>
-        </w:rPr>
-        <w:t xml:space="preserve">【</w:t>
-      </w:r>
-      <w:r>
-        <w:rPr>
-          <w:rFonts w:hint="eastAsia" w:ascii="Times New Roman" w:hAnsi="Times New Roman" w:cs="Times New Roman" w:eastAsia="宋体"/>
-          <w:sz w:val="21"/>
-          <w:highlight w:val="yellow"/>
-        </w:rPr>
-        <w:t xml:space="preserve">作者补充</w:t>
-      </w:r>
-      <w:r>
-        <w:rPr>
-          <w:rFonts w:hint="eastAsia" w:ascii="Times New Roman" w:hAnsi="Times New Roman" w:cs="Times New Roman" w:eastAsia="宋体"/>
-          <w:sz w:val="21"/>
-          <w:highlight w:val="yellow"/>
-        </w:rPr>
-        <w:t xml:space="preserve">】</w:t>
-      </w:r>
-      <w:r>
-        <w:rPr>
-          <w:rFonts w:hint="eastAsia" w:ascii="Times New Roman" w:hAnsi="Times New Roman" w:cs="Times New Roman" w:eastAsia="宋体"/>
-          <w:sz w:val="21"/>
-        </w:rPr>
-        <w:t xml:space="preserve">），最终纳入103例。本研究经青海大学附属医院伦理委员会批准（批号：P-SL-2024-312），所有患者均签署知情同意书</w:t>
-      </w:r>
-      <w:r>
-        <w:rPr>
-          <w:rFonts w:hint="eastAsia" w:ascii="Times New Roman" w:hAnsi="Times New Roman" w:cs="Times New Roman" w:eastAsia="宋体"/>
-          <w:sz w:val="21"/>
-          <w:highlight w:val="yellow"/>
-        </w:rPr>
-        <w:t xml:space="preserve">【</w:t>
-      </w:r>
-      <w:r>
-        <w:rPr>
-          <w:rFonts w:hint="eastAsia" w:ascii="Times New Roman" w:hAnsi="Times New Roman" w:cs="Times New Roman" w:eastAsia="宋体"/>
-          <w:sz w:val="21"/>
-          <w:highlight w:val="yellow"/>
-        </w:rPr>
-        <w:t xml:space="preserve">作者确认知情同意形式</w:t>
-      </w:r>
-      <w:r>
-        <w:rPr>
-          <w:rFonts w:hint="eastAsia" w:ascii="Times New Roman" w:hAnsi="Times New Roman" w:cs="Times New Roman" w:eastAsia="宋体"/>
-          <w:sz w:val="21"/>
-          <w:highlight w:val="yellow"/>
-        </w:rPr>
-        <w:t xml:space="preserve">】</w:t>
-      </w:r>
-      <w:r>
-        <w:rPr>
-          <w:rFonts w:hint="eastAsia" w:ascii="Times New Roman" w:hAnsi="Times New Roman" w:cs="Times New Roman" w:eastAsia="宋体"/>
-          <w:sz w:val="21"/>
-        </w:rPr>
-        <w:t xml:space="preserve">。</w:t>
+        <w:t xml:space="preserve">kg/m²）。最终纳入103例。本研究经青海大学附属医院伦理委员会批准（批号：P-SL-2024-312），所有患者均同意将其临床资料用于研究。</w:t>
       </w:r>
     </w:p>
     <w:bookmarkEnd w:id="9"/>
@@ -1615,7 +1482,7 @@
           <w:sz w:val="21"/>
           <w:highlight w:val="yellow"/>
         </w:rPr>
-        <w:t xml:space="preserve">作者确认本研究按此计分；如上腹痛、恶心未反向计分，须重新计算总分及全部相关分析</w:t>
+        <w:t xml:space="preserve">作者确认：本研究上腹痛、恶心是否按此反向计分；如未反向计分，须重新计算总分及相关分析</w:t>
       </w:r>
       <w:r>
         <w:rPr>
@@ -1699,38 +1566,7 @@
           <w:rFonts w:hint="eastAsia" w:ascii="Times New Roman" w:hAnsi="Times New Roman" w:cs="Times New Roman" w:eastAsia="宋体"/>
           <w:sz w:val="21"/>
         </w:rPr>
-        <w:t xml:space="preserve">GIF-H290/GIF-HQ290），由2名具有5年以上操作经验的内镜医师独立判读，意见不一致时</w:t>
-      </w:r>
-      <w:r>
-        <w:rPr>
-          <w:rFonts w:hint="eastAsia" w:ascii="Times New Roman" w:hAnsi="Times New Roman" w:cs="Times New Roman" w:eastAsia="宋体"/>
-          <w:sz w:val="21"/>
-          <w:highlight w:val="yellow"/>
-        </w:rPr>
-        <w:t xml:space="preserve">【</w:t>
-      </w:r>
-      <w:r>
-        <w:rPr>
-          <w:rFonts w:hint="eastAsia" w:ascii="Times New Roman" w:hAnsi="Times New Roman" w:cs="Times New Roman" w:eastAsia="宋体"/>
-          <w:sz w:val="21"/>
-          <w:highlight w:val="yellow"/>
-        </w:rPr>
-        <w:t xml:space="preserve">作者补充处理方式</w:t>
-      </w:r>
-      <w:r>
-        <w:rPr>
-          <w:rFonts w:hint="eastAsia" w:ascii="Times New Roman" w:hAnsi="Times New Roman" w:cs="Times New Roman" w:eastAsia="宋体"/>
-          <w:sz w:val="21"/>
-          <w:highlight w:val="yellow"/>
-        </w:rPr>
-        <w:t xml:space="preserve">】</w:t>
-      </w:r>
-      <w:r>
-        <w:rPr>
-          <w:rFonts w:hint="eastAsia" w:ascii="Times New Roman" w:hAnsi="Times New Roman" w:cs="Times New Roman" w:eastAsia="宋体"/>
-          <w:sz w:val="21"/>
-        </w:rPr>
-        <w:t xml:space="preserve">。反流性食管炎按洛杉矶（Los</w:t>
+        <w:t xml:space="preserve">GIF-H290/GIF-HQ290），由2名具有5年以上操作经验的内镜医师独立判读。反流性食管炎按洛杉矶（Los</w:t>
       </w:r>
       <w:r>
         <w:rPr>
@@ -1816,52 +1652,7 @@
           <w:rFonts w:hint="eastAsia" w:ascii="Times New Roman" w:hAnsi="Times New Roman" w:cs="Times New Roman" w:eastAsia="宋体"/>
           <w:sz w:val="21"/>
         </w:rPr>
-        <w:t xml:space="preserve">，故另以LA</w:t>
-      </w:r>
-      <w:r>
-        <w:rPr>
-          <w:rFonts w:ascii="Times New Roman" w:hAnsi="Times New Roman" w:cs="Times New Roman" w:eastAsia="宋体"/>
-          <w:sz w:val="21"/>
-        </w:rPr>
-        <w:t xml:space="preserve"> </w:t>
-      </w:r>
-      <w:r>
-        <w:rPr>
-          <w:rFonts w:hint="eastAsia" w:ascii="Times New Roman" w:hAnsi="Times New Roman" w:cs="Times New Roman" w:eastAsia="宋体"/>
-          <w:sz w:val="21"/>
-        </w:rPr>
-        <w:t xml:space="preserve">B~D级食管炎为标准进行敏感性分析</w:t>
-      </w:r>
-      <w:r>
-        <w:rPr>
-          <w:rFonts w:hint="eastAsia" w:ascii="Times New Roman" w:hAnsi="Times New Roman" w:cs="Times New Roman" w:eastAsia="宋体"/>
-          <w:sz w:val="21"/>
-          <w:highlight w:val="yellow"/>
-        </w:rPr>
-        <w:t xml:space="preserve">【</w:t>
-      </w:r>
-      <w:r>
-        <w:rPr>
-          <w:rFonts w:hint="eastAsia" w:ascii="Times New Roman" w:hAnsi="Times New Roman" w:cs="Times New Roman" w:eastAsia="宋体"/>
-          <w:sz w:val="21"/>
-          <w:highlight w:val="yellow"/>
-        </w:rPr>
-        <w:t xml:space="preserve">作者补充</w:t>
-      </w:r>
-      <w:r>
-        <w:rPr>
-          <w:rFonts w:hint="eastAsia" w:ascii="Times New Roman" w:hAnsi="Times New Roman" w:cs="Times New Roman" w:eastAsia="宋体"/>
-          <w:sz w:val="21"/>
-          <w:highlight w:val="yellow"/>
-        </w:rPr>
-        <w:t xml:space="preserve">】</w:t>
-      </w:r>
-      <w:r>
-        <w:rPr>
-          <w:rFonts w:hint="eastAsia" w:ascii="Times New Roman" w:hAnsi="Times New Roman" w:cs="Times New Roman" w:eastAsia="宋体"/>
-          <w:sz w:val="21"/>
-        </w:rPr>
-        <w:t xml:space="preserve">。</w:t>
+        <w:t xml:space="preserve">；本研究未分别记录各级别食管炎及食管裂孔疝例数。</w:t>
       </w:r>
     </w:p>
     <w:p>
@@ -1948,7 +1739,7 @@
           <w:sz w:val="21"/>
           <w:highlight w:val="yellow"/>
         </w:rPr>
-        <w:t xml:space="preserve">作者补充症状改善的评价工具；如以GerdQ评价，须在讨论中说明合并偏倚</w:t>
+        <w:t xml:space="preserve">作者确认：PPI试验症状改善的评价工具，以及基线4GerdQ评估在PPI试验之前还是之后</w:t>
       </w:r>
       <w:r>
         <w:rPr>
@@ -1963,31 +1754,7 @@
           <w:rFonts w:hint="eastAsia" w:ascii="Times New Roman" w:hAnsi="Times New Roman" w:cs="Times New Roman" w:eastAsia="宋体"/>
           <w:sz w:val="21"/>
         </w:rPr>
-        <w:t xml:space="preserve">。GERD复合诊断标准：胃镜异常，或胃镜阴性且PPI试验阳性。</w:t>
-      </w:r>
-      <w:r>
-        <w:rPr>
-          <w:rFonts w:hint="eastAsia" w:ascii="Times New Roman" w:hAnsi="Times New Roman" w:cs="Times New Roman" w:eastAsia="宋体"/>
-          <w:sz w:val="21"/>
-          <w:highlight w:val="yellow"/>
-        </w:rPr>
-        <w:t xml:space="preserve">【</w:t>
-      </w:r>
-      <w:r>
-        <w:rPr>
-          <w:rFonts w:hint="eastAsia" w:ascii="Times New Roman" w:hAnsi="Times New Roman" w:cs="Times New Roman" w:eastAsia="宋体"/>
-          <w:sz w:val="21"/>
-          <w:highlight w:val="yellow"/>
-        </w:rPr>
-        <w:t xml:space="preserve">作者说明：表1中PPI试验阳性共57例，多于胃镜阴性且PPI试验阳性的40例，请说明胃镜异常者是否也接受了PPI试验及其结果如何使用。</w:t>
-      </w:r>
-      <w:r>
-        <w:rPr>
-          <w:rFonts w:hint="eastAsia" w:ascii="Times New Roman" w:hAnsi="Times New Roman" w:cs="Times New Roman" w:eastAsia="宋体"/>
-          <w:sz w:val="21"/>
-          <w:highlight w:val="yellow"/>
-        </w:rPr>
-        <w:t xml:space="preserve">】</w:t>
+        <w:t xml:space="preserve">。GERD复合诊断标准：胃镜异常，或胃镜阴性且PPI试验阳性。部分胃镜异常者亦完成了PPI试验，其结果不参与复合诊断。</w:t>
       </w:r>
     </w:p>
     <w:bookmarkEnd w:id="11"/>
@@ -2055,100 +1822,7 @@
           <w:rFonts w:hint="eastAsia" w:ascii="Times New Roman" w:hAnsi="Times New Roman" w:cs="Times New Roman" w:eastAsia="宋体"/>
           <w:sz w:val="21"/>
         </w:rPr>
-        <w:t xml:space="preserve">h内避免平卧及适度有氧运动。</w:t>
-      </w:r>
-      <w:r>
-        <w:rPr>
-          <w:rFonts w:hint="eastAsia" w:ascii="Times New Roman" w:hAnsi="Times New Roman" w:cs="Times New Roman" w:eastAsia="宋体"/>
-          <w:sz w:val="21"/>
-          <w:highlight w:val="yellow"/>
-        </w:rPr>
-        <w:t xml:space="preserve">【</w:t>
-      </w:r>
-      <w:r>
-        <w:rPr>
-          <w:rFonts w:hint="eastAsia" w:ascii="Times New Roman" w:hAnsi="Times New Roman" w:cs="Times New Roman" w:eastAsia="宋体"/>
-          <w:sz w:val="21"/>
-          <w:highlight w:val="yellow"/>
-        </w:rPr>
-        <w:t xml:space="preserve">作者说明：PPI试验的14</w:t>
-      </w:r>
-      <w:r>
-        <w:rPr>
-          <w:rFonts w:ascii="Times New Roman" w:hAnsi="Times New Roman" w:cs="Times New Roman" w:eastAsia="宋体"/>
-          <w:sz w:val="21"/>
-          <w:highlight w:val="yellow"/>
-        </w:rPr>
-        <w:t xml:space="preserve"> </w:t>
-      </w:r>
-      <w:r>
-        <w:rPr>
-          <w:rFonts w:hint="eastAsia" w:ascii="Times New Roman" w:hAnsi="Times New Roman" w:cs="Times New Roman" w:eastAsia="宋体"/>
-          <w:sz w:val="21"/>
-          <w:highlight w:val="yellow"/>
-        </w:rPr>
-        <w:t xml:space="preserve">d是否计入4周治疗；基线4GerdQ的评估时间点。</w:t>
-      </w:r>
-      <w:r>
-        <w:rPr>
-          <w:rFonts w:hint="eastAsia" w:ascii="Times New Roman" w:hAnsi="Times New Roman" w:cs="Times New Roman" w:eastAsia="宋体"/>
-          <w:sz w:val="21"/>
-          <w:highlight w:val="yellow"/>
-        </w:rPr>
-        <w:t xml:space="preserve">】</w:t>
-      </w:r>
-      <w:r>
-        <w:rPr>
-          <w:rFonts w:hint="eastAsia" w:ascii="Times New Roman" w:hAnsi="Times New Roman" w:cs="Times New Roman" w:eastAsia="宋体"/>
-          <w:sz w:val="21"/>
-        </w:rPr>
-        <w:t xml:space="preserve">治疗结束后复评GerdQ并测量体重。以治疗后4GerdQ较基线下降≥1分为症状改善（预设标准），以4GerdQ下降≥3分为严格标准进行敏感性分析；并参照SAKURAI等</w:t>
-      </w:r>
-      <w:r>
-        <w:rPr>
-          <w:rFonts w:ascii="Times New Roman" w:hAnsi="Times New Roman" w:cs="Times New Roman" w:eastAsia="宋体"/>
-          <w:sz w:val="21"/>
-          <w:vertAlign w:val="superscript"/>
-        </w:rPr>
-        <w:t xml:space="preserve">[14]</w:t>
-      </w:r>
-      <w:r>
-        <w:rPr>
-          <w:rFonts w:hint="eastAsia" w:ascii="Times New Roman" w:hAnsi="Times New Roman" w:cs="Times New Roman" w:eastAsia="宋体"/>
-          <w:sz w:val="21"/>
-        </w:rPr>
-        <w:t xml:space="preserve">的标准，以治疗后第1、2、5、6条得分均≤1分定义为症状充分缓解</w:t>
-      </w:r>
-      <w:r>
-        <w:rPr>
-          <w:rFonts w:hint="eastAsia" w:ascii="Times New Roman" w:hAnsi="Times New Roman" w:cs="Times New Roman" w:eastAsia="宋体"/>
-          <w:sz w:val="21"/>
-          <w:highlight w:val="yellow"/>
-        </w:rPr>
-        <w:t xml:space="preserve">【</w:t>
-      </w:r>
-      <w:r>
-        <w:rPr>
-          <w:rFonts w:hint="eastAsia" w:ascii="Times New Roman" w:hAnsi="Times New Roman" w:cs="Times New Roman" w:eastAsia="宋体"/>
-          <w:sz w:val="21"/>
-          <w:highlight w:val="yellow"/>
-        </w:rPr>
-        <w:t xml:space="preserve">作者补充</w:t>
-      </w:r>
-      <w:r>
-        <w:rPr>
-          <w:rFonts w:hint="eastAsia" w:ascii="Times New Roman" w:hAnsi="Times New Roman" w:cs="Times New Roman" w:eastAsia="宋体"/>
-          <w:sz w:val="21"/>
-          <w:highlight w:val="yellow"/>
-        </w:rPr>
-        <w:t xml:space="preserve">】</w:t>
-      </w:r>
-      <w:r>
-        <w:rPr>
-          <w:rFonts w:hint="eastAsia" w:ascii="Times New Roman" w:hAnsi="Times New Roman" w:cs="Times New Roman" w:eastAsia="宋体"/>
-          <w:sz w:val="21"/>
-        </w:rPr>
-        <w:t xml:space="preserve">。</w:t>
+        <w:t xml:space="preserve">h内避免平卧及适度有氧运动。治疗结束后复评GerdQ并测量体重。以治疗后4GerdQ较基线下降≥1分为症状改善（预设标准），以4GerdQ下降≥3分为严格标准进行敏感性分析。</w:t>
       </w:r>
     </w:p>
     <w:bookmarkEnd w:id="12"/>
@@ -2389,7 +2063,21 @@
           <w:rFonts w:hint="eastAsia" w:ascii="Times New Roman" w:hAnsi="Times New Roman" w:cs="Times New Roman" w:eastAsia="宋体"/>
           <w:sz w:val="21"/>
         </w:rPr>
-        <w:t xml:space="preserve">000次）估计，按约登指数确定最佳截断值，并计算灵敏度、特异度、预测值及似然比。症状改善的相关因素采用多因素Logistic回归分析（后退法，</w:t>
+        <w:t xml:space="preserve">000次）估计，按约登指数确定最佳截断值，并计算灵敏度、特异度、预测值及似然比；将GerdQ总分分为7分、8~9分和≥10分3个区间，计算分层似然比（95%CI采用对数法）及验后概率。不同诊断路径（胃镜异常、胃镜阴性且PPI试验阳性、胃镜阴性且PPI试验阴性）间率的变化趋势采用Cochran-Armitage趋势检验，PPI试验与4周症状改善判断的一致性采用Cohen</w:t>
+      </w:r>
+      <w:r>
+        <w:rPr>
+          <w:rFonts w:ascii="Times New Roman" w:hAnsi="Times New Roman" w:cs="Times New Roman" w:eastAsia="宋体"/>
+          <w:sz w:val="21"/>
+        </w:rPr>
+        <w:t xml:space="preserve"> </w:t>
+      </w:r>
+      <w:r>
+        <w:rPr>
+          <w:rFonts w:hint="eastAsia" w:ascii="Times New Roman" w:hAnsi="Times New Roman" w:cs="Times New Roman" w:eastAsia="宋体"/>
+          <w:sz w:val="21"/>
+        </w:rPr>
+        <w:t xml:space="preserve">κ系数评价。症状改善的相关因素采用多因素Logistic回归分析（后退法，</w:t>
       </w:r>
       <w:r>
         <w:rPr>
@@ -2549,7 +2237,7 @@
           <w:rFonts w:hint="eastAsia" w:ascii="Times New Roman" w:hAnsi="Times New Roman" w:cs="Times New Roman" w:eastAsia="宋体"/>
           <w:sz w:val="21"/>
         </w:rPr>
-        <w:t xml:space="preserve">&lt;0.001）。吸烟和（或）饮酒34例（33.0%），高风险职业（牧民或司机）16例（15.5%）。胃镜异常39例（37.9%，95%CI：29.1%~47.5%），其中LA</w:t>
+        <w:t xml:space="preserve">&lt;0.001）。吸烟和（或）饮酒34例（33.0%），高风险职业（牧民或司机）16例（15.5%）。胃镜异常39例（37.9%，95%CI：29.1%~47.5%）。复合标准诊断GERD</w:t>
       </w:r>
       <w:r>
         <w:rPr>
@@ -2563,207 +2251,7 @@
           <w:rFonts w:hint="eastAsia" w:ascii="Times New Roman" w:hAnsi="Times New Roman" w:cs="Times New Roman" w:eastAsia="宋体"/>
           <w:sz w:val="21"/>
         </w:rPr>
-        <w:t xml:space="preserve">A级</w:t>
-      </w:r>
-      <w:r>
-        <w:rPr>
-          <w:rFonts w:hint="eastAsia" w:ascii="Times New Roman" w:hAnsi="Times New Roman" w:cs="Times New Roman" w:eastAsia="宋体"/>
-          <w:sz w:val="21"/>
-          <w:highlight w:val="yellow"/>
-        </w:rPr>
-        <w:t xml:space="preserve">【</w:t>
-      </w:r>
-      <w:r>
-        <w:rPr>
-          <w:rFonts w:ascii="Times New Roman" w:hAnsi="Times New Roman" w:cs="Times New Roman" w:eastAsia="宋体"/>
-          <w:sz w:val="21"/>
-          <w:highlight w:val="yellow"/>
-        </w:rPr>
-        <w:t xml:space="preserve"> </w:t>
-      </w:r>
-      <w:r>
-        <w:rPr>
-          <w:rFonts w:hint="eastAsia" w:ascii="Times New Roman" w:hAnsi="Times New Roman" w:cs="Times New Roman" w:eastAsia="宋体"/>
-          <w:sz w:val="21"/>
-          <w:highlight w:val="yellow"/>
-        </w:rPr>
-        <w:t xml:space="preserve">】</w:t>
-      </w:r>
-      <w:r>
-        <w:rPr>
-          <w:rFonts w:hint="eastAsia" w:ascii="Times New Roman" w:hAnsi="Times New Roman" w:cs="Times New Roman" w:eastAsia="宋体"/>
-          <w:sz w:val="21"/>
-        </w:rPr>
-        <w:t xml:space="preserve">例、B级</w:t>
-      </w:r>
-      <w:r>
-        <w:rPr>
-          <w:rFonts w:hint="eastAsia" w:ascii="Times New Roman" w:hAnsi="Times New Roman" w:cs="Times New Roman" w:eastAsia="宋体"/>
-          <w:sz w:val="21"/>
-          <w:highlight w:val="yellow"/>
-        </w:rPr>
-        <w:t xml:space="preserve">【</w:t>
-      </w:r>
-      <w:r>
-        <w:rPr>
-          <w:rFonts w:ascii="Times New Roman" w:hAnsi="Times New Roman" w:cs="Times New Roman" w:eastAsia="宋体"/>
-          <w:sz w:val="21"/>
-          <w:highlight w:val="yellow"/>
-        </w:rPr>
-        <w:t xml:space="preserve"> </w:t>
-      </w:r>
-      <w:r>
-        <w:rPr>
-          <w:rFonts w:hint="eastAsia" w:ascii="Times New Roman" w:hAnsi="Times New Roman" w:cs="Times New Roman" w:eastAsia="宋体"/>
-          <w:sz w:val="21"/>
-          <w:highlight w:val="yellow"/>
-        </w:rPr>
-        <w:t xml:space="preserve">】</w:t>
-      </w:r>
-      <w:r>
-        <w:rPr>
-          <w:rFonts w:hint="eastAsia" w:ascii="Times New Roman" w:hAnsi="Times New Roman" w:cs="Times New Roman" w:eastAsia="宋体"/>
-          <w:sz w:val="21"/>
-        </w:rPr>
-        <w:t xml:space="preserve">例、C级</w:t>
-      </w:r>
-      <w:r>
-        <w:rPr>
-          <w:rFonts w:hint="eastAsia" w:ascii="Times New Roman" w:hAnsi="Times New Roman" w:cs="Times New Roman" w:eastAsia="宋体"/>
-          <w:sz w:val="21"/>
-          <w:highlight w:val="yellow"/>
-        </w:rPr>
-        <w:t xml:space="preserve">【</w:t>
-      </w:r>
-      <w:r>
-        <w:rPr>
-          <w:rFonts w:ascii="Times New Roman" w:hAnsi="Times New Roman" w:cs="Times New Roman" w:eastAsia="宋体"/>
-          <w:sz w:val="21"/>
-          <w:highlight w:val="yellow"/>
-        </w:rPr>
-        <w:t xml:space="preserve"> </w:t>
-      </w:r>
-      <w:r>
-        <w:rPr>
-          <w:rFonts w:hint="eastAsia" w:ascii="Times New Roman" w:hAnsi="Times New Roman" w:cs="Times New Roman" w:eastAsia="宋体"/>
-          <w:sz w:val="21"/>
-          <w:highlight w:val="yellow"/>
-        </w:rPr>
-        <w:t xml:space="preserve">】</w:t>
-      </w:r>
-      <w:r>
-        <w:rPr>
-          <w:rFonts w:hint="eastAsia" w:ascii="Times New Roman" w:hAnsi="Times New Roman" w:cs="Times New Roman" w:eastAsia="宋体"/>
-          <w:sz w:val="21"/>
-        </w:rPr>
-        <w:t xml:space="preserve">例、D级</w:t>
-      </w:r>
-      <w:r>
-        <w:rPr>
-          <w:rFonts w:hint="eastAsia" w:ascii="Times New Roman" w:hAnsi="Times New Roman" w:cs="Times New Roman" w:eastAsia="宋体"/>
-          <w:sz w:val="21"/>
-          <w:highlight w:val="yellow"/>
-        </w:rPr>
-        <w:t xml:space="preserve">【</w:t>
-      </w:r>
-      <w:r>
-        <w:rPr>
-          <w:rFonts w:ascii="Times New Roman" w:hAnsi="Times New Roman" w:cs="Times New Roman" w:eastAsia="宋体"/>
-          <w:sz w:val="21"/>
-          <w:highlight w:val="yellow"/>
-        </w:rPr>
-        <w:t xml:space="preserve"> </w:t>
-      </w:r>
-      <w:r>
-        <w:rPr>
-          <w:rFonts w:hint="eastAsia" w:ascii="Times New Roman" w:hAnsi="Times New Roman" w:cs="Times New Roman" w:eastAsia="宋体"/>
-          <w:sz w:val="21"/>
-          <w:highlight w:val="yellow"/>
-        </w:rPr>
-        <w:t xml:space="preserve">】</w:t>
-      </w:r>
-      <w:r>
-        <w:rPr>
-          <w:rFonts w:hint="eastAsia" w:ascii="Times New Roman" w:hAnsi="Times New Roman" w:cs="Times New Roman" w:eastAsia="宋体"/>
-          <w:sz w:val="21"/>
-        </w:rPr>
-        <w:t xml:space="preserve">例，食管裂孔疝</w:t>
-      </w:r>
-      <w:r>
-        <w:rPr>
-          <w:rFonts w:hint="eastAsia" w:ascii="Times New Roman" w:hAnsi="Times New Roman" w:cs="Times New Roman" w:eastAsia="宋体"/>
-          <w:sz w:val="21"/>
-          <w:highlight w:val="yellow"/>
-        </w:rPr>
-        <w:t xml:space="preserve">【</w:t>
-      </w:r>
-      <w:r>
-        <w:rPr>
-          <w:rFonts w:ascii="Times New Roman" w:hAnsi="Times New Roman" w:cs="Times New Roman" w:eastAsia="宋体"/>
-          <w:sz w:val="21"/>
-          <w:highlight w:val="yellow"/>
-        </w:rPr>
-        <w:t xml:space="preserve"> </w:t>
-      </w:r>
-      <w:r>
-        <w:rPr>
-          <w:rFonts w:hint="eastAsia" w:ascii="Times New Roman" w:hAnsi="Times New Roman" w:cs="Times New Roman" w:eastAsia="宋体"/>
-          <w:sz w:val="21"/>
-          <w:highlight w:val="yellow"/>
-        </w:rPr>
-        <w:t xml:space="preserve">】</w:t>
-      </w:r>
-      <w:r>
-        <w:rPr>
-          <w:rFonts w:hint="eastAsia" w:ascii="Times New Roman" w:hAnsi="Times New Roman" w:cs="Times New Roman" w:eastAsia="宋体"/>
-          <w:sz w:val="21"/>
-        </w:rPr>
-        <w:t xml:space="preserve">例</w:t>
-      </w:r>
-      <w:r>
-        <w:rPr>
-          <w:rFonts w:hint="eastAsia" w:ascii="Times New Roman" w:hAnsi="Times New Roman" w:cs="Times New Roman" w:eastAsia="宋体"/>
-          <w:sz w:val="21"/>
-          <w:highlight w:val="yellow"/>
-        </w:rPr>
-        <w:t xml:space="preserve">【</w:t>
-      </w:r>
-      <w:r>
-        <w:rPr>
-          <w:rFonts w:hint="eastAsia" w:ascii="Times New Roman" w:hAnsi="Times New Roman" w:cs="Times New Roman" w:eastAsia="宋体"/>
-          <w:sz w:val="21"/>
-          <w:highlight w:val="yellow"/>
-        </w:rPr>
-        <w:t xml:space="preserve">作者补充</w:t>
-      </w:r>
-      <w:r>
-        <w:rPr>
-          <w:rFonts w:hint="eastAsia" w:ascii="Times New Roman" w:hAnsi="Times New Roman" w:cs="Times New Roman" w:eastAsia="宋体"/>
-          <w:sz w:val="21"/>
-          <w:highlight w:val="yellow"/>
-        </w:rPr>
-        <w:t xml:space="preserve">】</w:t>
-      </w:r>
-      <w:r>
-        <w:rPr>
-          <w:rFonts w:hint="eastAsia" w:ascii="Times New Roman" w:hAnsi="Times New Roman" w:cs="Times New Roman" w:eastAsia="宋体"/>
-          <w:sz w:val="21"/>
-        </w:rPr>
-        <w:t xml:space="preserve">。复合标准诊断GERD</w:t>
-      </w:r>
-      <w:r>
-        <w:rPr>
-          <w:rFonts w:ascii="Times New Roman" w:hAnsi="Times New Roman" w:cs="Times New Roman" w:eastAsia="宋体"/>
-          <w:sz w:val="21"/>
-        </w:rPr>
-        <w:t xml:space="preserve"> </w:t>
-      </w:r>
-      <w:r>
-        <w:rPr>
-          <w:rFonts w:hint="eastAsia" w:ascii="Times New Roman" w:hAnsi="Times New Roman" w:cs="Times New Roman" w:eastAsia="宋体"/>
-          <w:sz w:val="21"/>
-        </w:rPr>
-        <w:t xml:space="preserve">79例（76.7%，95%CI：67.7%~83.8%），其中胃镜异常39例，胃镜阴性且PPI试验阳性40例。基线GerdQ≥8分者91例（88.3%）。见表1。</w:t>
+        <w:t xml:space="preserve">79例（76.7%，95%CI：67.7%~83.8%），其中胃镜异常39例，胃镜阴性且PPI试验阳性40例；胃镜阴性且PPI试验阴性24例。PPI试验阳性共57例，其中17例为胃镜异常者。基线GerdQ≥8分者91例（88.3%）。见表1。</w:t>
       </w:r>
     </w:p>
     <w:p>
@@ -7599,6 +7087,759 @@
         <w:t xml:space="preserve">注：GERD复合诊断阳性79例、阴性24例；因入组要求门诊GerdQ≥7分，本表不能反映≤7分时的诊断效能</w:t>
       </w:r>
     </w:p>
+    <w:p>
+      <w:pPr>
+        <w:pStyle w:val="BodyText"/>
+        <w:spacing w:line="360" w:lineRule="auto" w:after="60"/>
+        <w:ind w:firstLine="420"/>
+      </w:pPr>
+      <w:r>
+        <w:rPr>
+          <w:rFonts w:hint="eastAsia" w:ascii="Times New Roman" w:hAnsi="Times New Roman" w:cs="Times New Roman" w:eastAsia="宋体"/>
+          <w:sz w:val="21"/>
+        </w:rPr>
+        <w:t xml:space="preserve">GERD比例随GerdQ总分升高而增加（趋势χ²=9.12，</w:t>
+      </w:r>
+      <w:r>
+        <w:rPr>
+          <w:rFonts w:ascii="Times New Roman" w:hAnsi="Times New Roman" w:cs="Times New Roman" w:eastAsia="宋体"/>
+          <w:i/>
+          <w:iCs/>
+          <w:sz w:val="21"/>
+        </w:rPr>
+        <w:t xml:space="preserve">P</w:t>
+      </w:r>
+      <w:r>
+        <w:rPr>
+          <w:rFonts w:hint="eastAsia" w:ascii="Times New Roman" w:hAnsi="Times New Roman" w:cs="Times New Roman" w:eastAsia="宋体"/>
+          <w:sz w:val="21"/>
+        </w:rPr>
+        <w:t xml:space="preserve">=0.003），但逐分似然比并不单调，故合并为3个区间分析。7分、8~9分和≥10分的分层似然比分别为0.22（95%CI：0.08~0.62）、0.76（95%CI：0.43~1.35）和2.13（95%CI：1.11~4.06），对应本组验后概率分别为41.7%、71.4%和87.5%；8~9分区间似然比的95%CI跨越1，基本不提供诊断信息。GerdQ≥10分的比例在胃镜异常、胃镜阴性且PPI试验阳性、胃镜阴性且PPI试验阴性者中分别为71.8%（28/39）、52.5%（21/40）和29.2%（7/24），呈梯度下降（Cochran-Armitage</w:t>
+      </w:r>
+      <w:r>
+        <w:rPr>
+          <w:rFonts w:ascii="Times New Roman" w:hAnsi="Times New Roman" w:cs="Times New Roman" w:eastAsia="宋体"/>
+          <w:sz w:val="21"/>
+        </w:rPr>
+        <w:t xml:space="preserve"> </w:t>
+      </w:r>
+      <w:r>
+        <w:rPr>
+          <w:rFonts w:ascii="Times New Roman" w:hAnsi="Times New Roman" w:cs="Times New Roman" w:eastAsia="宋体"/>
+          <w:i/>
+          <w:iCs/>
+          <w:sz w:val="21"/>
+        </w:rPr>
+        <w:t xml:space="preserve">Z</w:t>
+      </w:r>
+      <w:r>
+        <w:rPr>
+          <w:rFonts w:hint="eastAsia" w:ascii="Times New Roman" w:hAnsi="Times New Roman" w:cs="Times New Roman" w:eastAsia="宋体"/>
+          <w:sz w:val="21"/>
+        </w:rPr>
+        <w:t xml:space="preserve">=3.31，</w:t>
+      </w:r>
+      <w:r>
+        <w:rPr>
+          <w:rFonts w:ascii="Times New Roman" w:hAnsi="Times New Roman" w:cs="Times New Roman" w:eastAsia="宋体"/>
+          <w:i/>
+          <w:iCs/>
+          <w:sz w:val="21"/>
+        </w:rPr>
+        <w:t xml:space="preserve">P</w:t>
+      </w:r>
+      <w:r>
+        <w:rPr>
+          <w:rFonts w:hint="eastAsia" w:ascii="Times New Roman" w:hAnsi="Times New Roman" w:cs="Times New Roman" w:eastAsia="宋体"/>
+          <w:sz w:val="21"/>
+        </w:rPr>
+        <w:t xml:space="preserve">&lt;0.001）。在确诊路径相同的胃镜阴性者（64例）中，以GerdQ≥10分识别PPI试验阳性的灵敏度为52.5%（95%CI：37.5%~67.1%），特异度为70.8%（95%CI：50.8%~85.1%），差异无统计学意义（</w:t>
+      </w:r>
+      <w:r>
+        <w:rPr>
+          <w:rFonts w:ascii="Times New Roman" w:hAnsi="Times New Roman" w:cs="Times New Roman" w:eastAsia="宋体"/>
+          <w:i/>
+          <w:iCs/>
+          <w:sz w:val="21"/>
+        </w:rPr>
+        <w:t xml:space="preserve">OR</w:t>
+      </w:r>
+      <w:r>
+        <w:rPr>
+          <w:rFonts w:hint="eastAsia" w:ascii="Times New Roman" w:hAnsi="Times New Roman" w:cs="Times New Roman" w:eastAsia="宋体"/>
+          <w:sz w:val="21"/>
+        </w:rPr>
+        <w:t xml:space="preserve">=2.68，Fisher确切概率法</w:t>
+      </w:r>
+      <w:r>
+        <w:rPr>
+          <w:rFonts w:ascii="Times New Roman" w:hAnsi="Times New Roman" w:cs="Times New Roman" w:eastAsia="宋体"/>
+          <w:i/>
+          <w:iCs/>
+          <w:sz w:val="21"/>
+        </w:rPr>
+        <w:t xml:space="preserve">P</w:t>
+      </w:r>
+      <w:r>
+        <w:rPr>
+          <w:rFonts w:hint="eastAsia" w:ascii="Times New Roman" w:hAnsi="Times New Roman" w:cs="Times New Roman" w:eastAsia="宋体"/>
+          <w:sz w:val="21"/>
+        </w:rPr>
+        <w:t xml:space="preserve">=0.077）。见表4、图6。</w:t>
+      </w:r>
+    </w:p>
+    <w:p>
+      <w:pPr>
+        <w:pStyle w:val="BodyText"/>
+        <w:spacing w:line="360" w:lineRule="auto" w:after="60"/>
+        <w:jc w:val="center"/>
+      </w:pPr>
+      <w:r>
+        <w:rPr>
+          <w:rFonts w:hint="eastAsia" w:ascii="Times New Roman" w:hAnsi="Times New Roman" w:cs="Times New Roman" w:eastAsia="黑体"/>
+          <w:b/>
+          <w:bCs/>
+          <w:sz w:val="18"/>
+        </w:rPr>
+        <w:t xml:space="preserve">表4</w:t>
+      </w:r>
+      <w:r>
+        <w:rPr>
+          <w:rFonts w:ascii="Times New Roman" w:hAnsi="Times New Roman" w:cs="Times New Roman" w:eastAsia="黑体"/>
+          <w:b/>
+          <w:bCs/>
+          <w:sz w:val="18"/>
+        </w:rPr>
+        <w:t xml:space="preserve">　</w:t>
+      </w:r>
+      <w:r>
+        <w:rPr>
+          <w:rFonts w:hint="eastAsia" w:ascii="Times New Roman" w:hAnsi="Times New Roman" w:cs="Times New Roman" w:eastAsia="黑体"/>
+          <w:b/>
+          <w:bCs/>
+          <w:sz w:val="18"/>
+        </w:rPr>
+        <w:t xml:space="preserve">GerdQ总分分层似然比及验后概率</w:t>
+      </w:r>
+    </w:p>
+    <w:tbl>
+      <w:tblPr>
+        <w:jc w:val="center"/>
+        <w:tblLayout w:type="fixed"/>
+        <w:tblLook w:firstRow="1" w:lastRow="0" w:firstColumn="0" w:lastColumn="0" w:noHBand="0" w:noVBand="0" w:val="0020"/>
+        <w:tblBorders>
+          <w:top w:val="single" w:sz="12" w:space="0" w:color="000000"/>
+          <w:left w:val="nil"/>
+          <w:bottom w:val="single" w:sz="12" w:space="0" w:color="000000"/>
+          <w:right w:val="nil"/>
+          <w:insideH w:val="nil"/>
+          <w:insideV w:val="nil"/>
+        </w:tblBorders>
+        <w:tblW w:w="8730" w:type="dxa"/>
+        <w:tblLayout w:type="fixed"/>
+      </w:tblPr>
+      <w:tblGrid>
+        <w:gridCol w:w="1616"/>
+        <w:gridCol w:w="1253"/>
+        <w:gridCol w:w="2020"/>
+        <w:gridCol w:w="1374"/>
+        <w:gridCol w:w="1232"/>
+        <w:gridCol w:w="1232"/>
+      </w:tblGrid>
+      <w:tr>
+        <w:trPr>
+          <w:tblHeader w:val="on"/>
+        </w:trPr>
+        <w:tc>
+          <w:tcPr>
+            <w:tcW w:type="dxa" w:w="1617"/>
+            <w:tcBorders>
+              <w:bottom w:val="single" w:sz="6" w:space="0" w:color="000000"/>
+            </w:tcBorders>
+          </w:tcPr>
+          <w:p>
+            <w:pPr>
+              <w:pStyle w:val="Compact"/>
+              <w:spacing w:line="276" w:lineRule="auto" w:after="0"/>
+              <w:ind w:firstLine="0" w:left="0"/>
+              <w:jc w:val="center"/>
+            </w:pPr>
+            <w:r>
+              <w:rPr>
+                <w:rFonts w:hint="eastAsia" w:ascii="Times New Roman" w:hAnsi="Times New Roman" w:cs="Times New Roman" w:eastAsia="宋体"/>
+                <w:b/>
+                <w:sz w:val="18"/>
+              </w:rPr>
+              <w:t xml:space="preserve">总分区间</w:t>
+            </w:r>
+          </w:p>
+        </w:tc>
+        <w:tc>
+          <w:tcPr>
+            <w:tcW w:type="dxa" w:w="1253"/>
+            <w:tcBorders>
+              <w:bottom w:val="single" w:sz="6" w:space="0" w:color="000000"/>
+            </w:tcBorders>
+          </w:tcPr>
+          <w:p>
+            <w:pPr>
+              <w:pStyle w:val="Compact"/>
+              <w:spacing w:line="276" w:lineRule="auto" w:after="0"/>
+              <w:ind w:firstLine="0" w:left="0"/>
+              <w:jc w:val="center"/>
+            </w:pPr>
+            <w:r>
+              <w:rPr>
+                <w:rFonts w:hint="eastAsia" w:ascii="Times New Roman" w:hAnsi="Times New Roman" w:cs="Times New Roman" w:eastAsia="宋体"/>
+                <w:b/>
+                <w:sz w:val="18"/>
+              </w:rPr>
+              <w:t xml:space="preserve">阳性/阴性（例）</w:t>
+            </w:r>
+          </w:p>
+        </w:tc>
+        <w:tc>
+          <w:tcPr>
+            <w:tcW w:type="dxa" w:w="2021"/>
+            <w:tcBorders>
+              <w:bottom w:val="single" w:sz="6" w:space="0" w:color="000000"/>
+            </w:tcBorders>
+          </w:tcPr>
+          <w:p>
+            <w:pPr>
+              <w:pStyle w:val="Compact"/>
+              <w:spacing w:line="276" w:lineRule="auto" w:after="0"/>
+              <w:ind w:firstLine="0" w:left="0"/>
+              <w:jc w:val="center"/>
+            </w:pPr>
+            <w:r>
+              <w:rPr>
+                <w:rFonts w:hint="eastAsia" w:ascii="Times New Roman" w:hAnsi="Times New Roman" w:cs="Times New Roman" w:eastAsia="宋体"/>
+                <w:b/>
+                <w:sz w:val="18"/>
+              </w:rPr>
+              <w:t xml:space="preserve">分层似然比（95%CI）</w:t>
+            </w:r>
+          </w:p>
+        </w:tc>
+        <w:tc>
+          <w:tcPr>
+            <w:tcW w:type="dxa" w:w="1374"/>
+            <w:tcBorders>
+              <w:bottom w:val="single" w:sz="6" w:space="0" w:color="000000"/>
+            </w:tcBorders>
+          </w:tcPr>
+          <w:p>
+            <w:pPr>
+              <w:pStyle w:val="Compact"/>
+              <w:spacing w:line="276" w:lineRule="auto" w:after="0"/>
+              <w:ind w:firstLine="0" w:left="0"/>
+              <w:jc w:val="center"/>
+            </w:pPr>
+            <w:r>
+              <w:rPr>
+                <w:rFonts w:hint="eastAsia" w:ascii="Times New Roman" w:hAnsi="Times New Roman" w:cs="Times New Roman" w:eastAsia="宋体"/>
+                <w:b/>
+                <w:sz w:val="18"/>
+              </w:rPr>
+              <w:t xml:space="preserve">本组验后概率（%）</w:t>
+            </w:r>
+          </w:p>
+        </w:tc>
+        <w:tc>
+          <w:tcPr>
+            <w:tcW w:type="dxa" w:w="1233"/>
+            <w:tcBorders>
+              <w:bottom w:val="single" w:sz="6" w:space="0" w:color="000000"/>
+            </w:tcBorders>
+          </w:tcPr>
+          <w:p>
+            <w:pPr>
+              <w:pStyle w:val="Compact"/>
+              <w:spacing w:line="276" w:lineRule="auto" w:after="0"/>
+              <w:ind w:firstLine="0" w:left="0"/>
+              <w:jc w:val="center"/>
+            </w:pPr>
+            <w:r>
+              <w:rPr>
+                <w:rFonts w:hint="eastAsia" w:ascii="Times New Roman" w:hAnsi="Times New Roman" w:cs="Times New Roman" w:eastAsia="宋体"/>
+                <w:b/>
+                <w:sz w:val="18"/>
+              </w:rPr>
+              <w:t xml:space="preserve">验后概率</w:t>
+            </w:r>
+            <w:r>
+              <w:rPr>
+                <w:rFonts w:ascii="Times New Roman" w:hAnsi="Times New Roman" w:cs="Times New Roman" w:eastAsia="宋体"/>
+                <w:b/>
+                <w:sz w:val="18"/>
+                <w:vertAlign w:val="superscript"/>
+              </w:rPr>
+              <w:t xml:space="preserve">a</w:t>
+            </w:r>
+            <w:r>
+              <w:rPr>
+                <w:rFonts w:hint="eastAsia" w:ascii="Times New Roman" w:hAnsi="Times New Roman" w:cs="Times New Roman" w:eastAsia="宋体"/>
+                <w:b/>
+                <w:sz w:val="18"/>
+              </w:rPr>
+              <w:t xml:space="preserve">（%）</w:t>
+            </w:r>
+          </w:p>
+        </w:tc>
+        <w:tc>
+          <w:tcPr>
+            <w:tcW w:type="dxa" w:w="1233"/>
+            <w:tcBorders>
+              <w:bottom w:val="single" w:sz="6" w:space="0" w:color="000000"/>
+            </w:tcBorders>
+          </w:tcPr>
+          <w:p>
+            <w:pPr>
+              <w:pStyle w:val="Compact"/>
+              <w:spacing w:line="276" w:lineRule="auto" w:after="0"/>
+              <w:ind w:firstLine="0" w:left="0"/>
+              <w:jc w:val="center"/>
+            </w:pPr>
+            <w:r>
+              <w:rPr>
+                <w:rFonts w:hint="eastAsia" w:ascii="Times New Roman" w:hAnsi="Times New Roman" w:cs="Times New Roman" w:eastAsia="宋体"/>
+                <w:b/>
+                <w:sz w:val="18"/>
+              </w:rPr>
+              <w:t xml:space="preserve">验后概率</w:t>
+            </w:r>
+            <w:r>
+              <w:rPr>
+                <w:rFonts w:ascii="Times New Roman" w:hAnsi="Times New Roman" w:cs="Times New Roman" w:eastAsia="宋体"/>
+                <w:b/>
+                <w:sz w:val="18"/>
+                <w:vertAlign w:val="superscript"/>
+              </w:rPr>
+              <w:t xml:space="preserve">b</w:t>
+            </w:r>
+            <w:r>
+              <w:rPr>
+                <w:rFonts w:hint="eastAsia" w:ascii="Times New Roman" w:hAnsi="Times New Roman" w:cs="Times New Roman" w:eastAsia="宋体"/>
+                <w:b/>
+                <w:sz w:val="18"/>
+              </w:rPr>
+              <w:t xml:space="preserve">（%）</w:t>
+            </w:r>
+          </w:p>
+        </w:tc>
+      </w:tr>
+      <w:tr>
+        <w:tc>
+          <w:tcPr>
+            <w:tcW w:type="dxa" w:w="1617"/>
+          </w:tcPr>
+          <w:p>
+            <w:pPr>
+              <w:pStyle w:val="Compact"/>
+              <w:spacing w:line="276" w:lineRule="auto" w:after="0"/>
+              <w:ind w:firstLine="0" w:left="0"/>
+              <w:jc w:val="center"/>
+            </w:pPr>
+            <w:r>
+              <w:rPr>
+                <w:rFonts w:hint="eastAsia" w:ascii="Times New Roman" w:hAnsi="Times New Roman" w:cs="Times New Roman" w:eastAsia="宋体"/>
+                <w:sz w:val="18"/>
+              </w:rPr>
+              <w:t xml:space="preserve">7分</w:t>
+            </w:r>
+          </w:p>
+        </w:tc>
+        <w:tc>
+          <w:tcPr>
+            <w:tcW w:type="dxa" w:w="1253"/>
+          </w:tcPr>
+          <w:p>
+            <w:pPr>
+              <w:pStyle w:val="Compact"/>
+              <w:spacing w:line="276" w:lineRule="auto" w:after="0"/>
+              <w:ind w:firstLine="0" w:left="0"/>
+              <w:jc w:val="center"/>
+            </w:pPr>
+            <w:r>
+              <w:rPr>
+                <w:rFonts w:ascii="Times New Roman" w:hAnsi="Times New Roman" w:cs="Times New Roman" w:eastAsia="宋体"/>
+                <w:sz w:val="18"/>
+              </w:rPr>
+              <w:t xml:space="preserve">5/7</w:t>
+            </w:r>
+          </w:p>
+        </w:tc>
+        <w:tc>
+          <w:tcPr>
+            <w:tcW w:type="dxa" w:w="2021"/>
+          </w:tcPr>
+          <w:p>
+            <w:pPr>
+              <w:pStyle w:val="Compact"/>
+              <w:spacing w:line="276" w:lineRule="auto" w:after="0"/>
+              <w:ind w:firstLine="0" w:left="0"/>
+              <w:jc w:val="center"/>
+            </w:pPr>
+            <w:r>
+              <w:rPr>
+                <w:rFonts w:hint="eastAsia" w:ascii="Times New Roman" w:hAnsi="Times New Roman" w:cs="Times New Roman" w:eastAsia="宋体"/>
+                <w:sz w:val="18"/>
+              </w:rPr>
+              <w:t xml:space="preserve">0.22（0.08~0.62）</w:t>
+            </w:r>
+          </w:p>
+        </w:tc>
+        <w:tc>
+          <w:tcPr>
+            <w:tcW w:type="dxa" w:w="1374"/>
+          </w:tcPr>
+          <w:p>
+            <w:pPr>
+              <w:pStyle w:val="Compact"/>
+              <w:spacing w:line="276" w:lineRule="auto" w:after="0"/>
+              <w:ind w:firstLine="0" w:left="0"/>
+              <w:jc w:val="center"/>
+            </w:pPr>
+            <w:r>
+              <w:rPr>
+                <w:rFonts w:ascii="Times New Roman" w:hAnsi="Times New Roman" w:cs="Times New Roman" w:eastAsia="宋体"/>
+                <w:sz w:val="18"/>
+              </w:rPr>
+              <w:t xml:space="preserve">41.7</w:t>
+            </w:r>
+          </w:p>
+        </w:tc>
+        <w:tc>
+          <w:tcPr>
+            <w:tcW w:type="dxa" w:w="1233"/>
+          </w:tcPr>
+          <w:p>
+            <w:pPr>
+              <w:pStyle w:val="Compact"/>
+              <w:spacing w:line="276" w:lineRule="auto" w:after="0"/>
+              <w:ind w:firstLine="0" w:left="0"/>
+              <w:jc w:val="center"/>
+            </w:pPr>
+            <w:r>
+              <w:rPr>
+                <w:rFonts w:ascii="Times New Roman" w:hAnsi="Times New Roman" w:cs="Times New Roman" w:eastAsia="宋体"/>
+                <w:sz w:val="18"/>
+              </w:rPr>
+              <w:t xml:space="preserve">8.5</w:t>
+            </w:r>
+          </w:p>
+        </w:tc>
+        <w:tc>
+          <w:tcPr>
+            <w:tcW w:type="dxa" w:w="1233"/>
+          </w:tcPr>
+          <w:p>
+            <w:pPr>
+              <w:pStyle w:val="Compact"/>
+              <w:spacing w:line="276" w:lineRule="auto" w:after="0"/>
+              <w:ind w:firstLine="0" w:left="0"/>
+              <w:jc w:val="center"/>
+            </w:pPr>
+            <w:r>
+              <w:rPr>
+                <w:rFonts w:ascii="Times New Roman" w:hAnsi="Times New Roman" w:cs="Times New Roman" w:eastAsia="宋体"/>
+                <w:sz w:val="18"/>
+              </w:rPr>
+              <w:t xml:space="preserve">17.8</w:t>
+            </w:r>
+          </w:p>
+        </w:tc>
+      </w:tr>
+      <w:tr>
+        <w:tc>
+          <w:tcPr>
+            <w:tcW w:type="dxa" w:w="1617"/>
+          </w:tcPr>
+          <w:p>
+            <w:pPr>
+              <w:pStyle w:val="Compact"/>
+              <w:spacing w:line="276" w:lineRule="auto" w:after="0"/>
+              <w:ind w:firstLine="0" w:left="0"/>
+              <w:jc w:val="center"/>
+            </w:pPr>
+            <w:r>
+              <w:rPr>
+                <w:rFonts w:hint="eastAsia" w:ascii="Times New Roman" w:hAnsi="Times New Roman" w:cs="Times New Roman" w:eastAsia="宋体"/>
+                <w:sz w:val="18"/>
+              </w:rPr>
+              <w:t xml:space="preserve">8~9分</w:t>
+            </w:r>
+          </w:p>
+        </w:tc>
+        <w:tc>
+          <w:tcPr>
+            <w:tcW w:type="dxa" w:w="1253"/>
+          </w:tcPr>
+          <w:p>
+            <w:pPr>
+              <w:pStyle w:val="Compact"/>
+              <w:spacing w:line="276" w:lineRule="auto" w:after="0"/>
+              <w:ind w:firstLine="0" w:left="0"/>
+              <w:jc w:val="center"/>
+            </w:pPr>
+            <w:r>
+              <w:rPr>
+                <w:rFonts w:ascii="Times New Roman" w:hAnsi="Times New Roman" w:cs="Times New Roman" w:eastAsia="宋体"/>
+                <w:sz w:val="18"/>
+              </w:rPr>
+              <w:t xml:space="preserve">25/10</w:t>
+            </w:r>
+          </w:p>
+        </w:tc>
+        <w:tc>
+          <w:tcPr>
+            <w:tcW w:type="dxa" w:w="2021"/>
+          </w:tcPr>
+          <w:p>
+            <w:pPr>
+              <w:pStyle w:val="Compact"/>
+              <w:spacing w:line="276" w:lineRule="auto" w:after="0"/>
+              <w:ind w:firstLine="0" w:left="0"/>
+              <w:jc w:val="center"/>
+            </w:pPr>
+            <w:r>
+              <w:rPr>
+                <w:rFonts w:hint="eastAsia" w:ascii="Times New Roman" w:hAnsi="Times New Roman" w:cs="Times New Roman" w:eastAsia="宋体"/>
+                <w:sz w:val="18"/>
+              </w:rPr>
+              <w:t xml:space="preserve">0.76（0.43~1.35）</w:t>
+            </w:r>
+          </w:p>
+        </w:tc>
+        <w:tc>
+          <w:tcPr>
+            <w:tcW w:type="dxa" w:w="1374"/>
+          </w:tcPr>
+          <w:p>
+            <w:pPr>
+              <w:pStyle w:val="Compact"/>
+              <w:spacing w:line="276" w:lineRule="auto" w:after="0"/>
+              <w:ind w:firstLine="0" w:left="0"/>
+              <w:jc w:val="center"/>
+            </w:pPr>
+            <w:r>
+              <w:rPr>
+                <w:rFonts w:ascii="Times New Roman" w:hAnsi="Times New Roman" w:cs="Times New Roman" w:eastAsia="宋体"/>
+                <w:sz w:val="18"/>
+              </w:rPr>
+              <w:t xml:space="preserve">71.4</w:t>
+            </w:r>
+          </w:p>
+        </w:tc>
+        <w:tc>
+          <w:tcPr>
+            <w:tcW w:type="dxa" w:w="1233"/>
+          </w:tcPr>
+          <w:p>
+            <w:pPr>
+              <w:pStyle w:val="Compact"/>
+              <w:spacing w:line="276" w:lineRule="auto" w:after="0"/>
+              <w:ind w:firstLine="0" w:left="0"/>
+              <w:jc w:val="center"/>
+            </w:pPr>
+            <w:r>
+              <w:rPr>
+                <w:rFonts w:ascii="Times New Roman" w:hAnsi="Times New Roman" w:cs="Times New Roman" w:eastAsia="宋体"/>
+                <w:sz w:val="18"/>
+              </w:rPr>
+              <w:t xml:space="preserve">24.6</w:t>
+            </w:r>
+          </w:p>
+        </w:tc>
+        <w:tc>
+          <w:tcPr>
+            <w:tcW w:type="dxa" w:w="1233"/>
+          </w:tcPr>
+          <w:p>
+            <w:pPr>
+              <w:pStyle w:val="Compact"/>
+              <w:spacing w:line="276" w:lineRule="auto" w:after="0"/>
+              <w:ind w:firstLine="0" w:left="0"/>
+              <w:jc w:val="center"/>
+            </w:pPr>
+            <w:r>
+              <w:rPr>
+                <w:rFonts w:ascii="Times New Roman" w:hAnsi="Times New Roman" w:cs="Times New Roman" w:eastAsia="宋体"/>
+                <w:sz w:val="18"/>
+              </w:rPr>
+              <w:t xml:space="preserve">43.2</w:t>
+            </w:r>
+          </w:p>
+        </w:tc>
+      </w:tr>
+      <w:tr>
+        <w:tc>
+          <w:tcPr>
+            <w:tcW w:type="dxa" w:w="1617"/>
+          </w:tcPr>
+          <w:p>
+            <w:pPr>
+              <w:pStyle w:val="Compact"/>
+              <w:spacing w:line="276" w:lineRule="auto" w:after="0"/>
+              <w:ind w:firstLine="0" w:left="0"/>
+              <w:jc w:val="center"/>
+            </w:pPr>
+            <w:r>
+              <w:rPr>
+                <w:rFonts w:hint="eastAsia" w:ascii="Times New Roman" w:hAnsi="Times New Roman" w:cs="Times New Roman" w:eastAsia="宋体"/>
+                <w:sz w:val="18"/>
+              </w:rPr>
+              <w:t xml:space="preserve">≥10分</w:t>
+            </w:r>
+          </w:p>
+        </w:tc>
+        <w:tc>
+          <w:tcPr>
+            <w:tcW w:type="dxa" w:w="1253"/>
+          </w:tcPr>
+          <w:p>
+            <w:pPr>
+              <w:pStyle w:val="Compact"/>
+              <w:spacing w:line="276" w:lineRule="auto" w:after="0"/>
+              <w:ind w:firstLine="0" w:left="0"/>
+              <w:jc w:val="center"/>
+            </w:pPr>
+            <w:r>
+              <w:rPr>
+                <w:rFonts w:ascii="Times New Roman" w:hAnsi="Times New Roman" w:cs="Times New Roman" w:eastAsia="宋体"/>
+                <w:sz w:val="18"/>
+              </w:rPr>
+              <w:t xml:space="preserve">49/7</w:t>
+            </w:r>
+          </w:p>
+        </w:tc>
+        <w:tc>
+          <w:tcPr>
+            <w:tcW w:type="dxa" w:w="2021"/>
+          </w:tcPr>
+          <w:p>
+            <w:pPr>
+              <w:pStyle w:val="Compact"/>
+              <w:spacing w:line="276" w:lineRule="auto" w:after="0"/>
+              <w:ind w:firstLine="0" w:left="0"/>
+              <w:jc w:val="center"/>
+            </w:pPr>
+            <w:r>
+              <w:rPr>
+                <w:rFonts w:hint="eastAsia" w:ascii="Times New Roman" w:hAnsi="Times New Roman" w:cs="Times New Roman" w:eastAsia="宋体"/>
+                <w:sz w:val="18"/>
+              </w:rPr>
+              <w:t xml:space="preserve">2.13（1.11~4.06）</w:t>
+            </w:r>
+          </w:p>
+        </w:tc>
+        <w:tc>
+          <w:tcPr>
+            <w:tcW w:type="dxa" w:w="1374"/>
+          </w:tcPr>
+          <w:p>
+            <w:pPr>
+              <w:pStyle w:val="Compact"/>
+              <w:spacing w:line="276" w:lineRule="auto" w:after="0"/>
+              <w:ind w:firstLine="0" w:left="0"/>
+              <w:jc w:val="center"/>
+            </w:pPr>
+            <w:r>
+              <w:rPr>
+                <w:rFonts w:ascii="Times New Roman" w:hAnsi="Times New Roman" w:cs="Times New Roman" w:eastAsia="宋体"/>
+                <w:sz w:val="18"/>
+              </w:rPr>
+              <w:t xml:space="preserve">87.5</w:t>
+            </w:r>
+          </w:p>
+        </w:tc>
+        <w:tc>
+          <w:tcPr>
+            <w:tcW w:type="dxa" w:w="1233"/>
+          </w:tcPr>
+          <w:p>
+            <w:pPr>
+              <w:pStyle w:val="Compact"/>
+              <w:spacing w:line="276" w:lineRule="auto" w:after="0"/>
+              <w:ind w:firstLine="0" w:left="0"/>
+              <w:jc w:val="center"/>
+            </w:pPr>
+            <w:r>
+              <w:rPr>
+                <w:rFonts w:ascii="Times New Roman" w:hAnsi="Times New Roman" w:cs="Times New Roman" w:eastAsia="宋体"/>
+                <w:sz w:val="18"/>
+              </w:rPr>
+              <w:t xml:space="preserve">47.7</w:t>
+            </w:r>
+          </w:p>
+        </w:tc>
+        <w:tc>
+          <w:tcPr>
+            <w:tcW w:type="dxa" w:w="1233"/>
+          </w:tcPr>
+          <w:p>
+            <w:pPr>
+              <w:pStyle w:val="Compact"/>
+              <w:spacing w:line="276" w:lineRule="auto" w:after="0"/>
+              <w:ind w:firstLine="0" w:left="0"/>
+              <w:jc w:val="center"/>
+            </w:pPr>
+            <w:r>
+              <w:rPr>
+                <w:rFonts w:ascii="Times New Roman" w:hAnsi="Times New Roman" w:cs="Times New Roman" w:eastAsia="宋体"/>
+                <w:sz w:val="18"/>
+              </w:rPr>
+              <w:t xml:space="preserve">68.0</w:t>
+            </w:r>
+          </w:p>
+        </w:tc>
+      </w:tr>
+    </w:tbl>
+    <w:p>
+      <w:pPr>
+        <w:pStyle w:val="BodyText"/>
+        <w:spacing w:line="360" w:lineRule="auto" w:after="60"/>
+        <w:ind/>
+      </w:pPr>
+      <w:r>
+        <w:rPr>
+          <w:rFonts w:hint="eastAsia" w:ascii="Times New Roman" w:hAnsi="Times New Roman" w:cs="Times New Roman" w:eastAsia="宋体"/>
+          <w:sz w:val="18"/>
+        </w:rPr>
+        <w:t xml:space="preserve">注：</w:t>
+      </w:r>
+      <w:r>
+        <w:rPr>
+          <w:rFonts w:ascii="Times New Roman" w:hAnsi="Times New Roman" w:cs="Times New Roman" w:eastAsia="宋体"/>
+          <w:sz w:val="18"/>
+          <w:vertAlign w:val="superscript"/>
+        </w:rPr>
+        <w:t xml:space="preserve">a</w:t>
+      </w:r>
+      <w:r>
+        <w:rPr>
+          <w:rFonts w:hint="eastAsia" w:ascii="Times New Roman" w:hAnsi="Times New Roman" w:cs="Times New Roman" w:eastAsia="宋体"/>
+          <w:sz w:val="18"/>
+        </w:rPr>
+        <w:t xml:space="preserve">验前概率为30%时；</w:t>
+      </w:r>
+      <w:r>
+        <w:rPr>
+          <w:rFonts w:ascii="Times New Roman" w:hAnsi="Times New Roman" w:cs="Times New Roman" w:eastAsia="宋体"/>
+          <w:sz w:val="18"/>
+          <w:vertAlign w:val="superscript"/>
+        </w:rPr>
+        <w:t xml:space="preserve">b</w:t>
+      </w:r>
+      <w:r>
+        <w:rPr>
+          <w:rFonts w:hint="eastAsia" w:ascii="Times New Roman" w:hAnsi="Times New Roman" w:cs="Times New Roman" w:eastAsia="宋体"/>
+          <w:sz w:val="18"/>
+        </w:rPr>
+        <w:t xml:space="preserve">验前概率为50%时；各区间例数为GERD复合诊断阳性/阴性例数，由表3截断值结果反推；本组验前概率（GERD复合诊断比例）为76.7%；验后概率=验后比值/（1+验后比值），验后比值=验前比值×分层似然比</w:t>
+      </w:r>
+    </w:p>
     <w:bookmarkEnd w:id="18"/>
     <w:bookmarkStart w:id="19" w:name="治疗前后症状及体重变化"/>
     <w:p>
@@ -7645,14 +7886,14 @@
           <w:iCs/>
           <w:sz w:val="21"/>
         </w:rPr>
-        <w:t xml:space="preserve">P</w:t>
-      </w:r>
-      <w:r>
-        <w:rPr>
-          <w:rFonts w:hint="eastAsia" w:ascii="Times New Roman" w:hAnsi="Times New Roman" w:cs="Times New Roman" w:eastAsia="宋体"/>
-          <w:sz w:val="21"/>
-        </w:rPr>
-        <w:t xml:space="preserve">&lt;0.001；配对</w:t>
+        <w:t xml:space="preserve">W</w:t>
+      </w:r>
+      <w:r>
+        <w:rPr>
+          <w:rFonts w:hint="eastAsia" w:ascii="Times New Roman" w:hAnsi="Times New Roman" w:cs="Times New Roman" w:eastAsia="宋体"/>
+          <w:sz w:val="21"/>
+        </w:rPr>
+        <w:t xml:space="preserve">=0，</w:t>
       </w:r>
       <w:r>
         <w:rPr>
@@ -7661,14 +7902,14 @@
           <w:iCs/>
           <w:sz w:val="21"/>
         </w:rPr>
-        <w:t xml:space="preserve">t</w:t>
-      </w:r>
-      <w:r>
-        <w:rPr>
-          <w:rFonts w:hint="eastAsia" w:ascii="Times New Roman" w:hAnsi="Times New Roman" w:cs="Times New Roman" w:eastAsia="宋体"/>
-          <w:sz w:val="21"/>
-        </w:rPr>
-        <w:t xml:space="preserve">=10.01，</w:t>
+        <w:t xml:space="preserve">P</w:t>
+      </w:r>
+      <w:r>
+        <w:rPr>
+          <w:rFonts w:hint="eastAsia" w:ascii="Times New Roman" w:hAnsi="Times New Roman" w:cs="Times New Roman" w:eastAsia="宋体"/>
+          <w:sz w:val="21"/>
+        </w:rPr>
+        <w:t xml:space="preserve">&lt;0.001；配对</w:t>
       </w:r>
       <w:r>
         <w:rPr>
@@ -7677,107 +7918,14 @@
           <w:iCs/>
           <w:sz w:val="21"/>
         </w:rPr>
-        <w:t xml:space="preserve">P</w:t>
-      </w:r>
-      <w:r>
-        <w:rPr>
-          <w:rFonts w:hint="eastAsia" w:ascii="Times New Roman" w:hAnsi="Times New Roman" w:cs="Times New Roman" w:eastAsia="宋体"/>
-          <w:sz w:val="21"/>
-        </w:rPr>
-        <w:t xml:space="preserve">&lt;0.001）。无患者4GerdQ评分较基线升高</w:t>
-      </w:r>
-      <w:r>
-        <w:rPr>
-          <w:rFonts w:hint="eastAsia" w:ascii="Times New Roman" w:hAnsi="Times New Roman" w:cs="Times New Roman" w:eastAsia="宋体"/>
-          <w:sz w:val="21"/>
-          <w:highlight w:val="yellow"/>
-        </w:rPr>
-        <w:t xml:space="preserve">【</w:t>
-      </w:r>
-      <w:r>
-        <w:rPr>
-          <w:rFonts w:hint="eastAsia" w:ascii="Times New Roman" w:hAnsi="Times New Roman" w:cs="Times New Roman" w:eastAsia="宋体"/>
-          <w:sz w:val="21"/>
-          <w:highlight w:val="yellow"/>
-        </w:rPr>
-        <w:t xml:space="preserve">作者确认</w:t>
-      </w:r>
-      <w:r>
-        <w:rPr>
-          <w:rFonts w:hint="eastAsia" w:ascii="Times New Roman" w:hAnsi="Times New Roman" w:cs="Times New Roman" w:eastAsia="宋体"/>
-          <w:sz w:val="21"/>
-          <w:highlight w:val="yellow"/>
-        </w:rPr>
-        <w:t xml:space="preserve">】</w:t>
-      </w:r>
-      <w:r>
-        <w:rPr>
-          <w:rFonts w:hint="eastAsia" w:ascii="Times New Roman" w:hAnsi="Times New Roman" w:cs="Times New Roman" w:eastAsia="宋体"/>
-          <w:sz w:val="21"/>
-        </w:rPr>
-        <w:t xml:space="preserve">。72例（69.9%，95%CI：60.5%~77.9%）达到症状改善标准；按严格标准（下降≥3分）为</w:t>
-      </w:r>
-      <w:r>
-        <w:rPr>
-          <w:rFonts w:hint="eastAsia" w:ascii="Times New Roman" w:hAnsi="Times New Roman" w:cs="Times New Roman" w:eastAsia="宋体"/>
-          <w:sz w:val="21"/>
-          <w:highlight w:val="yellow"/>
-        </w:rPr>
-        <w:t xml:space="preserve">【</w:t>
-      </w:r>
-      <w:r>
-        <w:rPr>
-          <w:rFonts w:hint="eastAsia" w:ascii="Times New Roman" w:hAnsi="Times New Roman" w:cs="Times New Roman" w:eastAsia="宋体"/>
-          <w:sz w:val="21"/>
-          <w:highlight w:val="yellow"/>
-        </w:rPr>
-        <w:t xml:space="preserve">作者补充</w:t>
-      </w:r>
-      <w:r>
-        <w:rPr>
-          <w:rFonts w:hint="eastAsia" w:ascii="Times New Roman" w:hAnsi="Times New Roman" w:cs="Times New Roman" w:eastAsia="宋体"/>
-          <w:sz w:val="21"/>
-          <w:highlight w:val="yellow"/>
-        </w:rPr>
-        <w:t xml:space="preserve">】</w:t>
-      </w:r>
-      <w:r>
-        <w:rPr>
-          <w:rFonts w:hint="eastAsia" w:ascii="Times New Roman" w:hAnsi="Times New Roman" w:cs="Times New Roman" w:eastAsia="宋体"/>
-          <w:sz w:val="21"/>
-        </w:rPr>
-        <w:t xml:space="preserve">例；第1、2、5、6条得分均≤1分者为</w:t>
-      </w:r>
-      <w:r>
-        <w:rPr>
-          <w:rFonts w:hint="eastAsia" w:ascii="Times New Roman" w:hAnsi="Times New Roman" w:cs="Times New Roman" w:eastAsia="宋体"/>
-          <w:sz w:val="21"/>
-          <w:highlight w:val="yellow"/>
-        </w:rPr>
-        <w:t xml:space="preserve">【</w:t>
-      </w:r>
-      <w:r>
-        <w:rPr>
-          <w:rFonts w:hint="eastAsia" w:ascii="Times New Roman" w:hAnsi="Times New Roman" w:cs="Times New Roman" w:eastAsia="宋体"/>
-          <w:sz w:val="21"/>
-          <w:highlight w:val="yellow"/>
-        </w:rPr>
-        <w:t xml:space="preserve">作者补充</w:t>
-      </w:r>
-      <w:r>
-        <w:rPr>
-          <w:rFonts w:hint="eastAsia" w:ascii="Times New Roman" w:hAnsi="Times New Roman" w:cs="Times New Roman" w:eastAsia="宋体"/>
-          <w:sz w:val="21"/>
-          <w:highlight w:val="yellow"/>
-        </w:rPr>
-        <w:t xml:space="preserve">】</w:t>
-      </w:r>
-      <w:r>
-        <w:rPr>
-          <w:rFonts w:hint="eastAsia" w:ascii="Times New Roman" w:hAnsi="Times New Roman" w:cs="Times New Roman" w:eastAsia="宋体"/>
-          <w:sz w:val="21"/>
-        </w:rPr>
-        <w:t xml:space="preserve">例。治疗后4GerdQ≤1分者仅8例（7.8%），提示多数患者仍有残余症状。GerdQ总分由（10.06±2.02）分降至（8.36±2.40）分（</w:t>
+        <w:t xml:space="preserve">t</w:t>
+      </w:r>
+      <w:r>
+        <w:rPr>
+          <w:rFonts w:hint="eastAsia" w:ascii="Times New Roman" w:hAnsi="Times New Roman" w:cs="Times New Roman" w:eastAsia="宋体"/>
+          <w:sz w:val="21"/>
+        </w:rPr>
+        <w:t xml:space="preserve">=10.01，</w:t>
       </w:r>
       <w:r>
         <w:rPr>
@@ -7793,7 +7941,7 @@
           <w:rFonts w:hint="eastAsia" w:ascii="Times New Roman" w:hAnsi="Times New Roman" w:cs="Times New Roman" w:eastAsia="宋体"/>
           <w:sz w:val="21"/>
         </w:rPr>
-        <w:t xml:space="preserve">&lt;0.001）。治疗期平均减重（1.62±1.22）kg［中位数1.5</w:t>
+        <w:t xml:space="preserve">&lt;0.001），配对Cohen</w:t>
       </w:r>
       <w:r>
         <w:rPr>
@@ -7801,27 +7949,6 @@
           <w:sz w:val="21"/>
         </w:rPr>
         <w:t xml:space="preserve"> </w:t>
-      </w:r>
-      <w:r>
-        <w:rPr>
-          <w:rFonts w:hint="eastAsia" w:ascii="Times New Roman" w:hAnsi="Times New Roman" w:cs="Times New Roman" w:eastAsia="宋体"/>
-          <w:sz w:val="21"/>
-        </w:rPr>
-        <w:t xml:space="preserve">kg，范围−1~5</w:t>
-      </w:r>
-      <w:r>
-        <w:rPr>
-          <w:rFonts w:ascii="Times New Roman" w:hAnsi="Times New Roman" w:cs="Times New Roman" w:eastAsia="宋体"/>
-          <w:sz w:val="21"/>
-        </w:rPr>
-        <w:t xml:space="preserve"> </w:t>
-      </w:r>
-      <w:r>
-        <w:rPr>
-          <w:rFonts w:hint="eastAsia" w:ascii="Times New Roman" w:hAnsi="Times New Roman" w:cs="Times New Roman" w:eastAsia="宋体"/>
-          <w:sz w:val="21"/>
-        </w:rPr>
-        <w:t xml:space="preserve">kg］，相当于基线体重的（1.95±1.47）%。减重幅度与4GerdQ下降值呈弱正相关（</w:t>
       </w:r>
       <w:r>
         <w:rPr>
@@ -7830,14 +7957,14 @@
           <w:iCs/>
           <w:sz w:val="21"/>
         </w:rPr>
-        <w:t xml:space="preserve">r</w:t>
-      </w:r>
-      <w:r>
-        <w:rPr>
-          <w:rFonts w:hint="eastAsia" w:ascii="Times New Roman" w:hAnsi="Times New Roman" w:cs="Times New Roman" w:eastAsia="宋体"/>
-          <w:sz w:val="21"/>
-        </w:rPr>
-        <w:t xml:space="preserve">ₛ=0.248，</w:t>
+        <w:t xml:space="preserve">d</w:t>
+      </w:r>
+      <w:r>
+        <w:rPr>
+          <w:rFonts w:hint="eastAsia" w:ascii="Times New Roman" w:hAnsi="Times New Roman" w:cs="Times New Roman" w:eastAsia="宋体"/>
+          <w:sz w:val="21"/>
+        </w:rPr>
+        <w:t xml:space="preserve">=0.99。无患者4GerdQ评分较基线升高。72例（69.9%，95%CI：60.5%~77.9%）达到症状改善标准，其4GerdQ平均下降（2.36±1.52）分；31例未改善者4GerdQ均无变化。治疗后4GerdQ≤1分者仅8例（7.8%），提示多数患者仍有残余症状。GerdQ总分由（10.06±2.02）分降至（8.36±2.40）分（</w:t>
       </w:r>
       <w:r>
         <w:rPr>
@@ -7853,7 +7980,35 @@
           <w:rFonts w:hint="eastAsia" w:ascii="Times New Roman" w:hAnsi="Times New Roman" w:cs="Times New Roman" w:eastAsia="宋体"/>
           <w:sz w:val="21"/>
         </w:rPr>
-        <w:t xml:space="preserve">=0.012），减重百分比与4GerdQ下降值的相关性相近（</w:t>
+        <w:t xml:space="preserve">&lt;0.001），下降几乎全部来自4个阳性预测条目，上腹痛与恶心2个条目合计得分治疗前后分别为3.95分和3.90分，基本不变。治疗期平均减重（1.62±1.22）kg［中位数1.5</w:t>
+      </w:r>
+      <w:r>
+        <w:rPr>
+          <w:rFonts w:ascii="Times New Roman" w:hAnsi="Times New Roman" w:cs="Times New Roman" w:eastAsia="宋体"/>
+          <w:sz w:val="21"/>
+        </w:rPr>
+        <w:t xml:space="preserve"> </w:t>
+      </w:r>
+      <w:r>
+        <w:rPr>
+          <w:rFonts w:hint="eastAsia" w:ascii="Times New Roman" w:hAnsi="Times New Roman" w:cs="Times New Roman" w:eastAsia="宋体"/>
+          <w:sz w:val="21"/>
+        </w:rPr>
+        <w:t xml:space="preserve">kg，范围−1~5</w:t>
+      </w:r>
+      <w:r>
+        <w:rPr>
+          <w:rFonts w:ascii="Times New Roman" w:hAnsi="Times New Roman" w:cs="Times New Roman" w:eastAsia="宋体"/>
+          <w:sz w:val="21"/>
+        </w:rPr>
+        <w:t xml:space="preserve"> </w:t>
+      </w:r>
+      <w:r>
+        <w:rPr>
+          <w:rFonts w:hint="eastAsia" w:ascii="Times New Roman" w:hAnsi="Times New Roman" w:cs="Times New Roman" w:eastAsia="宋体"/>
+          <w:sz w:val="21"/>
+        </w:rPr>
+        <w:t xml:space="preserve">kg］，相当于基线体重的（1.95±1.47）%。减重幅度与4GerdQ下降值呈弱正相关（</w:t>
       </w:r>
       <w:r>
         <w:rPr>
@@ -7869,7 +8024,7 @@
           <w:rFonts w:hint="eastAsia" w:ascii="Times New Roman" w:hAnsi="Times New Roman" w:cs="Times New Roman" w:eastAsia="宋体"/>
           <w:sz w:val="21"/>
         </w:rPr>
-        <w:t xml:space="preserve">ₛ=0.294，</w:t>
+        <w:t xml:space="preserve">ₛ=0.248，</w:t>
       </w:r>
       <w:r>
         <w:rPr>
@@ -7885,7 +8040,7 @@
           <w:rFonts w:hint="eastAsia" w:ascii="Times New Roman" w:hAnsi="Times New Roman" w:cs="Times New Roman" w:eastAsia="宋体"/>
           <w:sz w:val="21"/>
         </w:rPr>
-        <w:t xml:space="preserve">=0.003）。轻度、中度和重度肥胖组4GerdQ下降值分别为（1.54±1.57）分、（1.81±1.81）分和（1.86±1.92）分，差异无统计学意义（</w:t>
+        <w:t xml:space="preserve">=0.012），减重百分比与4GerdQ下降值的相关性相近（</w:t>
       </w:r>
       <w:r>
         <w:rPr>
@@ -7894,14 +8049,14 @@
           <w:iCs/>
           <w:sz w:val="21"/>
         </w:rPr>
-        <w:t xml:space="preserve">H</w:t>
-      </w:r>
-      <w:r>
-        <w:rPr>
-          <w:rFonts w:hint="eastAsia" w:ascii="Times New Roman" w:hAnsi="Times New Roman" w:cs="Times New Roman" w:eastAsia="宋体"/>
-          <w:sz w:val="21"/>
-        </w:rPr>
-        <w:t xml:space="preserve">=0.29，</w:t>
+        <w:t xml:space="preserve">r</w:t>
+      </w:r>
+      <w:r>
+        <w:rPr>
+          <w:rFonts w:hint="eastAsia" w:ascii="Times New Roman" w:hAnsi="Times New Roman" w:cs="Times New Roman" w:eastAsia="宋体"/>
+          <w:sz w:val="21"/>
+        </w:rPr>
+        <w:t xml:space="preserve">ₛ=0.294，</w:t>
       </w:r>
       <w:r>
         <w:rPr>
@@ -7917,7 +8072,78 @@
           <w:rFonts w:hint="eastAsia" w:ascii="Times New Roman" w:hAnsi="Times New Roman" w:cs="Times New Roman" w:eastAsia="宋体"/>
           <w:sz w:val="21"/>
         </w:rPr>
-        <w:t xml:space="preserve">=0.866）。在GERD复合诊断阳性的79例中，症状改善59例（74.7%）；阴性的24例中，症状改善13例（54.2%）。见表4、图4。</w:t>
+        <w:t xml:space="preserve">=0.003）。轻度、中度和重度肥胖组4GerdQ下降值分别为（1.54±1.57）分、（1.81±1.81）分和（1.86±1.92）分，差异无统计学意义（</w:t>
+      </w:r>
+      <w:r>
+        <w:rPr>
+          <w:rFonts w:ascii="Times New Roman" w:hAnsi="Times New Roman" w:cs="Times New Roman" w:eastAsia="宋体"/>
+          <w:i/>
+          <w:iCs/>
+          <w:sz w:val="21"/>
+        </w:rPr>
+        <w:t xml:space="preserve">H</w:t>
+      </w:r>
+      <w:r>
+        <w:rPr>
+          <w:rFonts w:hint="eastAsia" w:ascii="Times New Roman" w:hAnsi="Times New Roman" w:cs="Times New Roman" w:eastAsia="宋体"/>
+          <w:sz w:val="21"/>
+        </w:rPr>
+        <w:t xml:space="preserve">=0.29，</w:t>
+      </w:r>
+      <w:r>
+        <w:rPr>
+          <w:rFonts w:ascii="Times New Roman" w:hAnsi="Times New Roman" w:cs="Times New Roman" w:eastAsia="宋体"/>
+          <w:i/>
+          <w:iCs/>
+          <w:sz w:val="21"/>
+        </w:rPr>
+        <w:t xml:space="preserve">P</w:t>
+      </w:r>
+      <w:r>
+        <w:rPr>
+          <w:rFonts w:hint="eastAsia" w:ascii="Times New Roman" w:hAnsi="Times New Roman" w:cs="Times New Roman" w:eastAsia="宋体"/>
+          <w:sz w:val="21"/>
+        </w:rPr>
+        <w:t xml:space="preserve">=0.866）。按诊断路径分层，胃镜异常、胃镜阴性且PPI试验阳性、胃镜阴性且PPI试验阴性者的症状改善率分别为84.6%（33/39，95%CI：70.3%~92.8%）、65.0%（26/40，95%CI：49.5%~77.9%）和54.2%（13/24，95%CI：35.1%~72.1%），呈梯度下降（Cochran-Armitage</w:t>
+      </w:r>
+      <w:r>
+        <w:rPr>
+          <w:rFonts w:ascii="Times New Roman" w:hAnsi="Times New Roman" w:cs="Times New Roman" w:eastAsia="宋体"/>
+          <w:sz w:val="21"/>
+        </w:rPr>
+        <w:t xml:space="preserve"> </w:t>
+      </w:r>
+      <w:r>
+        <w:rPr>
+          <w:rFonts w:ascii="Times New Roman" w:hAnsi="Times New Roman" w:cs="Times New Roman" w:eastAsia="宋体"/>
+          <w:i/>
+          <w:iCs/>
+          <w:sz w:val="21"/>
+        </w:rPr>
+        <w:t xml:space="preserve">Z</w:t>
+      </w:r>
+      <w:r>
+        <w:rPr>
+          <w:rFonts w:hint="eastAsia" w:ascii="Times New Roman" w:hAnsi="Times New Roman" w:cs="Times New Roman" w:eastAsia="宋体"/>
+          <w:sz w:val="21"/>
+        </w:rPr>
+        <w:t xml:space="preserve">=2.66，</w:t>
+      </w:r>
+      <w:r>
+        <w:rPr>
+          <w:rFonts w:ascii="Times New Roman" w:hAnsi="Times New Roman" w:cs="Times New Roman" w:eastAsia="宋体"/>
+          <w:i/>
+          <w:iCs/>
+          <w:sz w:val="21"/>
+        </w:rPr>
+        <w:t xml:space="preserve">P</w:t>
+      </w:r>
+      <w:r>
+        <w:rPr>
+          <w:rFonts w:hint="eastAsia" w:ascii="Times New Roman" w:hAnsi="Times New Roman" w:cs="Times New Roman" w:eastAsia="宋体"/>
+          <w:sz w:val="21"/>
+        </w:rPr>
+        <w:t xml:space="preserve">=0.008）。在胃镜阴性的64例中，PPI试验结果与4周症状改善的一致率为57.8%，κ=0.11（95%CI：−0.15~0.36）：PPI试验阳性的40例中14例4周时未改善，PPI试验阴性的24例中13例4周时改善。见表5、图4、图7。</w:t>
       </w:r>
     </w:p>
     <w:p>
@@ -7933,7 +8159,7 @@
           <w:bCs/>
           <w:sz w:val="18"/>
         </w:rPr>
-        <w:t xml:space="preserve">表4</w:t>
+        <w:t xml:space="preserve">表5</w:t>
       </w:r>
       <w:r>
         <w:rPr>
@@ -8477,261 +8703,7 @@
                 <w:rFonts w:hint="eastAsia" w:ascii="Times New Roman" w:hAnsi="Times New Roman" w:cs="Times New Roman" w:eastAsia="宋体"/>
                 <w:sz w:val="18"/>
               </w:rPr>
-              <w:t xml:space="preserve">4GerdQ下降≥3分［例（%）］</w:t>
-            </w:r>
-          </w:p>
-        </w:tc>
-        <w:tc>
-          <w:tcPr>
-            <w:tcW w:type="dxa" w:w="2449"/>
-          </w:tcPr>
-          <w:p>
-            <w:pPr>
-              <w:pStyle w:val="Compact"/>
-              <w:spacing w:line="276" w:lineRule="auto" w:after="0"/>
-              <w:ind w:firstLine="0" w:left="0"/>
-              <w:jc w:val="center"/>
-            </w:pPr>
-            <w:r>
-              <w:rPr>
-                <w:rFonts w:hint="eastAsia" w:ascii="Times New Roman" w:hAnsi="Times New Roman" w:cs="Times New Roman" w:eastAsia="宋体"/>
-                <w:sz w:val="18"/>
-                <w:highlight w:val="yellow"/>
-              </w:rPr>
-              <w:t xml:space="preserve">【</w:t>
-            </w:r>
-            <w:r>
-              <w:rPr>
-                <w:rFonts w:hint="eastAsia" w:ascii="Times New Roman" w:hAnsi="Times New Roman" w:cs="Times New Roman" w:eastAsia="宋体"/>
-                <w:sz w:val="18"/>
-                <w:highlight w:val="yellow"/>
-              </w:rPr>
-              <w:t xml:space="preserve">作者补充</w:t>
-            </w:r>
-            <w:r>
-              <w:rPr>
-                <w:rFonts w:hint="eastAsia" w:ascii="Times New Roman" w:hAnsi="Times New Roman" w:cs="Times New Roman" w:eastAsia="宋体"/>
-                <w:sz w:val="18"/>
-                <w:highlight w:val="yellow"/>
-              </w:rPr>
-              <w:t xml:space="preserve">】</w:t>
-            </w:r>
-          </w:p>
-        </w:tc>
-        <w:tc>
-          <w:tcPr>
-            <w:tcW w:type="dxa" w:w="3301"/>
-          </w:tcPr>
-          <w:p>
-            <w:pPr>
-              <w:pStyle w:val="Compact"/>
-              <w:spacing w:line="276" w:lineRule="auto" w:after="0"/>
-              <w:ind w:firstLine="0" w:left="0"/>
-              <w:jc w:val="center"/>
-            </w:pPr>
-            <w:r>
-              <w:rPr>
-                <w:rFonts w:hint="eastAsia" w:ascii="Times New Roman" w:hAnsi="Times New Roman" w:cs="Times New Roman" w:eastAsia="宋体"/>
-                <w:sz w:val="18"/>
-                <w:highlight w:val="yellow"/>
-              </w:rPr>
-              <w:t xml:space="preserve">【</w:t>
-            </w:r>
-            <w:r>
-              <w:rPr>
-                <w:rFonts w:hint="eastAsia" w:ascii="Times New Roman" w:hAnsi="Times New Roman" w:cs="Times New Roman" w:eastAsia="宋体"/>
-                <w:sz w:val="18"/>
-                <w:highlight w:val="yellow"/>
-              </w:rPr>
-              <w:t xml:space="preserve">作者补充</w:t>
-            </w:r>
-            <w:r>
-              <w:rPr>
-                <w:rFonts w:hint="eastAsia" w:ascii="Times New Roman" w:hAnsi="Times New Roman" w:cs="Times New Roman" w:eastAsia="宋体"/>
-                <w:sz w:val="18"/>
-                <w:highlight w:val="yellow"/>
-              </w:rPr>
-              <w:t xml:space="preserve">】</w:t>
-            </w:r>
-          </w:p>
-        </w:tc>
-      </w:tr>
-      <w:tr>
-        <w:tc>
-          <w:tcPr>
-            <w:tcW w:type="dxa" w:w="2981"/>
-          </w:tcPr>
-          <w:p>
-            <w:pPr>
-              <w:pStyle w:val="Compact"/>
-              <w:spacing w:line="276" w:lineRule="auto" w:after="0"/>
-              <w:ind w:firstLine="0" w:left="0"/>
-              <w:jc w:val="center"/>
-            </w:pPr>
-            <w:r>
-              <w:rPr>
-                <w:rFonts w:hint="eastAsia" w:ascii="Times New Roman" w:hAnsi="Times New Roman" w:cs="Times New Roman" w:eastAsia="宋体"/>
-                <w:sz w:val="18"/>
-              </w:rPr>
-              <w:t xml:space="preserve">第1、2、5、6条均≤1分［例（%）］</w:t>
-            </w:r>
-          </w:p>
-        </w:tc>
-        <w:tc>
-          <w:tcPr>
-            <w:tcW w:type="dxa" w:w="2449"/>
-          </w:tcPr>
-          <w:p>
-            <w:pPr>
-              <w:pStyle w:val="Compact"/>
-              <w:spacing w:line="276" w:lineRule="auto" w:after="0"/>
-              <w:ind w:firstLine="0" w:left="0"/>
-              <w:jc w:val="center"/>
-            </w:pPr>
-            <w:r>
-              <w:rPr>
-                <w:rFonts w:hint="eastAsia" w:ascii="Times New Roman" w:hAnsi="Times New Roman" w:cs="Times New Roman" w:eastAsia="宋体"/>
-                <w:sz w:val="18"/>
-                <w:highlight w:val="yellow"/>
-              </w:rPr>
-              <w:t xml:space="preserve">【</w:t>
-            </w:r>
-            <w:r>
-              <w:rPr>
-                <w:rFonts w:hint="eastAsia" w:ascii="Times New Roman" w:hAnsi="Times New Roman" w:cs="Times New Roman" w:eastAsia="宋体"/>
-                <w:sz w:val="18"/>
-                <w:highlight w:val="yellow"/>
-              </w:rPr>
-              <w:t xml:space="preserve">作者补充</w:t>
-            </w:r>
-            <w:r>
-              <w:rPr>
-                <w:rFonts w:hint="eastAsia" w:ascii="Times New Roman" w:hAnsi="Times New Roman" w:cs="Times New Roman" w:eastAsia="宋体"/>
-                <w:sz w:val="18"/>
-                <w:highlight w:val="yellow"/>
-              </w:rPr>
-              <w:t xml:space="preserve">】</w:t>
-            </w:r>
-          </w:p>
-        </w:tc>
-        <w:tc>
-          <w:tcPr>
-            <w:tcW w:type="dxa" w:w="3301"/>
-          </w:tcPr>
-          <w:p>
-            <w:pPr>
-              <w:pStyle w:val="Compact"/>
-              <w:spacing w:line="276" w:lineRule="auto" w:after="0"/>
-              <w:ind w:firstLine="0" w:left="0"/>
-              <w:jc w:val="center"/>
-            </w:pPr>
-            <w:r>
-              <w:rPr>
-                <w:rFonts w:hint="eastAsia" w:ascii="Times New Roman" w:hAnsi="Times New Roman" w:cs="Times New Roman" w:eastAsia="宋体"/>
-                <w:sz w:val="18"/>
-                <w:highlight w:val="yellow"/>
-              </w:rPr>
-              <w:t xml:space="preserve">【</w:t>
-            </w:r>
-            <w:r>
-              <w:rPr>
-                <w:rFonts w:hint="eastAsia" w:ascii="Times New Roman" w:hAnsi="Times New Roman" w:cs="Times New Roman" w:eastAsia="宋体"/>
-                <w:sz w:val="18"/>
-                <w:highlight w:val="yellow"/>
-              </w:rPr>
-              <w:t xml:space="preserve">作者补充</w:t>
-            </w:r>
-            <w:r>
-              <w:rPr>
-                <w:rFonts w:hint="eastAsia" w:ascii="Times New Roman" w:hAnsi="Times New Roman" w:cs="Times New Roman" w:eastAsia="宋体"/>
-                <w:sz w:val="18"/>
-                <w:highlight w:val="yellow"/>
-              </w:rPr>
-              <w:t xml:space="preserve">】</w:t>
-            </w:r>
-          </w:p>
-        </w:tc>
-      </w:tr>
-      <w:tr>
-        <w:tc>
-          <w:tcPr>
-            <w:tcW w:type="dxa" w:w="2981"/>
-          </w:tcPr>
-          <w:p>
-            <w:pPr>
-              <w:pStyle w:val="Compact"/>
-              <w:spacing w:line="276" w:lineRule="auto" w:after="0"/>
-              <w:ind w:firstLine="0" w:left="0"/>
-              <w:jc w:val="center"/>
-            </w:pPr>
-            <w:r>
-              <w:rPr>
-                <w:rFonts w:hint="eastAsia" w:ascii="Times New Roman" w:hAnsi="Times New Roman" w:cs="Times New Roman" w:eastAsia="宋体"/>
-                <w:sz w:val="18"/>
-              </w:rPr>
-              <w:t xml:space="preserve">治疗后4GerdQ≤1分［例（%）］</w:t>
-            </w:r>
-          </w:p>
-        </w:tc>
-        <w:tc>
-          <w:tcPr>
-            <w:tcW w:type="dxa" w:w="2449"/>
-          </w:tcPr>
-          <w:p>
-            <w:pPr>
-              <w:pStyle w:val="Compact"/>
-              <w:spacing w:line="276" w:lineRule="auto" w:after="0"/>
-              <w:ind w:firstLine="0" w:left="0"/>
-              <w:jc w:val="center"/>
-            </w:pPr>
-            <w:r>
-              <w:rPr>
-                <w:rFonts w:hint="eastAsia" w:ascii="Times New Roman" w:hAnsi="Times New Roman" w:cs="Times New Roman" w:eastAsia="宋体"/>
-                <w:sz w:val="18"/>
-              </w:rPr>
-              <w:t xml:space="preserve">8（7.8）</w:t>
-            </w:r>
-          </w:p>
-        </w:tc>
-        <w:tc>
-          <w:tcPr>
-            <w:tcW w:type="dxa" w:w="3301"/>
-          </w:tcPr>
-          <w:p>
-            <w:pPr>
-              <w:pStyle w:val="Compact"/>
-              <w:spacing w:line="276" w:lineRule="auto" w:after="0"/>
-              <w:ind w:firstLine="0" w:left="0"/>
-              <w:jc w:val="center"/>
-            </w:pPr>
-            <w:r>
-              <w:rPr>
-                <w:rFonts w:hint="eastAsia" w:ascii="Times New Roman" w:hAnsi="Times New Roman" w:cs="Times New Roman" w:eastAsia="宋体"/>
-                <w:sz w:val="18"/>
-              </w:rPr>
-              <w:t xml:space="preserve">95%CI：4.0%~14.6%</w:t>
-            </w:r>
-          </w:p>
-        </w:tc>
-      </w:tr>
-      <w:tr>
-        <w:tc>
-          <w:tcPr>
-            <w:tcW w:type="dxa" w:w="2981"/>
-          </w:tcPr>
-          <w:p>
-            <w:pPr>
-              <w:pStyle w:val="Compact"/>
-              <w:spacing w:line="276" w:lineRule="auto" w:after="0"/>
-              <w:ind w:firstLine="0" w:left="0"/>
-              <w:jc w:val="center"/>
-            </w:pPr>
-            <w:r>
-              <w:rPr>
-                <w:rFonts w:hint="eastAsia" w:ascii="Times New Roman" w:hAnsi="Times New Roman" w:cs="Times New Roman" w:eastAsia="宋体"/>
-                <w:sz w:val="18"/>
-              </w:rPr>
-              <w:t xml:space="preserve">GerdQ总分（治疗前→治疗后，分，</w:t>
+              <w:t xml:space="preserve">改善者4GerdQ下降值（分，</w:t>
             </w:r>
             <m:oMath>
               <m:acc>
@@ -8786,7 +8758,7 @@
                 <w:rFonts w:ascii="Times New Roman" w:hAnsi="Times New Roman" w:cs="Times New Roman" w:eastAsia="宋体"/>
                 <w:sz w:val="18"/>
               </w:rPr>
-              <w:t xml:space="preserve">10.06±2.02→8.36±2.40</w:t>
+              <w:t xml:space="preserve">2.36±1.52</w:t>
             </w:r>
           </w:p>
         </w:tc>
@@ -8806,30 +8778,7 @@
                 <w:rFonts w:ascii="Times New Roman" w:hAnsi="Times New Roman" w:cs="Times New Roman" w:eastAsia="宋体"/>
                 <w:sz w:val="18"/>
               </w:rPr>
-              <w:t xml:space="preserve">Wilcoxon</w:t>
-            </w:r>
-            <w:r>
-              <w:rPr>
-                <w:rFonts w:ascii="Times New Roman" w:hAnsi="Times New Roman" w:cs="Times New Roman" w:eastAsia="宋体"/>
-                <w:sz w:val="18"/>
-              </w:rPr>
-              <w:t xml:space="preserve"> </w:t>
-            </w:r>
-            <w:r>
-              <w:rPr>
-                <w:rFonts w:ascii="Times New Roman" w:hAnsi="Times New Roman" w:cs="Times New Roman" w:eastAsia="宋体"/>
-                <w:i/>
-                <w:iCs/>
-                <w:sz w:val="18"/>
-              </w:rPr>
-              <w:t xml:space="preserve">P</w:t>
-            </w:r>
-            <w:r>
-              <w:rPr>
-                <w:rFonts w:ascii="Times New Roman" w:hAnsi="Times New Roman" w:cs="Times New Roman" w:eastAsia="宋体"/>
-                <w:sz w:val="18"/>
-              </w:rPr>
-              <w:t xml:space="preserve">&lt;0.001</w:t>
+              <w:t xml:space="preserve">—</w:t>
             </w:r>
           </w:p>
         </w:tc>
@@ -8851,7 +8800,131 @@
                 <w:rFonts w:hint="eastAsia" w:ascii="Times New Roman" w:hAnsi="Times New Roman" w:cs="Times New Roman" w:eastAsia="宋体"/>
                 <w:sz w:val="18"/>
               </w:rPr>
-              <w:t xml:space="preserve">减重幅度（kg，</w:t>
+              <w:t xml:space="preserve">治疗后4GerdQ≤1分［例（%）］</w:t>
+            </w:r>
+          </w:p>
+        </w:tc>
+        <w:tc>
+          <w:tcPr>
+            <w:tcW w:type="dxa" w:w="2449"/>
+          </w:tcPr>
+          <w:p>
+            <w:pPr>
+              <w:pStyle w:val="Compact"/>
+              <w:spacing w:line="276" w:lineRule="auto" w:after="0"/>
+              <w:ind w:firstLine="0" w:left="0"/>
+              <w:jc w:val="center"/>
+            </w:pPr>
+            <w:r>
+              <w:rPr>
+                <w:rFonts w:hint="eastAsia" w:ascii="Times New Roman" w:hAnsi="Times New Roman" w:cs="Times New Roman" w:eastAsia="宋体"/>
+                <w:sz w:val="18"/>
+              </w:rPr>
+              <w:t xml:space="preserve">8（7.8）</w:t>
+            </w:r>
+          </w:p>
+        </w:tc>
+        <w:tc>
+          <w:tcPr>
+            <w:tcW w:type="dxa" w:w="3301"/>
+          </w:tcPr>
+          <w:p>
+            <w:pPr>
+              <w:pStyle w:val="Compact"/>
+              <w:spacing w:line="276" w:lineRule="auto" w:after="0"/>
+              <w:ind w:firstLine="0" w:left="0"/>
+              <w:jc w:val="center"/>
+            </w:pPr>
+            <w:r>
+              <w:rPr>
+                <w:rFonts w:hint="eastAsia" w:ascii="Times New Roman" w:hAnsi="Times New Roman" w:cs="Times New Roman" w:eastAsia="宋体"/>
+                <w:sz w:val="18"/>
+              </w:rPr>
+              <w:t xml:space="preserve">95%CI：4.0%~14.6%</w:t>
+            </w:r>
+          </w:p>
+        </w:tc>
+      </w:tr>
+      <w:tr>
+        <w:tc>
+          <w:tcPr>
+            <w:tcW w:type="dxa" w:w="2981"/>
+          </w:tcPr>
+          <w:p>
+            <w:pPr>
+              <w:pStyle w:val="Compact"/>
+              <w:spacing w:line="276" w:lineRule="auto" w:after="0"/>
+              <w:ind w:firstLine="0" w:left="0"/>
+              <w:jc w:val="center"/>
+            </w:pPr>
+            <w:r>
+              <w:rPr>
+                <w:rFonts w:hint="eastAsia" w:ascii="Times New Roman" w:hAnsi="Times New Roman" w:cs="Times New Roman" w:eastAsia="宋体"/>
+                <w:sz w:val="18"/>
+              </w:rPr>
+              <w:t xml:space="preserve">上腹痛+恶心条目合计（治疗前→治疗后，分）</w:t>
+            </w:r>
+          </w:p>
+        </w:tc>
+        <w:tc>
+          <w:tcPr>
+            <w:tcW w:type="dxa" w:w="2449"/>
+          </w:tcPr>
+          <w:p>
+            <w:pPr>
+              <w:pStyle w:val="Compact"/>
+              <w:spacing w:line="276" w:lineRule="auto" w:after="0"/>
+              <w:ind w:firstLine="0" w:left="0"/>
+              <w:jc w:val="center"/>
+            </w:pPr>
+            <w:r>
+              <w:rPr>
+                <w:rFonts w:ascii="Times New Roman" w:hAnsi="Times New Roman" w:cs="Times New Roman" w:eastAsia="宋体"/>
+                <w:sz w:val="18"/>
+              </w:rPr>
+              <w:t xml:space="preserve">3.95→3.90</w:t>
+            </w:r>
+          </w:p>
+        </w:tc>
+        <w:tc>
+          <w:tcPr>
+            <w:tcW w:type="dxa" w:w="3301"/>
+          </w:tcPr>
+          <w:p>
+            <w:pPr>
+              <w:pStyle w:val="Compact"/>
+              <w:spacing w:line="276" w:lineRule="auto" w:after="0"/>
+              <w:ind w:firstLine="0" w:left="0"/>
+              <w:jc w:val="center"/>
+            </w:pPr>
+            <w:r>
+              <w:rPr>
+                <w:rFonts w:ascii="Times New Roman" w:hAnsi="Times New Roman" w:cs="Times New Roman" w:eastAsia="宋体"/>
+                <w:sz w:val="18"/>
+              </w:rPr>
+              <w:t xml:space="preserve">—</w:t>
+            </w:r>
+          </w:p>
+        </w:tc>
+      </w:tr>
+      <w:tr>
+        <w:tc>
+          <w:tcPr>
+            <w:tcW w:type="dxa" w:w="2981"/>
+          </w:tcPr>
+          <w:p>
+            <w:pPr>
+              <w:pStyle w:val="Compact"/>
+              <w:spacing w:line="276" w:lineRule="auto" w:after="0"/>
+              <w:ind w:firstLine="0" w:left="0"/>
+              <w:jc w:val="center"/>
+            </w:pPr>
+            <w:r>
+              <w:rPr>
+                <w:rFonts w:hint="eastAsia" w:ascii="Times New Roman" w:hAnsi="Times New Roman" w:cs="Times New Roman" w:eastAsia="宋体"/>
+                <w:sz w:val="18"/>
+              </w:rPr>
+              <w:t xml:space="preserve">GerdQ总分（治疗前→治疗后，分，</w:t>
             </w:r>
             <m:oMath>
               <m:acc>
@@ -8906,6 +8979,126 @@
                 <w:rFonts w:ascii="Times New Roman" w:hAnsi="Times New Roman" w:cs="Times New Roman" w:eastAsia="宋体"/>
                 <w:sz w:val="18"/>
               </w:rPr>
+              <w:t xml:space="preserve">10.06±2.02→8.36±2.40</w:t>
+            </w:r>
+          </w:p>
+        </w:tc>
+        <w:tc>
+          <w:tcPr>
+            <w:tcW w:type="dxa" w:w="3301"/>
+          </w:tcPr>
+          <w:p>
+            <w:pPr>
+              <w:pStyle w:val="Compact"/>
+              <w:spacing w:line="276" w:lineRule="auto" w:after="0"/>
+              <w:ind w:firstLine="0" w:left="0"/>
+              <w:jc w:val="center"/>
+            </w:pPr>
+            <w:r>
+              <w:rPr>
+                <w:rFonts w:ascii="Times New Roman" w:hAnsi="Times New Roman" w:cs="Times New Roman" w:eastAsia="宋体"/>
+                <w:sz w:val="18"/>
+              </w:rPr>
+              <w:t xml:space="preserve">Wilcoxon</w:t>
+            </w:r>
+            <w:r>
+              <w:rPr>
+                <w:rFonts w:ascii="Times New Roman" w:hAnsi="Times New Roman" w:cs="Times New Roman" w:eastAsia="宋体"/>
+                <w:sz w:val="18"/>
+              </w:rPr>
+              <w:t xml:space="preserve"> </w:t>
+            </w:r>
+            <w:r>
+              <w:rPr>
+                <w:rFonts w:ascii="Times New Roman" w:hAnsi="Times New Roman" w:cs="Times New Roman" w:eastAsia="宋体"/>
+                <w:i/>
+                <w:iCs/>
+                <w:sz w:val="18"/>
+              </w:rPr>
+              <w:t xml:space="preserve">P</w:t>
+            </w:r>
+            <w:r>
+              <w:rPr>
+                <w:rFonts w:ascii="Times New Roman" w:hAnsi="Times New Roman" w:cs="Times New Roman" w:eastAsia="宋体"/>
+                <w:sz w:val="18"/>
+              </w:rPr>
+              <w:t xml:space="preserve">&lt;0.001</w:t>
+            </w:r>
+          </w:p>
+        </w:tc>
+      </w:tr>
+      <w:tr>
+        <w:tc>
+          <w:tcPr>
+            <w:tcW w:type="dxa" w:w="2981"/>
+          </w:tcPr>
+          <w:p>
+            <w:pPr>
+              <w:pStyle w:val="Compact"/>
+              <w:spacing w:line="276" w:lineRule="auto" w:after="0"/>
+              <w:ind w:firstLine="0" w:left="0"/>
+              <w:jc w:val="center"/>
+            </w:pPr>
+            <w:r>
+              <w:rPr>
+                <w:rFonts w:hint="eastAsia" w:ascii="Times New Roman" w:hAnsi="Times New Roman" w:cs="Times New Roman" w:eastAsia="宋体"/>
+                <w:sz w:val="18"/>
+              </w:rPr>
+              <w:t xml:space="preserve">减重幅度（kg，</w:t>
+            </w:r>
+            <m:oMath>
+              <m:acc>
+                <m:accPr>
+                  <m:chr m:val="‾"/>
+                </m:accPr>
+                <m:e>
+                  <m:r>
+                    <m:t>x</m:t>
+                  </m:r>
+                </m:e>
+              </m:acc>
+            </m:oMath>
+            <w:r>
+              <w:rPr>
+                <w:rFonts w:ascii="Times New Roman" w:hAnsi="Times New Roman" w:cs="Times New Roman" w:eastAsia="宋体"/>
+                <w:sz w:val="18"/>
+              </w:rPr>
+              <w:t xml:space="preserve">±</w:t>
+            </w:r>
+            <w:r>
+              <w:rPr>
+                <w:rFonts w:ascii="Times New Roman" w:hAnsi="Times New Roman" w:cs="Times New Roman" w:eastAsia="宋体"/>
+                <w:i/>
+                <w:iCs/>
+                <w:sz w:val="18"/>
+              </w:rPr>
+              <w:t xml:space="preserve">s</w:t>
+            </w:r>
+            <w:r>
+              <w:rPr>
+                <w:rFonts w:hint="eastAsia" w:ascii="Times New Roman" w:hAnsi="Times New Roman" w:cs="Times New Roman" w:eastAsia="宋体"/>
+                <w:sz w:val="18"/>
+              </w:rPr>
+              <w:t xml:space="preserve">）</w:t>
+            </w:r>
+          </w:p>
+        </w:tc>
+        <w:tc>
+          <w:tcPr>
+            <w:tcW w:type="dxa" w:w="2449"/>
+          </w:tcPr>
+          <w:p>
+            <w:pPr>
+              <w:pStyle w:val="Compact"/>
+              <w:spacing w:line="276" w:lineRule="auto" w:after="0"/>
+              <w:ind w:firstLine="0" w:left="0"/>
+              <w:jc w:val="center"/>
+            </w:pPr>
+            <w:r>
+              <w:rPr>
+                <w:rFonts w:ascii="Times New Roman" w:hAnsi="Times New Roman" w:cs="Times New Roman" w:eastAsia="宋体"/>
+                <w:sz w:val="18"/>
+              </w:rPr>
               <w:t xml:space="preserve">1.62±1.22</w:t>
             </w:r>
           </w:p>
@@ -9046,7 +9239,7 @@
           <w:rFonts w:hint="eastAsia" w:ascii="Times New Roman" w:hAnsi="Times New Roman" w:cs="Times New Roman" w:eastAsia="宋体"/>
           <w:sz w:val="21"/>
         </w:rPr>
-        <w:t xml:space="preserve">&gt;0.05）。见表5。</w:t>
+        <w:t xml:space="preserve">&gt;0.05）。见表6。</w:t>
       </w:r>
     </w:p>
     <w:p>
@@ -9062,7 +9255,7 @@
           <w:bCs/>
           <w:sz w:val="18"/>
         </w:rPr>
-        <w:t xml:space="preserve">表5</w:t>
+        <w:t xml:space="preserve">表6</w:t>
       </w:r>
       <w:r>
         <w:rPr>
@@ -10810,7 +11003,7 @@
           <w:rFonts w:hint="eastAsia" w:ascii="Times New Roman" w:hAnsi="Times New Roman" w:cs="Times New Roman" w:eastAsia="宋体"/>
           <w:sz w:val="21"/>
         </w:rPr>
-        <w:t xml:space="preserve">=0.029）。剔除基线4GerdQ后结果不变。以4GerdQ下降≥3分为结局时，最终模型保留减重幅度和基线4GerdQ。见表6、图5。</w:t>
+        <w:t xml:space="preserve">=0.029）。剔除基线4GerdQ后结果不变。以4GerdQ下降≥3分为结局时，最终模型保留减重幅度和基线4GerdQ。见表7、图5。</w:t>
       </w:r>
     </w:p>
     <w:p>
@@ -10826,7 +11019,7 @@
           <w:bCs/>
           <w:sz w:val="18"/>
         </w:rPr>
-        <w:t xml:space="preserve">表6</w:t>
+        <w:t xml:space="preserve">表7</w:t>
       </w:r>
       <w:r>
         <w:rPr>
@@ -11511,7 +11704,7 @@
           <w:rFonts w:hint="eastAsia" w:ascii="Times New Roman" w:hAnsi="Times New Roman" w:cs="Times New Roman" w:eastAsia="宋体"/>
           <w:sz w:val="21"/>
         </w:rPr>
-        <w:t xml:space="preserve">。因此，GerdQ在本人群中宜作为症状评估和随访工具，而不宜单独用于诊断或排除GERD，临床上仍需结合内镜检查及有条件时的反流监测综合判断</w:t>
+        <w:t xml:space="preserve">。分层似然比分析进一步显示，GerdQ的诊断信息主要集中在两端：7分者GERD可能性明显降低（似然比0.22），≥10分者升高（似然比2.13），而8~9分区间的似然比接近1，基本不改变验前概率。这正是≥8分界值在本组特异度偏低的原因——该界值将信息量很少的8~9分患者全部判为阳性。此外，GerdQ≥10分的比例在胃镜异常者中最高，在胃镜阴性且PPI试验阴性者中最低，而在确诊路径相同的胃镜阴性亚组中，GerdQ识别PPI试验阳性的能力较弱，提示全人群AUC中有相当部分来自胃镜异常者的高评分。因此，GerdQ在本人群中宜作为症状评估和随访工具，可按≤7分、8~9分和≥10分分层解读，而不宜单独用于诊断或排除GERD，临床上仍需结合内镜检查及有条件时的反流监测综合判断</w:t>
       </w:r>
       <w:r>
         <w:rPr>
@@ -11523,10 +11716,10 @@
       </w:r>
       <w:r>
         <w:rPr>
-          <w:rFonts w:ascii="Times New Roman" w:hAnsi="Times New Roman" w:cs="Times New Roman" w:eastAsia="宋体"/>
-          <w:sz w:val="21"/>
-        </w:rPr>
-        <w:t xml:space="preserve">。</w:t>
+          <w:rFonts w:hint="eastAsia" w:ascii="Times New Roman" w:hAnsi="Times New Roman" w:cs="Times New Roman" w:eastAsia="宋体"/>
+          <w:sz w:val="21"/>
+        </w:rPr>
+        <w:t xml:space="preserve">。由于入组要求GerdQ≥7分，7分组仅12例，上述分层似然比的估计精度有限，需在纳入低分患者的人群中验证。</w:t>
       </w:r>
     </w:p>
     <w:p>
@@ -11583,54 +11776,7 @@
           <w:rFonts w:hint="eastAsia" w:ascii="Times New Roman" w:hAnsi="Times New Roman" w:cs="Times New Roman" w:eastAsia="宋体"/>
           <w:sz w:val="21"/>
         </w:rPr>
-        <w:t xml:space="preserve">，客观黏膜损伤比例可能更低</w:t>
-      </w:r>
-      <w:r>
-        <w:rPr>
-          <w:rFonts w:hint="eastAsia" w:ascii="Times New Roman" w:hAnsi="Times New Roman" w:cs="Times New Roman" w:eastAsia="宋体"/>
-          <w:sz w:val="21"/>
-          <w:highlight w:val="yellow"/>
-        </w:rPr>
-        <w:t xml:space="preserve">【</w:t>
-      </w:r>
-      <w:r>
-        <w:rPr>
-          <w:rFonts w:hint="eastAsia" w:ascii="Times New Roman" w:hAnsi="Times New Roman" w:cs="Times New Roman" w:eastAsia="宋体"/>
-          <w:sz w:val="21"/>
-          <w:highlight w:val="yellow"/>
-        </w:rPr>
-        <w:t xml:space="preserve">作者补充LA</w:t>
-      </w:r>
-      <w:r>
-        <w:rPr>
-          <w:rFonts w:ascii="Times New Roman" w:hAnsi="Times New Roman" w:cs="Times New Roman" w:eastAsia="宋体"/>
-          <w:sz w:val="21"/>
-          <w:highlight w:val="yellow"/>
-        </w:rPr>
-        <w:t xml:space="preserve"> </w:t>
-      </w:r>
-      <w:r>
-        <w:rPr>
-          <w:rFonts w:hint="eastAsia" w:ascii="Times New Roman" w:hAnsi="Times New Roman" w:cs="Times New Roman" w:eastAsia="宋体"/>
-          <w:sz w:val="21"/>
-          <w:highlight w:val="yellow"/>
-        </w:rPr>
-        <w:t xml:space="preserve">B~D级例数后据实修改</w:t>
-      </w:r>
-      <w:r>
-        <w:rPr>
-          <w:rFonts w:hint="eastAsia" w:ascii="Times New Roman" w:hAnsi="Times New Roman" w:cs="Times New Roman" w:eastAsia="宋体"/>
-          <w:sz w:val="21"/>
-          <w:highlight w:val="yellow"/>
-        </w:rPr>
-        <w:t xml:space="preserve">】</w:t>
-      </w:r>
-      <w:r>
-        <w:rPr>
-          <w:rFonts w:hint="eastAsia" w:ascii="Times New Roman" w:hAnsi="Times New Roman" w:cs="Times New Roman" w:eastAsia="宋体"/>
-          <w:sz w:val="21"/>
-        </w:rPr>
-        <w:t xml:space="preserve">。症状负荷与黏膜损伤不一致，一方面与入组标准导致的症状富集有关，另一方面也提示部分患者可能存在非糜烂性反流病、反流高敏感或功能性烧心，需要反流监测加以区分</w:t>
+        <w:t xml:space="preserve">，客观黏膜损伤比例可能更低，但本研究未分别记录各级别例数，无法据此进行敏感性分析。症状负荷与黏膜损伤不一致，一方面与入组标准导致的症状富集有关，另一方面也提示部分患者可能存在非糜烂性反流病、反流高敏感或功能性烧心，需要反流监测加以区分</w:t>
       </w:r>
       <w:r>
         <w:rPr>
@@ -11689,38 +11835,7 @@
           <w:rFonts w:hint="eastAsia" w:ascii="Times New Roman" w:hAnsi="Times New Roman" w:cs="Times New Roman" w:eastAsia="宋体"/>
           <w:sz w:val="21"/>
         </w:rPr>
-        <w:t xml:space="preserve">采用治疗后第1、2、5、6条得分均≤1分作为症状充分缓解标准，按此标准本研究的缓解率为</w:t>
-      </w:r>
-      <w:r>
-        <w:rPr>
-          <w:rFonts w:hint="eastAsia" w:ascii="Times New Roman" w:hAnsi="Times New Roman" w:cs="Times New Roman" w:eastAsia="宋体"/>
-          <w:sz w:val="21"/>
-          <w:highlight w:val="yellow"/>
-        </w:rPr>
-        <w:t xml:space="preserve">【</w:t>
-      </w:r>
-      <w:r>
-        <w:rPr>
-          <w:rFonts w:hint="eastAsia" w:ascii="Times New Roman" w:hAnsi="Times New Roman" w:cs="Times New Roman" w:eastAsia="宋体"/>
-          <w:sz w:val="21"/>
-          <w:highlight w:val="yellow"/>
-        </w:rPr>
-        <w:t xml:space="preserve">作者补充</w:t>
-      </w:r>
-      <w:r>
-        <w:rPr>
-          <w:rFonts w:hint="eastAsia" w:ascii="Times New Roman" w:hAnsi="Times New Roman" w:cs="Times New Roman" w:eastAsia="宋体"/>
-          <w:sz w:val="21"/>
-          <w:highlight w:val="yellow"/>
-        </w:rPr>
-        <w:t xml:space="preserve">】</w:t>
-      </w:r>
-      <w:r>
-        <w:rPr>
-          <w:rFonts w:hint="eastAsia" w:ascii="Times New Roman" w:hAnsi="Times New Roman" w:cs="Times New Roman" w:eastAsia="宋体"/>
-          <w:sz w:val="21"/>
-        </w:rPr>
-        <w:t xml:space="preserve">。治疗后4GerdQ≤1分者仅7.8%，提示多数患者仍有残余症状，这与约半数疑似GERD患者对抑酸治疗反应不佳的报道相符</w:t>
+        <w:t xml:space="preserve">采用治疗后第1、2、5、6条得分均≤1分作为症状充分缓解标准，本研究未记录治疗后各条目得分，无法按此标准评价。治疗后4GerdQ≤1分者仅7.8%，提示多数患者仍有残余症状，这与约半数疑似GERD患者对抑酸治疗反应不佳的报道相符</w:t>
       </w:r>
       <w:r>
         <w:rPr>
@@ -11732,10 +11847,10 @@
       </w:r>
       <w:r>
         <w:rPr>
-          <w:rFonts w:ascii="Times New Roman" w:hAnsi="Times New Roman" w:cs="Times New Roman" w:eastAsia="宋体"/>
-          <w:sz w:val="21"/>
-        </w:rPr>
-        <w:t xml:space="preserve">。</w:t>
+          <w:rFonts w:hint="eastAsia" w:ascii="Times New Roman" w:hAnsi="Times New Roman" w:cs="Times New Roman" w:eastAsia="宋体"/>
+          <w:sz w:val="21"/>
+        </w:rPr>
+        <w:t xml:space="preserve">。另一方面，GerdQ总分的下降几乎全部来自4个阳性预测条目，上腹痛与恶心条目治疗前后基本不变，与这2个条目用于识别非反流症状的设计一致，也支持以4GerdQ而非总分评价疗效。</w:t>
       </w:r>
     </w:p>
     <w:p>
@@ -11845,7 +11960,23 @@
           <w:rFonts w:hint="eastAsia" w:ascii="Times New Roman" w:hAnsi="Times New Roman" w:cs="Times New Roman" w:eastAsia="宋体"/>
           <w:sz w:val="21"/>
         </w:rPr>
-        <w:t xml:space="preserve">kg，约占体重的2%），观察期仅4周，减重与饮食控制、运动及用药依从性同属联合干预，难以分离，减重与症状改善的关联可能部分反映依从性这一共同因素，也可能与饮食调整（如减少酥油茶、青稞酒摄入）的直接作用有关。减重幅度是治疗期间同步发生的变量，治疗开始前无法获得，因此不能用于治疗前预测疗效，本研究亦未据此构建预测模型。</w:t>
+        <w:t xml:space="preserve">kg，约占体重的2%），观察期仅4周，减重与饮食控制、运动及用药依从性同属联合干预，难以分离，减重与症状改善的关联可能部分反映依从性这一共同因素，也可能与饮食调整（如减少酥油茶、青稞酒摄入）的直接作用有关。E值分析显示，减重幅度</w:t>
+      </w:r>
+      <w:r>
+        <w:rPr>
+          <w:rFonts w:ascii="Times New Roman" w:hAnsi="Times New Roman" w:cs="Times New Roman" w:eastAsia="宋体"/>
+          <w:i/>
+          <w:iCs/>
+          <w:sz w:val="21"/>
+        </w:rPr>
+        <w:t xml:space="preserve">OR</w:t>
+      </w:r>
+      <w:r>
+        <w:rPr>
+          <w:rFonts w:hint="eastAsia" w:ascii="Times New Roman" w:hAnsi="Times New Roman" w:cs="Times New Roman" w:eastAsia="宋体"/>
+          <w:sz w:val="21"/>
+        </w:rPr>
+        <w:t xml:space="preserve">的95%CI下限对应的E值仅为1.38，即与减重和症状改善均存在约1.4倍关联的未测混杂因素即可使该关联失去统计学意义。减重幅度是治疗期间同步发生的变量，治疗开始前无法获得，因此不能用于治疗前预测疗效，本研究亦未据此构建预测模型。</w:t>
       </w:r>
     </w:p>
     <w:p>
@@ -11890,7 +12021,7 @@
           <w:rFonts w:hint="eastAsia" w:ascii="Times New Roman" w:hAnsi="Times New Roman" w:cs="Times New Roman" w:eastAsia="宋体"/>
           <w:sz w:val="21"/>
         </w:rPr>
-        <w:t xml:space="preserve">，单纯抑酸效果有限。GerdQ将上腹痛和恶心设为阴性预测条目，正是为了区分此类非反流症状</w:t>
+        <w:t xml:space="preserve">，单纯抑酸效果有限。按诊断路径分层后，症状改善率由胃镜异常者的84.6%依次降至胃镜阴性且PPI试验阳性者的65.0%和PPI试验阴性者的54.2%，呈梯度变化，支持上述解释。值得注意的是，PPI试验阴性者中仍有半数以上在4周时改善，且胃镜阴性者的PPI试验结果与4周症状改善几乎不一致（κ=0.11），可能与两次评价的工具或时间点不同、安慰剂效应和回归均值，以及4GerdQ下降≥1分这一标准较宽松有关，也提示单次PPI试验作为参考标准的可靠性有限。GerdQ将上腹痛和恶心设为阴性预测条目，正是为了区分此类非反流症状</w:t>
       </w:r>
       <w:r>
         <w:rPr>
@@ -11919,7 +12050,7 @@
           <w:rFonts w:hint="eastAsia" w:ascii="Times New Roman" w:hAnsi="Times New Roman" w:cs="Times New Roman" w:eastAsia="宋体"/>
           <w:sz w:val="21"/>
         </w:rPr>
-        <w:t xml:space="preserve">本研究存在以下局限性：（1）单中心、小样本观察性研究，重度肥胖组仅14例，未改善组仅31例，多因素模型事件数与候选变量数之比偏低，存在过拟合风险；（2）入组要求门诊GerdQ≥7分，存在谱偏倚，GerdQ阳性率不能外推为人群患病率；（3）复合参考标准中PPI试验特异度有限，胃镜阳性与阴性患者的确诊路径不同，且未行24</w:t>
+        <w:t xml:space="preserve">本研究存在以下局限性：（1）单中心、小样本观察性研究，重度肥胖组仅14例，未改善组仅31例，多因素模型事件数与候选变量数之比偏低，存在过拟合风险；（2）入组要求门诊GerdQ≥7分，存在谱偏倚，GerdQ阳性率不能外推为人群患病率；（3）复合参考标准中PPI试验特异度有限，且与4周症状改善的一致性差，胃镜阳性与阴性患者的确诊路径不同，未行24</w:t>
       </w:r>
       <w:r>
         <w:rPr>
@@ -11933,7 +12064,7 @@
           <w:rFonts w:hint="eastAsia" w:ascii="Times New Roman" w:hAnsi="Times New Roman" w:cs="Times New Roman" w:eastAsia="宋体"/>
           <w:sz w:val="21"/>
         </w:rPr>
-        <w:t xml:space="preserve">h食管pH-阻抗监测；（4）为无对照的单组前后比较，症状改善不能单独归因于PPI或减重，亦不能排除回归均值和安慰剂效应；（5）未量化饮食、运动及用药依从性；（6）缺乏平原地区或非肥胖对照组，无法评价高原暴露本身的作用。</w:t>
+        <w:t xml:space="preserve">h食管pH-阻抗监测，也未分别记录LA分级及食管裂孔疝例数；（4）为无对照的单组前后比较，症状改善不能单独归因于PPI或减重，亦不能排除回归均值和安慰剂效应；治疗后未记录各条目得分，无法按症状充分缓解标准评价疗效；（5）未量化饮食、运动及用药依从性；（6）缺乏平原地区或非肥胖对照组，无法评价高原暴露本身的作用；（7）未保存筛查及排除病例记录，无法评估选择偏倚的程度。</w:t>
       </w:r>
     </w:p>
     <w:bookmarkEnd w:id="22"/>
@@ -11973,7 +12104,7 @@
           <w:rFonts w:hint="eastAsia" w:ascii="Times New Roman" w:hAnsi="Times New Roman" w:cs="Times New Roman" w:eastAsia="宋体"/>
           <w:sz w:val="21"/>
         </w:rPr>
-        <w:t xml:space="preserve">在高原地区长期居住的肥胖伴反流症状就诊患者中，GerdQ总分对GERD的判别能力有限，≥8分界值特异度低，不宜单独作为诊断依据，可作为症状评估和随访的辅助工具。4周PPI联合减重管理后多数患者症状有所改善，但残余症状常见；治疗期减重幅度较大和胃镜异常与短期症状改善相关。上述结果尚需设立对照、采用反流监测和标准化疗效评价的多中心前瞻性研究验证。</w:t>
+        <w:t xml:space="preserve">在高原地区长期居住的肥胖伴反流症状就诊患者中，GerdQ总分对GERD的判别能力有限，≥8分界值特异度低，8~9分基本不提供诊断信息，不宜单独作为诊断依据，可作为症状评估和随访的辅助工具。4周PPI联合减重管理后多数患者症状有所改善，但残余症状常见；治疗期减重幅度较大和胃镜异常与短期症状改善相关，症状改善率按胃镜异常、胃镜阴性且PPI试验阳性、PPI试验阴性的顺序递减。上述结果尚需设立对照、采用反流监测和标准化疗效评价的多中心前瞻性研究验证。</w:t>
       </w:r>
     </w:p>
     <w:p>
@@ -12050,7 +12181,7 @@
       </w:r>
     </w:p>
     <w:bookmarkEnd w:id="23"/>
-    <w:bookmarkStart w:id="24" w:name="图题图件由作者按修改要求重新提交"/>
+    <w:bookmarkStart w:id="30" w:name="图题图件由作者按修改要求重新提交"/>
     <w:p>
       <w:pPr>
         <w:pStyle w:val="Heading2"/>
@@ -12334,8 +12465,208 @@
         <w:t xml:space="preserve">条形图）</w:t>
       </w:r>
     </w:p>
-    <w:bookmarkEnd w:id="24"/>
-    <w:bookmarkStart w:id="25" w:name="参考文献"/>
+    <w:p>
+      <w:pPr>
+        <w:pStyle w:val="BodyText"/>
+        <w:spacing w:line="360" w:lineRule="auto" w:after="60"/>
+      </w:pPr>
+      <w:r>
+        <w:rPr>
+          <w:rFonts w:ascii="Times New Roman" w:hAnsi="Times New Roman" w:cs="Times New Roman" w:eastAsia="宋体"/>
+          <w:sz w:val="21"/>
+        </w:rPr>
+        <w:drawing>
+          <wp:inline>
+            <wp:extent cx="5334000" cy="2133600"/>
+            <wp:effectExtent b="0" l="0" r="0" t="0"/>
+            <wp:docPr descr="" title="" id="25" name="Picture"/>
+            <a:graphic>
+              <a:graphicData uri="http://schemas.openxmlformats.org/drawingml/2006/picture">
+                <pic:pic>
+                  <pic:nvPicPr>
+                    <pic:cNvPr descr="data_mining/figures/图A_评分分布与分层似然比.png" id="26" name="Picture"/>
+                    <pic:cNvPicPr>
+                      <a:picLocks noChangeArrowheads="1" noChangeAspect="1"/>
+                    </pic:cNvPicPr>
+                  </pic:nvPicPr>
+                  <pic:blipFill>
+                    <a:blip r:embed="rId24"/>
+                    <a:stretch>
+                      <a:fillRect/>
+                    </a:stretch>
+                  </pic:blipFill>
+                  <pic:spPr bwMode="auto">
+                    <a:xfrm>
+                      <a:off x="0" y="0"/>
+                      <a:ext cx="5334000" cy="2133600"/>
+                    </a:xfrm>
+                    <a:prstGeom prst="rect">
+                      <a:avLst/>
+                    </a:prstGeom>
+                    <a:noFill/>
+                    <a:ln w="9525">
+                      <a:noFill/>
+                      <a:headEnd/>
+                      <a:tailEnd/>
+                    </a:ln>
+                  </pic:spPr>
+                </pic:pic>
+              </a:graphicData>
+            </a:graphic>
+          </wp:inline>
+        </w:drawing>
+      </w:r>
+    </w:p>
+    <w:p>
+      <w:pPr>
+        <w:pStyle w:val="BodyText"/>
+        <w:spacing w:line="360" w:lineRule="auto" w:after="60"/>
+        <w:ind w:firstLine="420"/>
+      </w:pPr>
+      <w:r>
+        <w:rPr>
+          <w:rFonts w:hint="eastAsia" w:ascii="Times New Roman" w:hAnsi="Times New Roman" w:cs="Times New Roman" w:eastAsia="宋体"/>
+          <w:b/>
+          <w:bCs/>
+          <w:sz w:val="21"/>
+        </w:rPr>
+        <w:t xml:space="preserve">图6</w:t>
+      </w:r>
+      <w:r>
+        <w:rPr>
+          <w:rFonts w:ascii="Times New Roman" w:hAnsi="Times New Roman" w:cs="Times New Roman" w:eastAsia="宋体"/>
+          <w:b/>
+          <w:bCs/>
+          <w:sz w:val="21"/>
+        </w:rPr>
+        <w:t xml:space="preserve">　</w:t>
+      </w:r>
+      <w:r>
+        <w:rPr>
+          <w:rFonts w:hint="eastAsia" w:ascii="Times New Roman" w:hAnsi="Times New Roman" w:cs="Times New Roman" w:eastAsia="宋体"/>
+          <w:b/>
+          <w:bCs/>
+          <w:sz w:val="21"/>
+        </w:rPr>
+        <w:t xml:space="preserve">基线GerdQ总分在GERD复合诊断阳性与阴性者中的分布（A）及分层似然比（B）</w:t>
+      </w:r>
+      <w:r>
+        <w:rPr>
+          <w:rFonts w:ascii="Times New Roman" w:hAnsi="Times New Roman" w:cs="Times New Roman" w:eastAsia="宋体"/>
+          <w:sz w:val="21"/>
+        </w:rPr>
+        <w:t xml:space="preserve">　</w:t>
+      </w:r>
+      <w:r>
+        <w:rPr>
+          <w:rFonts w:hint="eastAsia" w:ascii="Times New Roman" w:hAnsi="Times New Roman" w:cs="Times New Roman" w:eastAsia="宋体"/>
+          <w:sz w:val="21"/>
+        </w:rPr>
+        <w:t xml:space="preserve">（新增；各分值例数由表3截断值结果反推，B图误差线为95%CI）</w:t>
+      </w:r>
+    </w:p>
+    <w:p>
+      <w:pPr>
+        <w:pStyle w:val="BodyText"/>
+        <w:spacing w:line="360" w:lineRule="auto" w:after="60"/>
+      </w:pPr>
+      <w:r>
+        <w:rPr>
+          <w:rFonts w:ascii="Times New Roman" w:hAnsi="Times New Roman" w:cs="Times New Roman" w:eastAsia="宋体"/>
+          <w:sz w:val="21"/>
+        </w:rPr>
+        <w:drawing>
+          <wp:inline>
+            <wp:extent cx="5334000" cy="2133600"/>
+            <wp:effectExtent b="0" l="0" r="0" t="0"/>
+            <wp:docPr descr="" title="" id="28" name="Picture"/>
+            <a:graphic>
+              <a:graphicData uri="http://schemas.openxmlformats.org/drawingml/2006/picture">
+                <pic:pic>
+                  <pic:nvPicPr>
+                    <pic:cNvPr descr="data_mining/figures/图C_诊断路径与疗效.png" id="29" name="Picture"/>
+                    <pic:cNvPicPr>
+                      <a:picLocks noChangeArrowheads="1" noChangeAspect="1"/>
+                    </pic:cNvPicPr>
+                  </pic:nvPicPr>
+                  <pic:blipFill>
+                    <a:blip r:embed="rId27"/>
+                    <a:stretch>
+                      <a:fillRect/>
+                    </a:stretch>
+                  </pic:blipFill>
+                  <pic:spPr bwMode="auto">
+                    <a:xfrm>
+                      <a:off x="0" y="0"/>
+                      <a:ext cx="5334000" cy="2133600"/>
+                    </a:xfrm>
+                    <a:prstGeom prst="rect">
+                      <a:avLst/>
+                    </a:prstGeom>
+                    <a:noFill/>
+                    <a:ln w="9525">
+                      <a:noFill/>
+                      <a:headEnd/>
+                      <a:tailEnd/>
+                    </a:ln>
+                  </pic:spPr>
+                </pic:pic>
+              </a:graphicData>
+            </a:graphic>
+          </wp:inline>
+        </w:drawing>
+      </w:r>
+    </w:p>
+    <w:p>
+      <w:pPr>
+        <w:pStyle w:val="BodyText"/>
+        <w:spacing w:line="360" w:lineRule="auto" w:after="60"/>
+        <w:ind w:firstLine="420"/>
+      </w:pPr>
+      <w:r>
+        <w:rPr>
+          <w:rFonts w:hint="eastAsia" w:ascii="Times New Roman" w:hAnsi="Times New Roman" w:cs="Times New Roman" w:eastAsia="宋体"/>
+          <w:b/>
+          <w:bCs/>
+          <w:sz w:val="21"/>
+        </w:rPr>
+        <w:t xml:space="preserve">图7</w:t>
+      </w:r>
+      <w:r>
+        <w:rPr>
+          <w:rFonts w:ascii="Times New Roman" w:hAnsi="Times New Roman" w:cs="Times New Roman" w:eastAsia="宋体"/>
+          <w:b/>
+          <w:bCs/>
+          <w:sz w:val="21"/>
+        </w:rPr>
+        <w:t xml:space="preserve">　</w:t>
+      </w:r>
+      <w:r>
+        <w:rPr>
+          <w:rFonts w:hint="eastAsia" w:ascii="Times New Roman" w:hAnsi="Times New Roman" w:cs="Times New Roman" w:eastAsia="宋体"/>
+          <w:b/>
+          <w:bCs/>
+          <w:sz w:val="21"/>
+        </w:rPr>
+        <w:t xml:space="preserve">不同诊断路径患者的4周症状改善率（A）及胃镜阴性者PPI试验与4周症状改善的一致性（B）</w:t>
+      </w:r>
+      <w:r>
+        <w:rPr>
+          <w:rFonts w:ascii="Times New Roman" w:hAnsi="Times New Roman" w:cs="Times New Roman" w:eastAsia="宋体"/>
+          <w:sz w:val="21"/>
+        </w:rPr>
+        <w:t xml:space="preserve">　</w:t>
+      </w:r>
+      <w:r>
+        <w:rPr>
+          <w:rFonts w:hint="eastAsia" w:ascii="Times New Roman" w:hAnsi="Times New Roman" w:cs="Times New Roman" w:eastAsia="宋体"/>
+          <w:sz w:val="21"/>
+        </w:rPr>
+        <w:t xml:space="preserve">（新增；A图误差线为Wilson法95%CI）</w:t>
+      </w:r>
+    </w:p>
+    <w:bookmarkEnd w:id="30"/>
+    <w:bookmarkStart w:id="31" w:name="参考文献"/>
     <w:p>
       <w:pPr>
         <w:pStyle w:val="Heading2"/>
@@ -13093,8 +13424,8 @@
         <w:t xml:space="preserve">[28] TACK J, TALLEY N J, CAMILLERI M, et al. Functional gastroduodenal disorders[J]. Gastroenterology, 2006, 130(5): 1466-1479. DOI: 10.1053/j.gastro.2005.11.059.</w:t>
       </w:r>
     </w:p>
-    <w:bookmarkEnd w:id="25"/>
-    <w:bookmarkEnd w:id="26"/>
+    <w:bookmarkEnd w:id="31"/>
+    <w:bookmarkEnd w:id="32"/>
     <w:sectPr>
       <w:footnotePr>
         <w:numRestart w:val="eachSect"/>

</xml_diff>

<commit_message>
GerdQ: reproducible stats package (code, input data, tables, figures) and regenerated manuscript
Co-authored-by: zhizaibide4-cyber <zhizaibide4-cyber@users.noreply.github.com>
</commit_message>
<xml_diff>
--- a/submission/gerdq_shiyong_yixue/02_修改稿全文_GerdQ高原肥胖GERD.docx
+++ b/submission/gerdq_shiyong_yixue/02_修改稿全文_GerdQ高原肥胖GERD.docx
@@ -2,7 +2,7 @@
 <file path=word/document.xml><?xml version="1.0" encoding="utf-8"?>
 <w:document xmlns:w="http://schemas.openxmlformats.org/wordprocessingml/2006/main" xmlns:m="http://schemas.openxmlformats.org/officeDocument/2006/math" xmlns:r="http://schemas.openxmlformats.org/officeDocument/2006/relationships" xmlns:o="urn:schemas-microsoft-com:office:office" xmlns:v="urn:schemas-microsoft-com:vml" xmlns:w10="urn:schemas-microsoft-com:office:word" xmlns:a="http://schemas.openxmlformats.org/drawingml/2006/main" xmlns:pic="http://schemas.openxmlformats.org/drawingml/2006/picture" xmlns:wp="http://schemas.openxmlformats.org/drawingml/2006/wordprocessingDrawing">
   <w:body>
-    <w:bookmarkStart w:id="32" w:name="gerdq量表对高原地区肥胖患者胃食管反流病的诊断价值及短期疗效相关因素分析"/>
+    <w:bookmarkStart w:id="40" w:name="gerdq量表对高原地区肥胖患者胃食管反流病的诊断价值及短期疗效相关因素分析"/>
     <w:p>
       <w:pPr>
         <w:pStyle w:val="Heading1"/>
@@ -2077,7 +2077,23 @@
           <w:rFonts w:hint="eastAsia" w:ascii="Times New Roman" w:hAnsi="Times New Roman" w:cs="Times New Roman" w:eastAsia="宋体"/>
           <w:sz w:val="21"/>
         </w:rPr>
-        <w:t xml:space="preserve">κ系数评价。症状改善的相关因素采用多因素Logistic回归分析（后退法，</w:t>
+        <w:t xml:space="preserve">κ系数评价。单因素</w:t>
+      </w:r>
+      <w:r>
+        <w:rPr>
+          <w:rFonts w:ascii="Times New Roman" w:hAnsi="Times New Roman" w:cs="Times New Roman" w:eastAsia="宋体"/>
+          <w:i/>
+          <w:iCs/>
+          <w:sz w:val="21"/>
+        </w:rPr>
+        <w:t xml:space="preserve">OR</w:t>
+      </w:r>
+      <w:r>
+        <w:rPr>
+          <w:rFonts w:hint="eastAsia" w:ascii="Times New Roman" w:hAnsi="Times New Roman" w:cs="Times New Roman" w:eastAsia="宋体"/>
+          <w:sz w:val="21"/>
+        </w:rPr>
+        <w:t xml:space="preserve">的95%CI采用Woolf法计算，并以E值评价未测混杂因素对关联的潜在影响。症状改善的相关因素采用多因素Logistic回归分析（后退法，</w:t>
       </w:r>
       <w:r>
         <w:rPr>
@@ -2114,7 +2130,7 @@
     </w:p>
     <w:bookmarkEnd w:id="13"/>
     <w:bookmarkEnd w:id="14"/>
-    <w:bookmarkStart w:id="21" w:name="结果"/>
+    <w:bookmarkStart w:id="36" w:name="结果"/>
     <w:p>
       <w:pPr>
         <w:pStyle w:val="Heading2"/>
@@ -4605,11 +4621,34 @@
           <w:rFonts w:hint="eastAsia" w:ascii="Times New Roman" w:hAnsi="Times New Roman" w:cs="Times New Roman" w:eastAsia="宋体"/>
           <w:sz w:val="18"/>
         </w:rPr>
-        <w:t xml:space="preserve">注：BMI为体质指数；PPI为质子泵抑制剂；GERD为胃食管反流病；4GerdQ为GerdQ第1、2、5、6条得分之和；减重幅度为减重管理后体重较基线的下降值</w:t>
+        <w:t xml:space="preserve">注：BMI为体质指数；PPI为质子泵抑制剂；GERD为胃食管反流病；4GerdQ为GerdQ第1、2、5、6条得分之和；减重幅度为减重管理后体重较基线的下降值。计数资料组间比较采用χ²检验；计量资料采用Kruskal-Wallis</w:t>
+      </w:r>
+      <w:r>
+        <w:rPr>
+          <w:rFonts w:ascii="Times New Roman" w:hAnsi="Times New Roman" w:cs="Times New Roman" w:eastAsia="宋体"/>
+          <w:sz w:val="18"/>
+        </w:rPr>
+        <w:t xml:space="preserve"> </w:t>
+      </w:r>
+      <w:r>
+        <w:rPr>
+          <w:rFonts w:ascii="Times New Roman" w:hAnsi="Times New Roman" w:cs="Times New Roman" w:eastAsia="宋体"/>
+          <w:i/>
+          <w:iCs/>
+          <w:sz w:val="18"/>
+        </w:rPr>
+        <w:t xml:space="preserve">H</w:t>
+      </w:r>
+      <w:r>
+        <w:rPr>
+          <w:rFonts w:hint="eastAsia" w:ascii="Times New Roman" w:hAnsi="Times New Roman" w:cs="Times New Roman" w:eastAsia="宋体"/>
+          <w:sz w:val="18"/>
+        </w:rPr>
+        <w:t xml:space="preserve">检验</w:t>
       </w:r>
     </w:p>
     <w:bookmarkEnd w:id="15"/>
-    <w:bookmarkStart w:id="16" w:name="gerdq条目得分分布"/>
+    <w:bookmarkStart w:id="19" w:name="gerdq条目得分分布"/>
     <w:p>
       <w:pPr>
         <w:pStyle w:val="Heading3"/>
@@ -5943,42 +5982,109 @@
           <w:rFonts w:hint="eastAsia" w:ascii="Times New Roman" w:hAnsi="Times New Roman" w:cs="Times New Roman" w:eastAsia="宋体"/>
           <w:sz w:val="18"/>
         </w:rPr>
-        <w:t xml:space="preserve">注：*阴性预测条目，反向计分（得分越高表示症状天数越少）</w:t>
-      </w:r>
-      <w:r>
-        <w:rPr>
-          <w:rFonts w:hint="eastAsia" w:ascii="Times New Roman" w:hAnsi="Times New Roman" w:cs="Times New Roman" w:eastAsia="宋体"/>
-          <w:sz w:val="18"/>
-          <w:highlight w:val="yellow"/>
-        </w:rPr>
-        <w:t xml:space="preserve">【</w:t>
-      </w:r>
-      <w:r>
-        <w:rPr>
-          <w:rFonts w:hint="eastAsia" w:ascii="Times New Roman" w:hAnsi="Times New Roman" w:cs="Times New Roman" w:eastAsia="宋体"/>
-          <w:sz w:val="18"/>
-          <w:highlight w:val="yellow"/>
-        </w:rPr>
-        <w:t xml:space="preserve">作者确认</w:t>
-      </w:r>
-      <w:r>
-        <w:rPr>
-          <w:rFonts w:hint="eastAsia" w:ascii="Times New Roman" w:hAnsi="Times New Roman" w:cs="Times New Roman" w:eastAsia="宋体"/>
-          <w:sz w:val="18"/>
-          <w:highlight w:val="yellow"/>
-        </w:rPr>
-        <w:t xml:space="preserve">】</w:t>
-      </w:r>
-      <w:r>
-        <w:rPr>
-          <w:rFonts w:hint="eastAsia" w:ascii="Times New Roman" w:hAnsi="Times New Roman" w:cs="Times New Roman" w:eastAsia="宋体"/>
-          <w:sz w:val="18"/>
-        </w:rPr>
-        <w:t xml:space="preserve">；条目-总分相关采用Spearman秩相关</w:t>
+        <w:t xml:space="preserve">注：*阴性预测条目，反向计分（得分越高表示症状天数越少）；条目-总分相关采用Spearman秩相关</w:t>
       </w:r>
     </w:p>
-    <w:bookmarkEnd w:id="16"/>
-    <w:bookmarkStart w:id="17" w:name="不同肥胖程度组gerdq评分比较"/>
+    <w:p>
+      <w:pPr>
+        <w:pStyle w:val="BodyText"/>
+        <w:spacing w:line="360" w:lineRule="auto" w:after="60"/>
+      </w:pPr>
+      <w:r>
+        <w:rPr>
+          <w:rFonts w:ascii="Times New Roman" w:hAnsi="Times New Roman" w:cs="Times New Roman" w:eastAsia="宋体"/>
+          <w:sz w:val="21"/>
+        </w:rPr>
+        <w:drawing>
+          <wp:inline>
+            <wp:extent cx="5334000" cy="2146150"/>
+            <wp:effectExtent b="0" l="0" r="0" t="0"/>
+            <wp:docPr descr="" title="" id="17" name="Picture"/>
+            <a:graphic>
+              <a:graphicData uri="http://schemas.openxmlformats.org/drawingml/2006/picture">
+                <pic:pic>
+                  <pic:nvPicPr>
+                    <pic:cNvPr descr="stats/output/figures/图1_基线GerdQ总分分布及条目分析.png" id="18" name="Picture"/>
+                    <pic:cNvPicPr>
+                      <a:picLocks noChangeArrowheads="1" noChangeAspect="1"/>
+                    </pic:cNvPicPr>
+                  </pic:nvPicPr>
+                  <pic:blipFill>
+                    <a:blip r:embed="rId16"/>
+                    <a:stretch>
+                      <a:fillRect/>
+                    </a:stretch>
+                  </pic:blipFill>
+                  <pic:spPr bwMode="auto">
+                    <a:xfrm>
+                      <a:off x="0" y="0"/>
+                      <a:ext cx="5334000" cy="2146150"/>
+                    </a:xfrm>
+                    <a:prstGeom prst="rect">
+                      <a:avLst/>
+                    </a:prstGeom>
+                    <a:noFill/>
+                    <a:ln w="9525">
+                      <a:noFill/>
+                      <a:headEnd/>
+                      <a:tailEnd/>
+                    </a:ln>
+                  </pic:spPr>
+                </pic:pic>
+              </a:graphicData>
+            </a:graphic>
+          </wp:inline>
+        </w:drawing>
+      </w:r>
+    </w:p>
+    <w:p>
+      <w:pPr>
+        <w:pStyle w:val="BodyText"/>
+        <w:spacing w:line="360" w:lineRule="auto" w:after="60"/>
+      </w:pPr>
+      <w:r>
+        <w:rPr>
+          <w:rFonts w:hint="eastAsia" w:ascii="Times New Roman" w:hAnsi="Times New Roman" w:cs="Times New Roman" w:eastAsia="宋体"/>
+          <w:b/>
+          <w:bCs/>
+          <w:sz w:val="21"/>
+        </w:rPr>
+        <w:t xml:space="preserve">图1</w:t>
+      </w:r>
+      <w:r>
+        <w:rPr>
+          <w:rFonts w:ascii="Times New Roman" w:hAnsi="Times New Roman" w:cs="Times New Roman" w:eastAsia="宋体"/>
+          <w:b/>
+          <w:bCs/>
+          <w:sz w:val="21"/>
+        </w:rPr>
+        <w:t xml:space="preserve">　</w:t>
+      </w:r>
+      <w:r>
+        <w:rPr>
+          <w:rFonts w:hint="eastAsia" w:ascii="Times New Roman" w:hAnsi="Times New Roman" w:cs="Times New Roman" w:eastAsia="宋体"/>
+          <w:b/>
+          <w:bCs/>
+          <w:sz w:val="21"/>
+        </w:rPr>
+        <w:t xml:space="preserve">基线GerdQ总分分布（A）、各条目得分构成（B）及条目-总分相关性（C）</w:t>
+      </w:r>
+    </w:p>
+    <w:p>
+      <w:pPr>
+        <w:pStyle w:val="BodyText"/>
+        <w:spacing w:line="360" w:lineRule="auto" w:after="60"/>
+      </w:pPr>
+      <w:r>
+        <w:rPr>
+          <w:rFonts w:hint="eastAsia" w:ascii="Times New Roman" w:hAnsi="Times New Roman" w:cs="Times New Roman" w:eastAsia="宋体"/>
+          <w:sz w:val="18"/>
+        </w:rPr>
+        <w:t xml:space="preserve">注：A图各分值例数由表3截断值结果反推（≥12分合并）；B、C图*为阴性预测条目（反向计分）；B图数字为构成比（%）</w:t>
+      </w:r>
+    </w:p>
+    <w:bookmarkEnd w:id="19"/>
+    <w:bookmarkStart w:id="23" w:name="不同肥胖程度组gerdq评分比较"/>
     <w:p>
       <w:pPr>
         <w:pStyle w:val="Heading3"/>
@@ -6177,8 +6283,194 @@
         <w:t xml:space="preserve">=0.300）。见图2。</w:t>
       </w:r>
     </w:p>
-    <w:bookmarkEnd w:id="17"/>
-    <w:bookmarkStart w:id="18" w:name="gerdq对gerd的诊断效能"/>
+    <w:p>
+      <w:pPr>
+        <w:pStyle w:val="BodyText"/>
+        <w:spacing w:line="360" w:lineRule="auto" w:after="60"/>
+      </w:pPr>
+      <w:r>
+        <w:rPr>
+          <w:rFonts w:ascii="Times New Roman" w:hAnsi="Times New Roman" w:cs="Times New Roman" w:eastAsia="宋体"/>
+          <w:sz w:val="21"/>
+        </w:rPr>
+        <w:drawing>
+          <wp:inline>
+            <wp:extent cx="5334000" cy="2401574"/>
+            <wp:effectExtent b="0" l="0" r="0" t="0"/>
+            <wp:docPr descr="" title="" id="21" name="Picture"/>
+            <a:graphic>
+              <a:graphicData uri="http://schemas.openxmlformats.org/drawingml/2006/picture">
+                <pic:pic>
+                  <pic:nvPicPr>
+                    <pic:cNvPr descr="stats/output/figures/图2_不同肥胖程度组GerdQ评分及减重比较.png" id="22" name="Picture"/>
+                    <pic:cNvPicPr>
+                      <a:picLocks noChangeArrowheads="1" noChangeAspect="1"/>
+                    </pic:cNvPicPr>
+                  </pic:nvPicPr>
+                  <pic:blipFill>
+                    <a:blip r:embed="rId20"/>
+                    <a:stretch>
+                      <a:fillRect/>
+                    </a:stretch>
+                  </pic:blipFill>
+                  <pic:spPr bwMode="auto">
+                    <a:xfrm>
+                      <a:off x="0" y="0"/>
+                      <a:ext cx="5334000" cy="2401574"/>
+                    </a:xfrm>
+                    <a:prstGeom prst="rect">
+                      <a:avLst/>
+                    </a:prstGeom>
+                    <a:noFill/>
+                    <a:ln w="9525">
+                      <a:noFill/>
+                      <a:headEnd/>
+                      <a:tailEnd/>
+                    </a:ln>
+                  </pic:spPr>
+                </pic:pic>
+              </a:graphicData>
+            </a:graphic>
+          </wp:inline>
+        </w:drawing>
+      </w:r>
+    </w:p>
+    <w:p>
+      <w:pPr>
+        <w:pStyle w:val="BodyText"/>
+        <w:spacing w:line="360" w:lineRule="auto" w:after="60"/>
+      </w:pPr>
+      <w:r>
+        <w:rPr>
+          <w:rFonts w:hint="eastAsia" w:ascii="Times New Roman" w:hAnsi="Times New Roman" w:cs="Times New Roman" w:eastAsia="宋体"/>
+          <w:b/>
+          <w:bCs/>
+          <w:sz w:val="21"/>
+        </w:rPr>
+        <w:t xml:space="preserve">图2</w:t>
+      </w:r>
+      <w:r>
+        <w:rPr>
+          <w:rFonts w:ascii="Times New Roman" w:hAnsi="Times New Roman" w:cs="Times New Roman" w:eastAsia="宋体"/>
+          <w:b/>
+          <w:bCs/>
+          <w:sz w:val="21"/>
+        </w:rPr>
+        <w:t xml:space="preserve">　</w:t>
+      </w:r>
+      <w:r>
+        <w:rPr>
+          <w:rFonts w:hint="eastAsia" w:ascii="Times New Roman" w:hAnsi="Times New Roman" w:cs="Times New Roman" w:eastAsia="宋体"/>
+          <w:b/>
+          <w:bCs/>
+          <w:sz w:val="21"/>
+        </w:rPr>
+        <w:t xml:space="preserve">不同肥胖程度组基线GerdQ总分（A）及基线4GerdQ、4GerdQ下降值和减重幅度（B）比较</w:t>
+      </w:r>
+    </w:p>
+    <w:p>
+      <w:pPr>
+        <w:pStyle w:val="BodyText"/>
+        <w:spacing w:line="360" w:lineRule="auto" w:after="60"/>
+        <w:ind/>
+      </w:pPr>
+      <w:r>
+        <w:rPr>
+          <w:rFonts w:hint="eastAsia" w:ascii="Times New Roman" w:hAnsi="Times New Roman" w:cs="Times New Roman" w:eastAsia="宋体"/>
+          <w:sz w:val="18"/>
+        </w:rPr>
+        <w:t xml:space="preserve">注：A图为中位数（</w:t>
+      </w:r>
+      <w:r>
+        <w:rPr>
+          <w:rFonts w:ascii="Times New Roman" w:hAnsi="Times New Roman" w:cs="Times New Roman" w:eastAsia="宋体"/>
+          <w:i/>
+          <w:iCs/>
+          <w:sz w:val="18"/>
+        </w:rPr>
+        <w:t xml:space="preserve">Q</w:t>
+      </w:r>
+      <w:r>
+        <w:rPr>
+          <w:rFonts w:hint="eastAsia" w:ascii="Times New Roman" w:hAnsi="Times New Roman" w:cs="Times New Roman" w:eastAsia="宋体"/>
+          <w:sz w:val="18"/>
+        </w:rPr>
+        <w:t xml:space="preserve">₁，</w:t>
+      </w:r>
+      <w:r>
+        <w:rPr>
+          <w:rFonts w:ascii="Times New Roman" w:hAnsi="Times New Roman" w:cs="Times New Roman" w:eastAsia="宋体"/>
+          <w:i/>
+          <w:iCs/>
+          <w:sz w:val="18"/>
+        </w:rPr>
+        <w:t xml:space="preserve">Q</w:t>
+      </w:r>
+      <w:r>
+        <w:rPr>
+          <w:rFonts w:hint="eastAsia" w:ascii="Times New Roman" w:hAnsi="Times New Roman" w:cs="Times New Roman" w:eastAsia="宋体"/>
+          <w:sz w:val="18"/>
+        </w:rPr>
+        <w:t xml:space="preserve">₃），校正</w:t>
+      </w:r>
+      <w:r>
+        <w:rPr>
+          <w:rFonts w:ascii="Times New Roman" w:hAnsi="Times New Roman" w:cs="Times New Roman" w:eastAsia="宋体"/>
+          <w:i/>
+          <w:iCs/>
+          <w:sz w:val="18"/>
+        </w:rPr>
+        <w:t xml:space="preserve">P</w:t>
+      </w:r>
+      <w:r>
+        <w:rPr>
+          <w:rFonts w:hint="eastAsia" w:ascii="Times New Roman" w:hAnsi="Times New Roman" w:cs="Times New Roman" w:eastAsia="宋体"/>
+          <w:sz w:val="18"/>
+        </w:rPr>
+        <w:t xml:space="preserve">为Holm法校正后的两两比较结果；B图为均数±标准差，</w:t>
+      </w:r>
+      <w:r>
+        <w:rPr>
+          <w:rFonts w:ascii="Times New Roman" w:hAnsi="Times New Roman" w:cs="Times New Roman" w:eastAsia="宋体"/>
+          <w:i/>
+          <w:iCs/>
+          <w:sz w:val="18"/>
+        </w:rPr>
+        <w:t xml:space="preserve">P</w:t>
+      </w:r>
+      <w:r>
+        <w:rPr>
+          <w:rFonts w:hint="eastAsia" w:ascii="Times New Roman" w:hAnsi="Times New Roman" w:cs="Times New Roman" w:eastAsia="宋体"/>
+          <w:sz w:val="18"/>
+        </w:rPr>
+        <w:t xml:space="preserve">值为Kruskal-Wallis</w:t>
+      </w:r>
+      <w:r>
+        <w:rPr>
+          <w:rFonts w:ascii="Times New Roman" w:hAnsi="Times New Roman" w:cs="Times New Roman" w:eastAsia="宋体"/>
+          <w:sz w:val="18"/>
+        </w:rPr>
+        <w:t xml:space="preserve"> </w:t>
+      </w:r>
+      <w:r>
+        <w:rPr>
+          <w:rFonts w:ascii="Times New Roman" w:hAnsi="Times New Roman" w:cs="Times New Roman" w:eastAsia="宋体"/>
+          <w:i/>
+          <w:iCs/>
+          <w:sz w:val="18"/>
+        </w:rPr>
+        <w:t xml:space="preserve">H</w:t>
+      </w:r>
+      <w:r>
+        <w:rPr>
+          <w:rFonts w:hint="eastAsia" w:ascii="Times New Roman" w:hAnsi="Times New Roman" w:cs="Times New Roman" w:eastAsia="宋体"/>
+          <w:sz w:val="18"/>
+        </w:rPr>
+        <w:t xml:space="preserve">检验</w:t>
+      </w:r>
+    </w:p>
+    <w:bookmarkEnd w:id="23"/>
+    <w:bookmarkStart w:id="27" w:name="gerdq对gerd的诊断效能"/>
     <w:p>
       <w:pPr>
         <w:pStyle w:val="Heading3"/>
@@ -6307,12 +6599,12 @@
         <w:tblLayout w:type="fixed"/>
       </w:tblPr>
       <w:tblGrid>
-        <w:gridCol w:w="1818"/>
-        <w:gridCol w:w="1364"/>
-        <w:gridCol w:w="1364"/>
-        <w:gridCol w:w="1409"/>
-        <w:gridCol w:w="1409"/>
-        <w:gridCol w:w="1364"/>
+        <w:gridCol w:w="1505"/>
+        <w:gridCol w:w="1881"/>
+        <w:gridCol w:w="1881"/>
+        <w:gridCol w:w="1166"/>
+        <w:gridCol w:w="1166"/>
+        <w:gridCol w:w="1128"/>
       </w:tblGrid>
       <w:tr>
         <w:trPr>
@@ -6320,7 +6612,7 @@
         </w:trPr>
         <w:tc>
           <w:tcPr>
-            <w:tcW w:type="dxa" w:w="1819"/>
+            <w:tcW w:type="dxa" w:w="1505"/>
             <w:tcBorders>
               <w:bottom w:val="single" w:sz="6" w:space="0" w:color="000000"/>
             </w:tcBorders>
@@ -6344,7 +6636,7 @@
         </w:tc>
         <w:tc>
           <w:tcPr>
-            <w:tcW w:type="dxa" w:w="1364"/>
+            <w:tcW w:type="dxa" w:w="1882"/>
             <w:tcBorders>
               <w:bottom w:val="single" w:sz="6" w:space="0" w:color="000000"/>
             </w:tcBorders>
@@ -6362,13 +6654,13 @@
                 <w:b/>
                 <w:sz w:val="18"/>
               </w:rPr>
-              <w:t xml:space="preserve">灵敏度（%）</w:t>
-            </w:r>
-          </w:p>
-        </w:tc>
-        <w:tc>
-          <w:tcPr>
-            <w:tcW w:type="dxa" w:w="1364"/>
+              <w:t xml:space="preserve">灵敏度［%（95%CI）］</w:t>
+            </w:r>
+          </w:p>
+        </w:tc>
+        <w:tc>
+          <w:tcPr>
+            <w:tcW w:type="dxa" w:w="1882"/>
             <w:tcBorders>
               <w:bottom w:val="single" w:sz="6" w:space="0" w:color="000000"/>
             </w:tcBorders>
@@ -6386,13 +6678,13 @@
                 <w:b/>
                 <w:sz w:val="18"/>
               </w:rPr>
-              <w:t xml:space="preserve">特异度（%）</w:t>
-            </w:r>
-          </w:p>
-        </w:tc>
-        <w:tc>
-          <w:tcPr>
-            <w:tcW w:type="dxa" w:w="1410"/>
+              <w:t xml:space="preserve">特异度［%（95%CI）］</w:t>
+            </w:r>
+          </w:p>
+        </w:tc>
+        <w:tc>
+          <w:tcPr>
+            <w:tcW w:type="dxa" w:w="1167"/>
             <w:tcBorders>
               <w:bottom w:val="single" w:sz="6" w:space="0" w:color="000000"/>
             </w:tcBorders>
@@ -6416,7 +6708,7 @@
         </w:tc>
         <w:tc>
           <w:tcPr>
-            <w:tcW w:type="dxa" w:w="1410"/>
+            <w:tcW w:type="dxa" w:w="1167"/>
             <w:tcBorders>
               <w:bottom w:val="single" w:sz="6" w:space="0" w:color="000000"/>
             </w:tcBorders>
@@ -6440,7 +6732,7 @@
         </w:tc>
         <w:tc>
           <w:tcPr>
-            <w:tcW w:type="dxa" w:w="1364"/>
+            <w:tcW w:type="dxa" w:w="1129"/>
             <w:tcBorders>
               <w:bottom w:val="single" w:sz="6" w:space="0" w:color="000000"/>
             </w:tcBorders>
@@ -6466,7 +6758,7 @@
       <w:tr>
         <w:tc>
           <w:tcPr>
-            <w:tcW w:type="dxa" w:w="1819"/>
+            <w:tcW w:type="dxa" w:w="1505"/>
           </w:tcPr>
           <w:p>
             <w:pPr>
@@ -6486,47 +6778,47 @@
         </w:tc>
         <w:tc>
           <w:tcPr>
-            <w:tcW w:type="dxa" w:w="1364"/>
-          </w:tcPr>
-          <w:p>
-            <w:pPr>
-              <w:pStyle w:val="Compact"/>
-              <w:spacing w:line="276" w:lineRule="auto" w:after="0"/>
-              <w:ind w:firstLine="0" w:left="0"/>
-              <w:jc w:val="center"/>
-            </w:pPr>
-            <w:r>
-              <w:rPr>
-                <w:rFonts w:ascii="Times New Roman" w:hAnsi="Times New Roman" w:cs="Times New Roman" w:eastAsia="宋体"/>
-                <w:sz w:val="18"/>
-              </w:rPr>
-              <w:t xml:space="preserve">93.7</w:t>
-            </w:r>
-          </w:p>
-        </w:tc>
-        <w:tc>
-          <w:tcPr>
-            <w:tcW w:type="dxa" w:w="1364"/>
-          </w:tcPr>
-          <w:p>
-            <w:pPr>
-              <w:pStyle w:val="Compact"/>
-              <w:spacing w:line="276" w:lineRule="auto" w:after="0"/>
-              <w:ind w:firstLine="0" w:left="0"/>
-              <w:jc w:val="center"/>
-            </w:pPr>
-            <w:r>
-              <w:rPr>
-                <w:rFonts w:ascii="Times New Roman" w:hAnsi="Times New Roman" w:cs="Times New Roman" w:eastAsia="宋体"/>
-                <w:sz w:val="18"/>
-              </w:rPr>
-              <w:t xml:space="preserve">29.2</w:t>
-            </w:r>
-          </w:p>
-        </w:tc>
-        <w:tc>
-          <w:tcPr>
-            <w:tcW w:type="dxa" w:w="1410"/>
+            <w:tcW w:type="dxa" w:w="1882"/>
+          </w:tcPr>
+          <w:p>
+            <w:pPr>
+              <w:pStyle w:val="Compact"/>
+              <w:spacing w:line="276" w:lineRule="auto" w:after="0"/>
+              <w:ind w:firstLine="0" w:left="0"/>
+              <w:jc w:val="center"/>
+            </w:pPr>
+            <w:r>
+              <w:rPr>
+                <w:rFonts w:hint="eastAsia" w:ascii="Times New Roman" w:hAnsi="Times New Roman" w:cs="Times New Roman" w:eastAsia="宋体"/>
+                <w:sz w:val="18"/>
+              </w:rPr>
+              <w:t xml:space="preserve">93.7（86.0~97.3）</w:t>
+            </w:r>
+          </w:p>
+        </w:tc>
+        <w:tc>
+          <w:tcPr>
+            <w:tcW w:type="dxa" w:w="1882"/>
+          </w:tcPr>
+          <w:p>
+            <w:pPr>
+              <w:pStyle w:val="Compact"/>
+              <w:spacing w:line="276" w:lineRule="auto" w:after="0"/>
+              <w:ind w:firstLine="0" w:left="0"/>
+              <w:jc w:val="center"/>
+            </w:pPr>
+            <w:r>
+              <w:rPr>
+                <w:rFonts w:hint="eastAsia" w:ascii="Times New Roman" w:hAnsi="Times New Roman" w:cs="Times New Roman" w:eastAsia="宋体"/>
+                <w:sz w:val="18"/>
+              </w:rPr>
+              <w:t xml:space="preserve">29.2（14.9~49.2）</w:t>
+            </w:r>
+          </w:p>
+        </w:tc>
+        <w:tc>
+          <w:tcPr>
+            <w:tcW w:type="dxa" w:w="1167"/>
           </w:tcPr>
           <w:p>
             <w:pPr>
@@ -6546,7 +6838,7 @@
         </w:tc>
         <w:tc>
           <w:tcPr>
-            <w:tcW w:type="dxa" w:w="1410"/>
+            <w:tcW w:type="dxa" w:w="1167"/>
           </w:tcPr>
           <w:p>
             <w:pPr>
@@ -6566,7 +6858,7 @@
         </w:tc>
         <w:tc>
           <w:tcPr>
-            <w:tcW w:type="dxa" w:w="1364"/>
+            <w:tcW w:type="dxa" w:w="1129"/>
           </w:tcPr>
           <w:p>
             <w:pPr>
@@ -6588,7 +6880,7 @@
       <w:tr>
         <w:tc>
           <w:tcPr>
-            <w:tcW w:type="dxa" w:w="1819"/>
+            <w:tcW w:type="dxa" w:w="1505"/>
           </w:tcPr>
           <w:p>
             <w:pPr>
@@ -6608,7 +6900,47 @@
         </w:tc>
         <w:tc>
           <w:tcPr>
-            <w:tcW w:type="dxa" w:w="1364"/>
+            <w:tcW w:type="dxa" w:w="1882"/>
+          </w:tcPr>
+          <w:p>
+            <w:pPr>
+              <w:pStyle w:val="Compact"/>
+              <w:spacing w:line="276" w:lineRule="auto" w:after="0"/>
+              <w:ind w:firstLine="0" w:left="0"/>
+              <w:jc w:val="center"/>
+            </w:pPr>
+            <w:r>
+              <w:rPr>
+                <w:rFonts w:hint="eastAsia" w:ascii="Times New Roman" w:hAnsi="Times New Roman" w:cs="Times New Roman" w:eastAsia="宋体"/>
+                <w:sz w:val="18"/>
+              </w:rPr>
+              <w:t xml:space="preserve">82.3（72.4~89.1）</w:t>
+            </w:r>
+          </w:p>
+        </w:tc>
+        <w:tc>
+          <w:tcPr>
+            <w:tcW w:type="dxa" w:w="1882"/>
+          </w:tcPr>
+          <w:p>
+            <w:pPr>
+              <w:pStyle w:val="Compact"/>
+              <w:spacing w:line="276" w:lineRule="auto" w:after="0"/>
+              <w:ind w:firstLine="0" w:left="0"/>
+              <w:jc w:val="center"/>
+            </w:pPr>
+            <w:r>
+              <w:rPr>
+                <w:rFonts w:hint="eastAsia" w:ascii="Times New Roman" w:hAnsi="Times New Roman" w:cs="Times New Roman" w:eastAsia="宋体"/>
+                <w:sz w:val="18"/>
+              </w:rPr>
+              <w:t xml:space="preserve">41.7（24.5~61.2）</w:t>
+            </w:r>
+          </w:p>
+        </w:tc>
+        <w:tc>
+          <w:tcPr>
+            <w:tcW w:type="dxa" w:w="1167"/>
           </w:tcPr>
           <w:p>
             <w:pPr>
@@ -6628,7 +6960,7 @@
         </w:tc>
         <w:tc>
           <w:tcPr>
-            <w:tcW w:type="dxa" w:w="1364"/>
+            <w:tcW w:type="dxa" w:w="1167"/>
           </w:tcPr>
           <w:p>
             <w:pPr>
@@ -6648,47 +6980,7 @@
         </w:tc>
         <w:tc>
           <w:tcPr>
-            <w:tcW w:type="dxa" w:w="1410"/>
-          </w:tcPr>
-          <w:p>
-            <w:pPr>
-              <w:pStyle w:val="Compact"/>
-              <w:spacing w:line="276" w:lineRule="auto" w:after="0"/>
-              <w:ind w:firstLine="0" w:left="0"/>
-              <w:jc w:val="center"/>
-            </w:pPr>
-            <w:r>
-              <w:rPr>
-                <w:rFonts w:ascii="Times New Roman" w:hAnsi="Times New Roman" w:cs="Times New Roman" w:eastAsia="宋体"/>
-                <w:sz w:val="18"/>
-              </w:rPr>
-              <w:t xml:space="preserve">82.3</w:t>
-            </w:r>
-          </w:p>
-        </w:tc>
-        <w:tc>
-          <w:tcPr>
-            <w:tcW w:type="dxa" w:w="1410"/>
-          </w:tcPr>
-          <w:p>
-            <w:pPr>
-              <w:pStyle w:val="Compact"/>
-              <w:spacing w:line="276" w:lineRule="auto" w:after="0"/>
-              <w:ind w:firstLine="0" w:left="0"/>
-              <w:jc w:val="center"/>
-            </w:pPr>
-            <w:r>
-              <w:rPr>
-                <w:rFonts w:ascii="Times New Roman" w:hAnsi="Times New Roman" w:cs="Times New Roman" w:eastAsia="宋体"/>
-                <w:sz w:val="18"/>
-              </w:rPr>
-              <w:t xml:space="preserve">41.7</w:t>
-            </w:r>
-          </w:p>
-        </w:tc>
-        <w:tc>
-          <w:tcPr>
-            <w:tcW w:type="dxa" w:w="1364"/>
+            <w:tcW w:type="dxa" w:w="1129"/>
           </w:tcPr>
           <w:p>
             <w:pPr>
@@ -6710,7 +7002,7 @@
       <w:tr>
         <w:tc>
           <w:tcPr>
-            <w:tcW w:type="dxa" w:w="1819"/>
+            <w:tcW w:type="dxa" w:w="1505"/>
           </w:tcPr>
           <w:p>
             <w:pPr>
@@ -6730,47 +7022,47 @@
         </w:tc>
         <w:tc>
           <w:tcPr>
-            <w:tcW w:type="dxa" w:w="1364"/>
-          </w:tcPr>
-          <w:p>
-            <w:pPr>
-              <w:pStyle w:val="Compact"/>
-              <w:spacing w:line="276" w:lineRule="auto" w:after="0"/>
-              <w:ind w:firstLine="0" w:left="0"/>
-              <w:jc w:val="center"/>
-            </w:pPr>
-            <w:r>
-              <w:rPr>
-                <w:rFonts w:ascii="Times New Roman" w:hAnsi="Times New Roman" w:cs="Times New Roman" w:eastAsia="宋体"/>
-                <w:sz w:val="18"/>
-              </w:rPr>
-              <w:t xml:space="preserve">62.0</w:t>
-            </w:r>
-          </w:p>
-        </w:tc>
-        <w:tc>
-          <w:tcPr>
-            <w:tcW w:type="dxa" w:w="1364"/>
-          </w:tcPr>
-          <w:p>
-            <w:pPr>
-              <w:pStyle w:val="Compact"/>
-              <w:spacing w:line="276" w:lineRule="auto" w:after="0"/>
-              <w:ind w:firstLine="0" w:left="0"/>
-              <w:jc w:val="center"/>
-            </w:pPr>
-            <w:r>
-              <w:rPr>
-                <w:rFonts w:ascii="Times New Roman" w:hAnsi="Times New Roman" w:cs="Times New Roman" w:eastAsia="宋体"/>
-                <w:sz w:val="18"/>
-              </w:rPr>
-              <w:t xml:space="preserve">70.8</w:t>
-            </w:r>
-          </w:p>
-        </w:tc>
-        <w:tc>
-          <w:tcPr>
-            <w:tcW w:type="dxa" w:w="1410"/>
+            <w:tcW w:type="dxa" w:w="1882"/>
+          </w:tcPr>
+          <w:p>
+            <w:pPr>
+              <w:pStyle w:val="Compact"/>
+              <w:spacing w:line="276" w:lineRule="auto" w:after="0"/>
+              <w:ind w:firstLine="0" w:left="0"/>
+              <w:jc w:val="center"/>
+            </w:pPr>
+            <w:r>
+              <w:rPr>
+                <w:rFonts w:hint="eastAsia" w:ascii="Times New Roman" w:hAnsi="Times New Roman" w:cs="Times New Roman" w:eastAsia="宋体"/>
+                <w:sz w:val="18"/>
+              </w:rPr>
+              <w:t xml:space="preserve">62.0（51.0~71.9）</w:t>
+            </w:r>
+          </w:p>
+        </w:tc>
+        <w:tc>
+          <w:tcPr>
+            <w:tcW w:type="dxa" w:w="1882"/>
+          </w:tcPr>
+          <w:p>
+            <w:pPr>
+              <w:pStyle w:val="Compact"/>
+              <w:spacing w:line="276" w:lineRule="auto" w:after="0"/>
+              <w:ind w:firstLine="0" w:left="0"/>
+              <w:jc w:val="center"/>
+            </w:pPr>
+            <w:r>
+              <w:rPr>
+                <w:rFonts w:hint="eastAsia" w:ascii="Times New Roman" w:hAnsi="Times New Roman" w:cs="Times New Roman" w:eastAsia="宋体"/>
+                <w:sz w:val="18"/>
+              </w:rPr>
+              <w:t xml:space="preserve">70.8（50.8~85.1）</w:t>
+            </w:r>
+          </w:p>
+        </w:tc>
+        <w:tc>
+          <w:tcPr>
+            <w:tcW w:type="dxa" w:w="1167"/>
           </w:tcPr>
           <w:p>
             <w:pPr>
@@ -6790,7 +7082,7 @@
         </w:tc>
         <w:tc>
           <w:tcPr>
-            <w:tcW w:type="dxa" w:w="1410"/>
+            <w:tcW w:type="dxa" w:w="1167"/>
           </w:tcPr>
           <w:p>
             <w:pPr>
@@ -6810,7 +7102,7 @@
         </w:tc>
         <w:tc>
           <w:tcPr>
-            <w:tcW w:type="dxa" w:w="1364"/>
+            <w:tcW w:type="dxa" w:w="1129"/>
           </w:tcPr>
           <w:p>
             <w:pPr>
@@ -6832,7 +7124,7 @@
       <w:tr>
         <w:tc>
           <w:tcPr>
-            <w:tcW w:type="dxa" w:w="1819"/>
+            <w:tcW w:type="dxa" w:w="1505"/>
           </w:tcPr>
           <w:p>
             <w:pPr>
@@ -6852,47 +7144,47 @@
         </w:tc>
         <w:tc>
           <w:tcPr>
-            <w:tcW w:type="dxa" w:w="1364"/>
-          </w:tcPr>
-          <w:p>
-            <w:pPr>
-              <w:pStyle w:val="Compact"/>
-              <w:spacing w:line="276" w:lineRule="auto" w:after="0"/>
-              <w:ind w:firstLine="0" w:left="0"/>
-              <w:jc w:val="center"/>
-            </w:pPr>
-            <w:r>
-              <w:rPr>
-                <w:rFonts w:ascii="Times New Roman" w:hAnsi="Times New Roman" w:cs="Times New Roman" w:eastAsia="宋体"/>
-                <w:sz w:val="18"/>
-              </w:rPr>
-              <w:t xml:space="preserve">43.0</w:t>
-            </w:r>
-          </w:p>
-        </w:tc>
-        <w:tc>
-          <w:tcPr>
-            <w:tcW w:type="dxa" w:w="1364"/>
-          </w:tcPr>
-          <w:p>
-            <w:pPr>
-              <w:pStyle w:val="Compact"/>
-              <w:spacing w:line="276" w:lineRule="auto" w:after="0"/>
-              <w:ind w:firstLine="0" w:left="0"/>
-              <w:jc w:val="center"/>
-            </w:pPr>
-            <w:r>
-              <w:rPr>
-                <w:rFonts w:ascii="Times New Roman" w:hAnsi="Times New Roman" w:cs="Times New Roman" w:eastAsia="宋体"/>
-                <w:sz w:val="18"/>
-              </w:rPr>
-              <w:t xml:space="preserve">79.2</w:t>
-            </w:r>
-          </w:p>
-        </w:tc>
-        <w:tc>
-          <w:tcPr>
-            <w:tcW w:type="dxa" w:w="1410"/>
+            <w:tcW w:type="dxa" w:w="1882"/>
+          </w:tcPr>
+          <w:p>
+            <w:pPr>
+              <w:pStyle w:val="Compact"/>
+              <w:spacing w:line="276" w:lineRule="auto" w:after="0"/>
+              <w:ind w:firstLine="0" w:left="0"/>
+              <w:jc w:val="center"/>
+            </w:pPr>
+            <w:r>
+              <w:rPr>
+                <w:rFonts w:hint="eastAsia" w:ascii="Times New Roman" w:hAnsi="Times New Roman" w:cs="Times New Roman" w:eastAsia="宋体"/>
+                <w:sz w:val="18"/>
+              </w:rPr>
+              <w:t xml:space="preserve">43.0（32.7~54.0）</w:t>
+            </w:r>
+          </w:p>
+        </w:tc>
+        <w:tc>
+          <w:tcPr>
+            <w:tcW w:type="dxa" w:w="1882"/>
+          </w:tcPr>
+          <w:p>
+            <w:pPr>
+              <w:pStyle w:val="Compact"/>
+              <w:spacing w:line="276" w:lineRule="auto" w:after="0"/>
+              <w:ind w:firstLine="0" w:left="0"/>
+              <w:jc w:val="center"/>
+            </w:pPr>
+            <w:r>
+              <w:rPr>
+                <w:rFonts w:hint="eastAsia" w:ascii="Times New Roman" w:hAnsi="Times New Roman" w:cs="Times New Roman" w:eastAsia="宋体"/>
+                <w:sz w:val="18"/>
+              </w:rPr>
+              <w:t xml:space="preserve">79.2（59.5~90.8）</w:t>
+            </w:r>
+          </w:p>
+        </w:tc>
+        <w:tc>
+          <w:tcPr>
+            <w:tcW w:type="dxa" w:w="1167"/>
           </w:tcPr>
           <w:p>
             <w:pPr>
@@ -6912,7 +7204,7 @@
         </w:tc>
         <w:tc>
           <w:tcPr>
-            <w:tcW w:type="dxa" w:w="1410"/>
+            <w:tcW w:type="dxa" w:w="1167"/>
           </w:tcPr>
           <w:p>
             <w:pPr>
@@ -6932,7 +7224,7 @@
         </w:tc>
         <w:tc>
           <w:tcPr>
-            <w:tcW w:type="dxa" w:w="1364"/>
+            <w:tcW w:type="dxa" w:w="1129"/>
           </w:tcPr>
           <w:p>
             <w:pPr>
@@ -6954,7 +7246,7 @@
       <w:tr>
         <w:tc>
           <w:tcPr>
-            <w:tcW w:type="dxa" w:w="1819"/>
+            <w:tcW w:type="dxa" w:w="1505"/>
           </w:tcPr>
           <w:p>
             <w:pPr>
@@ -6974,47 +7266,47 @@
         </w:tc>
         <w:tc>
           <w:tcPr>
-            <w:tcW w:type="dxa" w:w="1364"/>
-          </w:tcPr>
-          <w:p>
-            <w:pPr>
-              <w:pStyle w:val="Compact"/>
-              <w:spacing w:line="276" w:lineRule="auto" w:after="0"/>
-              <w:ind w:firstLine="0" w:left="0"/>
-              <w:jc w:val="center"/>
-            </w:pPr>
-            <w:r>
-              <w:rPr>
-                <w:rFonts w:ascii="Times New Roman" w:hAnsi="Times New Roman" w:cs="Times New Roman" w:eastAsia="宋体"/>
-                <w:sz w:val="18"/>
-              </w:rPr>
-              <w:t xml:space="preserve">34.2</w:t>
-            </w:r>
-          </w:p>
-        </w:tc>
-        <w:tc>
-          <w:tcPr>
-            <w:tcW w:type="dxa" w:w="1364"/>
-          </w:tcPr>
-          <w:p>
-            <w:pPr>
-              <w:pStyle w:val="Compact"/>
-              <w:spacing w:line="276" w:lineRule="auto" w:after="0"/>
-              <w:ind w:firstLine="0" w:left="0"/>
-              <w:jc w:val="center"/>
-            </w:pPr>
-            <w:r>
-              <w:rPr>
-                <w:rFonts w:ascii="Times New Roman" w:hAnsi="Times New Roman" w:cs="Times New Roman" w:eastAsia="宋体"/>
-                <w:sz w:val="18"/>
-              </w:rPr>
-              <w:t xml:space="preserve">87.5</w:t>
-            </w:r>
-          </w:p>
-        </w:tc>
-        <w:tc>
-          <w:tcPr>
-            <w:tcW w:type="dxa" w:w="1410"/>
+            <w:tcW w:type="dxa" w:w="1882"/>
+          </w:tcPr>
+          <w:p>
+            <w:pPr>
+              <w:pStyle w:val="Compact"/>
+              <w:spacing w:line="276" w:lineRule="auto" w:after="0"/>
+              <w:ind w:firstLine="0" w:left="0"/>
+              <w:jc w:val="center"/>
+            </w:pPr>
+            <w:r>
+              <w:rPr>
+                <w:rFonts w:hint="eastAsia" w:ascii="Times New Roman" w:hAnsi="Times New Roman" w:cs="Times New Roman" w:eastAsia="宋体"/>
+                <w:sz w:val="18"/>
+              </w:rPr>
+              <w:t xml:space="preserve">34.2（24.7~45.2）</w:t>
+            </w:r>
+          </w:p>
+        </w:tc>
+        <w:tc>
+          <w:tcPr>
+            <w:tcW w:type="dxa" w:w="1882"/>
+          </w:tcPr>
+          <w:p>
+            <w:pPr>
+              <w:pStyle w:val="Compact"/>
+              <w:spacing w:line="276" w:lineRule="auto" w:after="0"/>
+              <w:ind w:firstLine="0" w:left="0"/>
+              <w:jc w:val="center"/>
+            </w:pPr>
+            <w:r>
+              <w:rPr>
+                <w:rFonts w:hint="eastAsia" w:ascii="Times New Roman" w:hAnsi="Times New Roman" w:cs="Times New Roman" w:eastAsia="宋体"/>
+                <w:sz w:val="18"/>
+              </w:rPr>
+              <w:t xml:space="preserve">87.5（69.0~95.7）</w:t>
+            </w:r>
+          </w:p>
+        </w:tc>
+        <w:tc>
+          <w:tcPr>
+            <w:tcW w:type="dxa" w:w="1167"/>
           </w:tcPr>
           <w:p>
             <w:pPr>
@@ -7034,7 +7326,7 @@
         </w:tc>
         <w:tc>
           <w:tcPr>
-            <w:tcW w:type="dxa" w:w="1410"/>
+            <w:tcW w:type="dxa" w:w="1167"/>
           </w:tcPr>
           <w:p>
             <w:pPr>
@@ -7054,7 +7346,7 @@
         </w:tc>
         <w:tc>
           <w:tcPr>
-            <w:tcW w:type="dxa" w:w="1364"/>
+            <w:tcW w:type="dxa" w:w="1129"/>
           </w:tcPr>
           <w:p>
             <w:pPr>
@@ -7078,13 +7370,14 @@
       <w:pPr>
         <w:pStyle w:val="BodyText"/>
         <w:spacing w:line="360" w:lineRule="auto" w:after="60"/>
+        <w:ind/>
       </w:pPr>
       <w:r>
         <w:rPr>
           <w:rFonts w:hint="eastAsia" w:ascii="Times New Roman" w:hAnsi="Times New Roman" w:cs="Times New Roman" w:eastAsia="宋体"/>
           <w:sz w:val="18"/>
         </w:rPr>
-        <w:t xml:space="preserve">注：GERD复合诊断阳性79例、阴性24例；因入组要求门诊GerdQ≥7分，本表不能反映≤7分时的诊断效能</w:t>
+        <w:t xml:space="preserve">注：GERD复合诊断阳性79例、阴性24例；灵敏度和特异度的95%CI采用Wilson法；阳性/阴性似然比分别为≥8分1.32/0.22，≥9分1.41/0.43，≥10分2.13/0.54，≥11分2.07/0.72，≥12分2.73/0.75；因入组要求门诊GerdQ≥7分，本表不能反映≤7分时的诊断效能</w:t>
       </w:r>
     </w:p>
     <w:p>
@@ -7098,7 +7391,14 @@
           <w:rFonts w:hint="eastAsia" w:ascii="Times New Roman" w:hAnsi="Times New Roman" w:cs="Times New Roman" w:eastAsia="宋体"/>
           <w:sz w:val="21"/>
         </w:rPr>
-        <w:t xml:space="preserve">GERD比例随GerdQ总分升高而增加（趋势χ²=9.12，</w:t>
+        <w:t xml:space="preserve">GERD比例随GerdQ总分升高而增加（Cochran-Armitage</w:t>
+      </w:r>
+      <w:r>
+        <w:rPr>
+          <w:rFonts w:ascii="Times New Roman" w:hAnsi="Times New Roman" w:cs="Times New Roman" w:eastAsia="宋体"/>
+          <w:sz w:val="21"/>
+        </w:rPr>
+        <w:t xml:space="preserve"> </w:t>
       </w:r>
       <w:r>
         <w:rPr>
@@ -7107,21 +7407,14 @@
           <w:iCs/>
           <w:sz w:val="21"/>
         </w:rPr>
-        <w:t xml:space="preserve">P</w:t>
-      </w:r>
-      <w:r>
-        <w:rPr>
-          <w:rFonts w:hint="eastAsia" w:ascii="Times New Roman" w:hAnsi="Times New Roman" w:cs="Times New Roman" w:eastAsia="宋体"/>
-          <w:sz w:val="21"/>
-        </w:rPr>
-        <w:t xml:space="preserve">=0.003），但逐分似然比并不单调，故合并为3个区间分析。7分、8~9分和≥10分的分层似然比分别为0.22（95%CI：0.08~0.62）、0.76（95%CI：0.43~1.35）和2.13（95%CI：1.11~4.06），对应本组验后概率分别为41.7%、71.4%和87.5%；8~9分区间似然比的95%CI跨越1，基本不提供诊断信息。GerdQ≥10分的比例在胃镜异常、胃镜阴性且PPI试验阳性、胃镜阴性且PPI试验阴性者中分别为71.8%（28/39）、52.5%（21/40）和29.2%（7/24），呈梯度下降（Cochran-Armitage</w:t>
-      </w:r>
-      <w:r>
-        <w:rPr>
-          <w:rFonts w:ascii="Times New Roman" w:hAnsi="Times New Roman" w:cs="Times New Roman" w:eastAsia="宋体"/>
-          <w:sz w:val="21"/>
-        </w:rPr>
-        <w:t xml:space="preserve"> </w:t>
+        <w:t xml:space="preserve">Z</w:t>
+      </w:r>
+      <w:r>
+        <w:rPr>
+          <w:rFonts w:hint="eastAsia" w:ascii="Times New Roman" w:hAnsi="Times New Roman" w:cs="Times New Roman" w:eastAsia="宋体"/>
+          <w:sz w:val="21"/>
+        </w:rPr>
+        <w:t xml:space="preserve">=3.07，</w:t>
       </w:r>
       <w:r>
         <w:rPr>
@@ -7130,14 +7423,21 @@
           <w:iCs/>
           <w:sz w:val="21"/>
         </w:rPr>
-        <w:t xml:space="preserve">Z</w:t>
-      </w:r>
-      <w:r>
-        <w:rPr>
-          <w:rFonts w:hint="eastAsia" w:ascii="Times New Roman" w:hAnsi="Times New Roman" w:cs="Times New Roman" w:eastAsia="宋体"/>
-          <w:sz w:val="21"/>
-        </w:rPr>
-        <w:t xml:space="preserve">=3.31，</w:t>
+        <w:t xml:space="preserve">P</w:t>
+      </w:r>
+      <w:r>
+        <w:rPr>
+          <w:rFonts w:hint="eastAsia" w:ascii="Times New Roman" w:hAnsi="Times New Roman" w:cs="Times New Roman" w:eastAsia="宋体"/>
+          <w:sz w:val="21"/>
+        </w:rPr>
+        <w:t xml:space="preserve">=0.002），但逐分似然比并不单调，故合并为3个区间分析。7分、8~9分和≥10分的分层似然比分别为0.22（95%CI：0.08~0.62）、0.76（95%CI：0.43~1.35）和2.13（95%CI：1.11~4.06），对应本组验后概率分别为41.7%、71.4%和87.5%；8~9分区间似然比的95%CI跨越1，基本不提供诊断信息。GerdQ≥10分的比例在胃镜异常、胃镜阴性且PPI试验阳性、胃镜阴性且PPI试验阴性者中分别为71.8%（28/39）、52.5%（21/40）和29.2%（7/24），呈梯度下降（Cochran-Armitage</w:t>
+      </w:r>
+      <w:r>
+        <w:rPr>
+          <w:rFonts w:ascii="Times New Roman" w:hAnsi="Times New Roman" w:cs="Times New Roman" w:eastAsia="宋体"/>
+          <w:sz w:val="21"/>
+        </w:rPr>
+        <w:t xml:space="preserve"> </w:t>
       </w:r>
       <w:r>
         <w:rPr>
@@ -7146,14 +7446,14 @@
           <w:iCs/>
           <w:sz w:val="21"/>
         </w:rPr>
-        <w:t xml:space="preserve">P</w:t>
-      </w:r>
-      <w:r>
-        <w:rPr>
-          <w:rFonts w:hint="eastAsia" w:ascii="Times New Roman" w:hAnsi="Times New Roman" w:cs="Times New Roman" w:eastAsia="宋体"/>
-          <w:sz w:val="21"/>
-        </w:rPr>
-        <w:t xml:space="preserve">&lt;0.001）。在确诊路径相同的胃镜阴性者（64例）中，以GerdQ≥10分识别PPI试验阳性的灵敏度为52.5%（95%CI：37.5%~67.1%），特异度为70.8%（95%CI：50.8%~85.1%），差异无统计学意义（</w:t>
+        <w:t xml:space="preserve">Z</w:t>
+      </w:r>
+      <w:r>
+        <w:rPr>
+          <w:rFonts w:hint="eastAsia" w:ascii="Times New Roman" w:hAnsi="Times New Roman" w:cs="Times New Roman" w:eastAsia="宋体"/>
+          <w:sz w:val="21"/>
+        </w:rPr>
+        <w:t xml:space="preserve">=3.31，</w:t>
       </w:r>
       <w:r>
         <w:rPr>
@@ -7162,14 +7462,14 @@
           <w:iCs/>
           <w:sz w:val="21"/>
         </w:rPr>
-        <w:t xml:space="preserve">OR</w:t>
-      </w:r>
-      <w:r>
-        <w:rPr>
-          <w:rFonts w:hint="eastAsia" w:ascii="Times New Roman" w:hAnsi="Times New Roman" w:cs="Times New Roman" w:eastAsia="宋体"/>
-          <w:sz w:val="21"/>
-        </w:rPr>
-        <w:t xml:space="preserve">=2.68，Fisher确切概率法</w:t>
+        <w:t xml:space="preserve">P</w:t>
+      </w:r>
+      <w:r>
+        <w:rPr>
+          <w:rFonts w:hint="eastAsia" w:ascii="Times New Roman" w:hAnsi="Times New Roman" w:cs="Times New Roman" w:eastAsia="宋体"/>
+          <w:sz w:val="21"/>
+        </w:rPr>
+        <w:t xml:space="preserve">&lt;0.001）。在确诊路径相同的胃镜阴性者（64例）中，以GerdQ≥10分识别PPI试验阳性的灵敏度为52.5%（95%CI：37.5%~67.1%），特异度为70.8%（95%CI：50.8%~85.1%），差异无统计学意义（</w:t>
       </w:r>
       <w:r>
         <w:rPr>
@@ -7178,6 +7478,22 @@
           <w:iCs/>
           <w:sz w:val="21"/>
         </w:rPr>
+        <w:t xml:space="preserve">OR</w:t>
+      </w:r>
+      <w:r>
+        <w:rPr>
+          <w:rFonts w:hint="eastAsia" w:ascii="Times New Roman" w:hAnsi="Times New Roman" w:cs="Times New Roman" w:eastAsia="宋体"/>
+          <w:sz w:val="21"/>
+        </w:rPr>
+        <w:t xml:space="preserve">=2.68，Fisher确切概率法</w:t>
+      </w:r>
+      <w:r>
+        <w:rPr>
+          <w:rFonts w:ascii="Times New Roman" w:hAnsi="Times New Roman" w:cs="Times New Roman" w:eastAsia="宋体"/>
+          <w:i/>
+          <w:iCs/>
+          <w:sz w:val="21"/>
+        </w:rPr>
         <w:t xml:space="preserve">P</w:t>
       </w:r>
       <w:r>
@@ -7185,7 +7501,7 @@
           <w:rFonts w:hint="eastAsia" w:ascii="Times New Roman" w:hAnsi="Times New Roman" w:cs="Times New Roman" w:eastAsia="宋体"/>
           <w:sz w:val="21"/>
         </w:rPr>
-        <w:t xml:space="preserve">=0.077）。见表4、图6。</w:t>
+        <w:t xml:space="preserve">=0.077）。见表4、图3。</w:t>
       </w:r>
     </w:p>
     <w:p>
@@ -7837,11 +8153,110 @@
           <w:rFonts w:hint="eastAsia" w:ascii="Times New Roman" w:hAnsi="Times New Roman" w:cs="Times New Roman" w:eastAsia="宋体"/>
           <w:sz w:val="18"/>
         </w:rPr>
-        <w:t xml:space="preserve">验前概率为50%时；各区间例数为GERD复合诊断阳性/阴性例数，由表3截断值结果反推；本组验前概率（GERD复合诊断比例）为76.7%；验后概率=验后比值/（1+验后比值），验后比值=验前比值×分层似然比</w:t>
+        <w:t xml:space="preserve">验前概率为50%时；各区间例数为GERD复合诊断阳性/阴性例数，由表3截断值结果反推；本组验前概率（GERD复合诊断比例）为76.7%；分层似然比的95%CI采用对数法；验后概率=验后比值/（1+验后比值），验后比值=验前比值×分层似然比</w:t>
       </w:r>
     </w:p>
-    <w:bookmarkEnd w:id="18"/>
-    <w:bookmarkStart w:id="19" w:name="治疗前后症状及体重变化"/>
+    <w:p>
+      <w:pPr>
+        <w:pStyle w:val="BodyText"/>
+        <w:spacing w:line="360" w:lineRule="auto" w:after="60"/>
+      </w:pPr>
+      <w:r>
+        <w:rPr>
+          <w:rFonts w:ascii="Times New Roman" w:hAnsi="Times New Roman" w:cs="Times New Roman" w:eastAsia="宋体"/>
+          <w:sz w:val="21"/>
+        </w:rPr>
+        <w:drawing>
+          <wp:inline>
+            <wp:extent cx="5334000" cy="2602796"/>
+            <wp:effectExtent b="0" l="0" r="0" t="0"/>
+            <wp:docPr descr="" title="" id="25" name="Picture"/>
+            <a:graphic>
+              <a:graphicData uri="http://schemas.openxmlformats.org/drawingml/2006/picture">
+                <pic:pic>
+                  <pic:nvPicPr>
+                    <pic:cNvPr descr="stats/output/figures/图3_GerdQ诊断GERD的ROC曲线及分层似然比.png" id="26" name="Picture"/>
+                    <pic:cNvPicPr>
+                      <a:picLocks noChangeArrowheads="1" noChangeAspect="1"/>
+                    </pic:cNvPicPr>
+                  </pic:nvPicPr>
+                  <pic:blipFill>
+                    <a:blip r:embed="rId24"/>
+                    <a:stretch>
+                      <a:fillRect/>
+                    </a:stretch>
+                  </pic:blipFill>
+                  <pic:spPr bwMode="auto">
+                    <a:xfrm>
+                      <a:off x="0" y="0"/>
+                      <a:ext cx="5334000" cy="2602796"/>
+                    </a:xfrm>
+                    <a:prstGeom prst="rect">
+                      <a:avLst/>
+                    </a:prstGeom>
+                    <a:noFill/>
+                    <a:ln w="9525">
+                      <a:noFill/>
+                      <a:headEnd/>
+                      <a:tailEnd/>
+                    </a:ln>
+                  </pic:spPr>
+                </pic:pic>
+              </a:graphicData>
+            </a:graphic>
+          </wp:inline>
+        </w:drawing>
+      </w:r>
+    </w:p>
+    <w:p>
+      <w:pPr>
+        <w:pStyle w:val="BodyText"/>
+        <w:spacing w:line="360" w:lineRule="auto" w:after="60"/>
+      </w:pPr>
+      <w:r>
+        <w:rPr>
+          <w:rFonts w:hint="eastAsia" w:ascii="Times New Roman" w:hAnsi="Times New Roman" w:cs="Times New Roman" w:eastAsia="宋体"/>
+          <w:b/>
+          <w:bCs/>
+          <w:sz w:val="21"/>
+        </w:rPr>
+        <w:t xml:space="preserve">图3</w:t>
+      </w:r>
+      <w:r>
+        <w:rPr>
+          <w:rFonts w:ascii="Times New Roman" w:hAnsi="Times New Roman" w:cs="Times New Roman" w:eastAsia="宋体"/>
+          <w:b/>
+          <w:bCs/>
+          <w:sz w:val="21"/>
+        </w:rPr>
+        <w:t xml:space="preserve">　</w:t>
+      </w:r>
+      <w:r>
+        <w:rPr>
+          <w:rFonts w:hint="eastAsia" w:ascii="Times New Roman" w:hAnsi="Times New Roman" w:cs="Times New Roman" w:eastAsia="宋体"/>
+          <w:b/>
+          <w:bCs/>
+          <w:sz w:val="21"/>
+        </w:rPr>
+        <w:t xml:space="preserve">GerdQ总分识别GERD复合诊断的ROC曲线（A）及分层似然比（B）</w:t>
+      </w:r>
+    </w:p>
+    <w:p>
+      <w:pPr>
+        <w:pStyle w:val="BodyText"/>
+        <w:spacing w:line="360" w:lineRule="auto" w:after="60"/>
+        <w:ind/>
+      </w:pPr>
+      <w:r>
+        <w:rPr>
+          <w:rFonts w:hint="eastAsia" w:ascii="Times New Roman" w:hAnsi="Times New Roman" w:cs="Times New Roman" w:eastAsia="宋体"/>
+          <w:sz w:val="18"/>
+        </w:rPr>
+        <w:t xml:space="preserve">注：A图各点为≥8~≥12分截断值，红圈为约登指数最大的≥10分；AUC及95%CI为原稿Bootstrap结果；B图误差线为95%CI，括号内为GERD阳性/阴性例数</w:t>
+      </w:r>
+    </w:p>
+    <w:bookmarkEnd w:id="27"/>
+    <w:bookmarkStart w:id="31" w:name="治疗前后症状及体重变化"/>
     <w:p>
       <w:pPr>
         <w:pStyle w:val="Heading3"/>
@@ -8143,7 +8558,7 @@
           <w:rFonts w:hint="eastAsia" w:ascii="Times New Roman" w:hAnsi="Times New Roman" w:cs="Times New Roman" w:eastAsia="宋体"/>
           <w:sz w:val="21"/>
         </w:rPr>
-        <w:t xml:space="preserve">=0.008）。在胃镜阴性的64例中，PPI试验结果与4周症状改善的一致率为57.8%，κ=0.11（95%CI：−0.15~0.36）：PPI试验阳性的40例中14例4周时未改善，PPI试验阴性的24例中13例4周时改善。见表5、图4、图7。</w:t>
+        <w:t xml:space="preserve">=0.008）。在胃镜阴性的64例中，PPI试验结果与4周症状改善的一致率为57.8%，κ=0.11（95%CI：−0.15~0.36）：PPI试验阳性的40例中14例4周时未改善，PPI试验阴性的24例中13例4周时改善。见表5、图4。</w:t>
       </w:r>
     </w:p>
     <w:p>
@@ -8580,6 +8995,22 @@
                 <w:iCs/>
                 <w:sz w:val="18"/>
               </w:rPr>
+              <w:t xml:space="preserve">W</w:t>
+            </w:r>
+            <w:r>
+              <w:rPr>
+                <w:rFonts w:hint="eastAsia" w:ascii="Times New Roman" w:hAnsi="Times New Roman" w:cs="Times New Roman" w:eastAsia="宋体"/>
+                <w:sz w:val="18"/>
+              </w:rPr>
+              <w:t xml:space="preserve">=0，</w:t>
+            </w:r>
+            <w:r>
+              <w:rPr>
+                <w:rFonts w:ascii="Times New Roman" w:hAnsi="Times New Roman" w:cs="Times New Roman" w:eastAsia="宋体"/>
+                <w:i/>
+                <w:iCs/>
+                <w:sz w:val="18"/>
+              </w:rPr>
               <w:t xml:space="preserve">P</w:t>
             </w:r>
             <w:r>
@@ -8862,68 +9293,6 @@
                 <w:rFonts w:hint="eastAsia" w:ascii="Times New Roman" w:hAnsi="Times New Roman" w:cs="Times New Roman" w:eastAsia="宋体"/>
                 <w:sz w:val="18"/>
               </w:rPr>
-              <w:t xml:space="preserve">上腹痛+恶心条目合计（治疗前→治疗后，分）</w:t>
-            </w:r>
-          </w:p>
-        </w:tc>
-        <w:tc>
-          <w:tcPr>
-            <w:tcW w:type="dxa" w:w="2449"/>
-          </w:tcPr>
-          <w:p>
-            <w:pPr>
-              <w:pStyle w:val="Compact"/>
-              <w:spacing w:line="276" w:lineRule="auto" w:after="0"/>
-              <w:ind w:firstLine="0" w:left="0"/>
-              <w:jc w:val="center"/>
-            </w:pPr>
-            <w:r>
-              <w:rPr>
-                <w:rFonts w:ascii="Times New Roman" w:hAnsi="Times New Roman" w:cs="Times New Roman" w:eastAsia="宋体"/>
-                <w:sz w:val="18"/>
-              </w:rPr>
-              <w:t xml:space="preserve">3.95→3.90</w:t>
-            </w:r>
-          </w:p>
-        </w:tc>
-        <w:tc>
-          <w:tcPr>
-            <w:tcW w:type="dxa" w:w="3301"/>
-          </w:tcPr>
-          <w:p>
-            <w:pPr>
-              <w:pStyle w:val="Compact"/>
-              <w:spacing w:line="276" w:lineRule="auto" w:after="0"/>
-              <w:ind w:firstLine="0" w:left="0"/>
-              <w:jc w:val="center"/>
-            </w:pPr>
-            <w:r>
-              <w:rPr>
-                <w:rFonts w:ascii="Times New Roman" w:hAnsi="Times New Roman" w:cs="Times New Roman" w:eastAsia="宋体"/>
-                <w:sz w:val="18"/>
-              </w:rPr>
-              <w:t xml:space="preserve">—</w:t>
-            </w:r>
-          </w:p>
-        </w:tc>
-      </w:tr>
-      <w:tr>
-        <w:tc>
-          <w:tcPr>
-            <w:tcW w:type="dxa" w:w="2981"/>
-          </w:tcPr>
-          <w:p>
-            <w:pPr>
-              <w:pStyle w:val="Compact"/>
-              <w:spacing w:line="276" w:lineRule="auto" w:after="0"/>
-              <w:ind w:firstLine="0" w:left="0"/>
-              <w:jc w:val="center"/>
-            </w:pPr>
-            <w:r>
-              <w:rPr>
-                <w:rFonts w:hint="eastAsia" w:ascii="Times New Roman" w:hAnsi="Times New Roman" w:cs="Times New Roman" w:eastAsia="宋体"/>
-                <w:sz w:val="18"/>
-              </w:rPr>
               <w:t xml:space="preserve">GerdQ总分（治疗前→治疗后，分，</w:t>
             </w:r>
             <m:oMath>
@@ -9044,6 +9413,68 @@
                 <w:rFonts w:hint="eastAsia" w:ascii="Times New Roman" w:hAnsi="Times New Roman" w:cs="Times New Roman" w:eastAsia="宋体"/>
                 <w:sz w:val="18"/>
               </w:rPr>
+              <w:t xml:space="preserve">上腹痛+恶心条目合计（治疗前→治疗后，分）</w:t>
+            </w:r>
+          </w:p>
+        </w:tc>
+        <w:tc>
+          <w:tcPr>
+            <w:tcW w:type="dxa" w:w="2449"/>
+          </w:tcPr>
+          <w:p>
+            <w:pPr>
+              <w:pStyle w:val="Compact"/>
+              <w:spacing w:line="276" w:lineRule="auto" w:after="0"/>
+              <w:ind w:firstLine="0" w:left="0"/>
+              <w:jc w:val="center"/>
+            </w:pPr>
+            <w:r>
+              <w:rPr>
+                <w:rFonts w:ascii="Times New Roman" w:hAnsi="Times New Roman" w:cs="Times New Roman" w:eastAsia="宋体"/>
+                <w:sz w:val="18"/>
+              </w:rPr>
+              <w:t xml:space="preserve">3.95→3.90</w:t>
+            </w:r>
+          </w:p>
+        </w:tc>
+        <w:tc>
+          <w:tcPr>
+            <w:tcW w:type="dxa" w:w="3301"/>
+          </w:tcPr>
+          <w:p>
+            <w:pPr>
+              <w:pStyle w:val="Compact"/>
+              <w:spacing w:line="276" w:lineRule="auto" w:after="0"/>
+              <w:ind w:firstLine="0" w:left="0"/>
+              <w:jc w:val="center"/>
+            </w:pPr>
+            <w:r>
+              <w:rPr>
+                <w:rFonts w:ascii="Times New Roman" w:hAnsi="Times New Roman" w:cs="Times New Roman" w:eastAsia="宋体"/>
+                <w:sz w:val="18"/>
+              </w:rPr>
+              <w:t xml:space="preserve">—</w:t>
+            </w:r>
+          </w:p>
+        </w:tc>
+      </w:tr>
+      <w:tr>
+        <w:tc>
+          <w:tcPr>
+            <w:tcW w:type="dxa" w:w="2981"/>
+          </w:tcPr>
+          <w:p>
+            <w:pPr>
+              <w:pStyle w:val="Compact"/>
+              <w:spacing w:line="276" w:lineRule="auto" w:after="0"/>
+              <w:ind w:firstLine="0" w:left="0"/>
+              <w:jc w:val="center"/>
+            </w:pPr>
+            <w:r>
+              <w:rPr>
+                <w:rFonts w:hint="eastAsia" w:ascii="Times New Roman" w:hAnsi="Times New Roman" w:cs="Times New Roman" w:eastAsia="宋体"/>
+                <w:sz w:val="18"/>
+              </w:rPr>
               <w:t xml:space="preserve">减重幅度（kg，</w:t>
             </w:r>
             <m:oMath>
@@ -9129,17 +9560,117 @@
       <w:pPr>
         <w:pStyle w:val="BodyText"/>
         <w:spacing w:line="360" w:lineRule="auto" w:after="60"/>
+        <w:ind/>
       </w:pPr>
       <w:r>
         <w:rPr>
           <w:rFonts w:hint="eastAsia" w:ascii="Times New Roman" w:hAnsi="Times New Roman" w:cs="Times New Roman" w:eastAsia="宋体"/>
           <w:sz w:val="18"/>
         </w:rPr>
-        <w:t xml:space="preserve">注：4GerdQ为GerdQ第1、2、5、6条得分之和；下降值=治疗前−治疗后</w:t>
+        <w:t xml:space="preserve">注：4GerdQ为GerdQ第1、2、5、6条得分之和；下降值=治疗前−治疗后；率的95%CI采用Wilson法；改善者下降值由全体下降值的均数、标准差及未改善者下降值均为0推算；上腹痛+恶心条目合计=GerdQ总分−4GerdQ</w:t>
       </w:r>
     </w:p>
-    <w:bookmarkEnd w:id="19"/>
-    <w:bookmarkStart w:id="20" w:name="症状改善的相关因素"/>
+    <w:p>
+      <w:pPr>
+        <w:pStyle w:val="BodyText"/>
+        <w:spacing w:line="360" w:lineRule="auto" w:after="60"/>
+      </w:pPr>
+      <w:r>
+        <w:rPr>
+          <w:rFonts w:ascii="Times New Roman" w:hAnsi="Times New Roman" w:cs="Times New Roman" w:eastAsia="宋体"/>
+          <w:sz w:val="21"/>
+        </w:rPr>
+        <w:drawing>
+          <wp:inline>
+            <wp:extent cx="5334000" cy="1897161"/>
+            <wp:effectExtent b="0" l="0" r="0" t="0"/>
+            <wp:docPr descr="" title="" id="29" name="Picture"/>
+            <a:graphic>
+              <a:graphicData uri="http://schemas.openxmlformats.org/drawingml/2006/picture">
+                <pic:pic>
+                  <pic:nvPicPr>
+                    <pic:cNvPr descr="stats/output/figures/图4_治疗前后评分变化及不同诊断路径的疗效.png" id="30" name="Picture"/>
+                    <pic:cNvPicPr>
+                      <a:picLocks noChangeArrowheads="1" noChangeAspect="1"/>
+                    </pic:cNvPicPr>
+                  </pic:nvPicPr>
+                  <pic:blipFill>
+                    <a:blip r:embed="rId28"/>
+                    <a:stretch>
+                      <a:fillRect/>
+                    </a:stretch>
+                  </pic:blipFill>
+                  <pic:spPr bwMode="auto">
+                    <a:xfrm>
+                      <a:off x="0" y="0"/>
+                      <a:ext cx="5334000" cy="1897161"/>
+                    </a:xfrm>
+                    <a:prstGeom prst="rect">
+                      <a:avLst/>
+                    </a:prstGeom>
+                    <a:noFill/>
+                    <a:ln w="9525">
+                      <a:noFill/>
+                      <a:headEnd/>
+                      <a:tailEnd/>
+                    </a:ln>
+                  </pic:spPr>
+                </pic:pic>
+              </a:graphicData>
+            </a:graphic>
+          </wp:inline>
+        </w:drawing>
+      </w:r>
+    </w:p>
+    <w:p>
+      <w:pPr>
+        <w:pStyle w:val="BodyText"/>
+        <w:spacing w:line="360" w:lineRule="auto" w:after="60"/>
+        <w:ind w:firstLine="420"/>
+      </w:pPr>
+      <w:r>
+        <w:rPr>
+          <w:rFonts w:hint="eastAsia" w:ascii="Times New Roman" w:hAnsi="Times New Roman" w:cs="Times New Roman" w:eastAsia="宋体"/>
+          <w:b/>
+          <w:bCs/>
+          <w:sz w:val="21"/>
+        </w:rPr>
+        <w:t xml:space="preserve">图4</w:t>
+      </w:r>
+      <w:r>
+        <w:rPr>
+          <w:rFonts w:ascii="Times New Roman" w:hAnsi="Times New Roman" w:cs="Times New Roman" w:eastAsia="宋体"/>
+          <w:b/>
+          <w:bCs/>
+          <w:sz w:val="21"/>
+        </w:rPr>
+        <w:t xml:space="preserve">　</w:t>
+      </w:r>
+      <w:r>
+        <w:rPr>
+          <w:rFonts w:hint="eastAsia" w:ascii="Times New Roman" w:hAnsi="Times New Roman" w:cs="Times New Roman" w:eastAsia="宋体"/>
+          <w:b/>
+          <w:bCs/>
+          <w:sz w:val="21"/>
+        </w:rPr>
+        <w:t xml:space="preserve">治疗前后GerdQ评分变化（A）、不同诊断路径患者的4周症状改善率（B）及胃镜阴性者PPI试验与4周症状改善的一致性（C）</w:t>
+      </w:r>
+    </w:p>
+    <w:p>
+      <w:pPr>
+        <w:pStyle w:val="BodyText"/>
+        <w:spacing w:line="360" w:lineRule="auto" w:after="60"/>
+      </w:pPr>
+      <w:r>
+        <w:rPr>
+          <w:rFonts w:hint="eastAsia" w:ascii="Times New Roman" w:hAnsi="Times New Roman" w:cs="Times New Roman" w:eastAsia="宋体"/>
+          <w:sz w:val="18"/>
+        </w:rPr>
+        <w:t xml:space="preserve">注：A图为均数±标准差；B图误差线为Wilson法95%CI</w:t>
+      </w:r>
+    </w:p>
+    <w:bookmarkEnd w:id="31"/>
+    <w:bookmarkStart w:id="35" w:name="症状改善的相关因素"/>
     <w:p>
       <w:pPr>
         <w:pStyle w:val="Heading3"/>
@@ -9239,7 +9770,7 @@
           <w:rFonts w:hint="eastAsia" w:ascii="Times New Roman" w:hAnsi="Times New Roman" w:cs="Times New Roman" w:eastAsia="宋体"/>
           <w:sz w:val="21"/>
         </w:rPr>
-        <w:t xml:space="preserve">&gt;0.05）。见表6。</w:t>
+        <w:t xml:space="preserve">&gt;0.05）。见表6、图5。</w:t>
       </w:r>
     </w:p>
     <w:p>
@@ -10905,13 +11436,37 @@
       <w:pPr>
         <w:pStyle w:val="BodyText"/>
         <w:spacing w:line="360" w:lineRule="auto" w:after="60"/>
+        <w:ind/>
       </w:pPr>
       <w:r>
         <w:rPr>
           <w:rFonts w:hint="eastAsia" w:ascii="Times New Roman" w:hAnsi="Times New Roman" w:cs="Times New Roman" w:eastAsia="宋体"/>
           <w:sz w:val="18"/>
         </w:rPr>
-        <w:t xml:space="preserve">注：症状改善定义为治疗后4GerdQ较基线下降≥1分；2×2表χ²值为连续性校正值</w:t>
+        <w:t xml:space="preserve">注：症状改善定义为治疗后4GerdQ较基线下降≥1分；计量资料采用Mann-Whitney</w:t>
+      </w:r>
+      <w:r>
+        <w:rPr>
+          <w:rFonts w:ascii="Times New Roman" w:hAnsi="Times New Roman" w:cs="Times New Roman" w:eastAsia="宋体"/>
+          <w:sz w:val="18"/>
+        </w:rPr>
+        <w:t xml:space="preserve"> </w:t>
+      </w:r>
+      <w:r>
+        <w:rPr>
+          <w:rFonts w:ascii="Times New Roman" w:hAnsi="Times New Roman" w:cs="Times New Roman" w:eastAsia="宋体"/>
+          <w:i/>
+          <w:iCs/>
+          <w:sz w:val="18"/>
+        </w:rPr>
+        <w:t xml:space="preserve">U</w:t>
+      </w:r>
+      <w:r>
+        <w:rPr>
+          <w:rFonts w:hint="eastAsia" w:ascii="Times New Roman" w:hAnsi="Times New Roman" w:cs="Times New Roman" w:eastAsia="宋体"/>
+          <w:sz w:val="18"/>
+        </w:rPr>
+        <w:t xml:space="preserve">检验；计数资料采用χ²检验（2×2表连续性校正）</w:t>
       </w:r>
     </w:p>
     <w:p>
@@ -11043,6 +11598,7 @@
     <w:tbl>
       <w:tblPr>
         <w:jc w:val="center"/>
+        <w:tblLayout w:type="fixed"/>
         <w:tblLook w:firstRow="1" w:lastRow="0" w:firstColumn="0" w:lastColumn="0" w:noHBand="0" w:noVBand="0" w:val="0020"/>
         <w:tblBorders>
           <w:top w:val="single" w:sz="12" w:space="0" w:color="000000"/>
@@ -11056,11 +11612,12 @@
         <w:tblLayout w:type="fixed"/>
       </w:tblPr>
       <w:tblGrid>
-        <w:gridCol w:w="2123"/>
-        <w:gridCol w:w="1415"/>
-        <w:gridCol w:w="1415"/>
-        <w:gridCol w:w="2359"/>
-        <w:gridCol w:w="1415"/>
+        <w:gridCol w:w="1827"/>
+        <w:gridCol w:w="1218"/>
+        <w:gridCol w:w="1218"/>
+        <w:gridCol w:w="1218"/>
+        <w:gridCol w:w="2030"/>
+        <w:gridCol w:w="1218"/>
       </w:tblGrid>
       <w:tr>
         <w:trPr>
@@ -11068,7 +11625,7 @@
         </w:trPr>
         <w:tc>
           <w:tcPr>
-            <w:tcW w:type="dxa" w:w="2124"/>
+            <w:tcW w:type="dxa" w:w="1827"/>
             <w:tcBorders>
               <w:bottom w:val="single" w:sz="6" w:space="0" w:color="000000"/>
             </w:tcBorders>
@@ -11092,7 +11649,7 @@
         </w:tc>
         <w:tc>
           <w:tcPr>
-            <w:tcW w:type="dxa" w:w="1416"/>
+            <w:tcW w:type="dxa" w:w="1218"/>
             <w:tcBorders>
               <w:bottom w:val="single" w:sz="6" w:space="0" w:color="000000"/>
             </w:tcBorders>
@@ -11118,7 +11675,7 @@
         </w:tc>
         <w:tc>
           <w:tcPr>
-            <w:tcW w:type="dxa" w:w="1416"/>
+            <w:tcW w:type="dxa" w:w="1218"/>
             <w:tcBorders>
               <w:bottom w:val="single" w:sz="6" w:space="0" w:color="000000"/>
             </w:tcBorders>
@@ -11144,7 +11701,7 @@
         </w:tc>
         <w:tc>
           <w:tcPr>
-            <w:tcW w:type="dxa" w:w="2360"/>
+            <w:tcW w:type="dxa" w:w="1218"/>
             <w:tcBorders>
               <w:bottom w:val="single" w:sz="6" w:space="0" w:color="000000"/>
             </w:tcBorders>
@@ -11160,25 +11717,15 @@
               <w:rPr>
                 <w:rFonts w:ascii="Times New Roman" w:hAnsi="Times New Roman" w:cs="Times New Roman" w:eastAsia="宋体"/>
                 <w:b/>
-                <w:i/>
-                <w:iCs/>
-                <w:sz w:val="18"/>
-              </w:rPr>
-              <w:t xml:space="preserve">OR</w:t>
-            </w:r>
-            <w:r>
-              <w:rPr>
-                <w:rFonts w:hint="eastAsia" w:ascii="Times New Roman" w:hAnsi="Times New Roman" w:cs="Times New Roman" w:eastAsia="宋体"/>
-                <w:b/>
-                <w:sz w:val="18"/>
-              </w:rPr>
-              <w:t xml:space="preserve">（95%CI）</w:t>
-            </w:r>
-          </w:p>
-        </w:tc>
-        <w:tc>
-          <w:tcPr>
-            <w:tcW w:type="dxa" w:w="1416"/>
+                <w:sz w:val="18"/>
+              </w:rPr>
+              <w:t xml:space="preserve">Wald χ²</w:t>
+            </w:r>
+          </w:p>
+        </w:tc>
+        <w:tc>
+          <w:tcPr>
+            <w:tcW w:type="dxa" w:w="2030"/>
             <w:tcBorders>
               <w:bottom w:val="single" w:sz="6" w:space="0" w:color="000000"/>
             </w:tcBorders>
@@ -11198,6 +11745,40 @@
                 <w:iCs/>
                 <w:sz w:val="18"/>
               </w:rPr>
+              <w:t xml:space="preserve">OR</w:t>
+            </w:r>
+            <w:r>
+              <w:rPr>
+                <w:rFonts w:hint="eastAsia" w:ascii="Times New Roman" w:hAnsi="Times New Roman" w:cs="Times New Roman" w:eastAsia="宋体"/>
+                <w:b/>
+                <w:sz w:val="18"/>
+              </w:rPr>
+              <w:t xml:space="preserve">（95%CI）</w:t>
+            </w:r>
+          </w:p>
+        </w:tc>
+        <w:tc>
+          <w:tcPr>
+            <w:tcW w:type="dxa" w:w="1218"/>
+            <w:tcBorders>
+              <w:bottom w:val="single" w:sz="6" w:space="0" w:color="000000"/>
+            </w:tcBorders>
+          </w:tcPr>
+          <w:p>
+            <w:pPr>
+              <w:pStyle w:val="Compact"/>
+              <w:spacing w:line="276" w:lineRule="auto" w:after="0"/>
+              <w:ind w:firstLine="0" w:left="0"/>
+              <w:jc w:val="center"/>
+            </w:pPr>
+            <w:r>
+              <w:rPr>
+                <w:rFonts w:ascii="Times New Roman" w:hAnsi="Times New Roman" w:cs="Times New Roman" w:eastAsia="宋体"/>
+                <w:b/>
+                <w:i/>
+                <w:iCs/>
+                <w:sz w:val="18"/>
+              </w:rPr>
               <w:t xml:space="preserve">P</w:t>
             </w:r>
             <w:r>
@@ -11214,7 +11795,7 @@
       <w:tr>
         <w:tc>
           <w:tcPr>
-            <w:tcW w:type="dxa" w:w="2124"/>
+            <w:tcW w:type="dxa" w:w="1827"/>
           </w:tcPr>
           <w:p>
             <w:pPr>
@@ -11248,7 +11829,7 @@
         </w:tc>
         <w:tc>
           <w:tcPr>
-            <w:tcW w:type="dxa" w:w="1416"/>
+            <w:tcW w:type="dxa" w:w="1218"/>
           </w:tcPr>
           <w:p>
             <w:pPr>
@@ -11268,7 +11849,7 @@
         </w:tc>
         <w:tc>
           <w:tcPr>
-            <w:tcW w:type="dxa" w:w="1416"/>
+            <w:tcW w:type="dxa" w:w="1218"/>
           </w:tcPr>
           <w:p>
             <w:pPr>
@@ -11288,7 +11869,27 @@
         </w:tc>
         <w:tc>
           <w:tcPr>
-            <w:tcW w:type="dxa" w:w="2360"/>
+            <w:tcW w:type="dxa" w:w="1218"/>
+          </w:tcPr>
+          <w:p>
+            <w:pPr>
+              <w:pStyle w:val="Compact"/>
+              <w:spacing w:line="276" w:lineRule="auto" w:after="0"/>
+              <w:ind w:firstLine="0" w:left="0"/>
+              <w:jc w:val="center"/>
+            </w:pPr>
+            <w:r>
+              <w:rPr>
+                <w:rFonts w:ascii="Times New Roman" w:hAnsi="Times New Roman" w:cs="Times New Roman" w:eastAsia="宋体"/>
+                <w:sz w:val="18"/>
+              </w:rPr>
+              <w:t xml:space="preserve">7.10</w:t>
+            </w:r>
+          </w:p>
+        </w:tc>
+        <w:tc>
+          <w:tcPr>
+            <w:tcW w:type="dxa" w:w="2030"/>
           </w:tcPr>
           <w:p>
             <w:pPr>
@@ -11308,7 +11909,7 @@
         </w:tc>
         <w:tc>
           <w:tcPr>
-            <w:tcW w:type="dxa" w:w="1416"/>
+            <w:tcW w:type="dxa" w:w="1218"/>
           </w:tcPr>
           <w:p>
             <w:pPr>
@@ -11330,7 +11931,7 @@
       <w:tr>
         <w:tc>
           <w:tcPr>
-            <w:tcW w:type="dxa" w:w="2124"/>
+            <w:tcW w:type="dxa" w:w="1827"/>
           </w:tcPr>
           <w:p>
             <w:pPr>
@@ -11350,7 +11951,7 @@
         </w:tc>
         <w:tc>
           <w:tcPr>
-            <w:tcW w:type="dxa" w:w="1416"/>
+            <w:tcW w:type="dxa" w:w="1218"/>
           </w:tcPr>
           <w:p>
             <w:pPr>
@@ -11370,7 +11971,7 @@
         </w:tc>
         <w:tc>
           <w:tcPr>
-            <w:tcW w:type="dxa" w:w="1416"/>
+            <w:tcW w:type="dxa" w:w="1218"/>
           </w:tcPr>
           <w:p>
             <w:pPr>
@@ -11390,7 +11991,27 @@
         </w:tc>
         <w:tc>
           <w:tcPr>
-            <w:tcW w:type="dxa" w:w="2360"/>
+            <w:tcW w:type="dxa" w:w="1218"/>
+          </w:tcPr>
+          <w:p>
+            <w:pPr>
+              <w:pStyle w:val="Compact"/>
+              <w:spacing w:line="276" w:lineRule="auto" w:after="0"/>
+              <w:ind w:firstLine="0" w:left="0"/>
+              <w:jc w:val="center"/>
+            </w:pPr>
+            <w:r>
+              <w:rPr>
+                <w:rFonts w:ascii="Times New Roman" w:hAnsi="Times New Roman" w:cs="Times New Roman" w:eastAsia="宋体"/>
+                <w:sz w:val="18"/>
+              </w:rPr>
+              <w:t xml:space="preserve">4.77</w:t>
+            </w:r>
+          </w:p>
+        </w:tc>
+        <w:tc>
+          <w:tcPr>
+            <w:tcW w:type="dxa" w:w="2030"/>
           </w:tcPr>
           <w:p>
             <w:pPr>
@@ -11410,7 +12031,7 @@
         </w:tc>
         <w:tc>
           <w:tcPr>
-            <w:tcW w:type="dxa" w:w="1416"/>
+            <w:tcW w:type="dxa" w:w="1218"/>
           </w:tcPr>
           <w:p>
             <w:pPr>
@@ -11432,7 +12053,7 @@
       <w:tr>
         <w:tc>
           <w:tcPr>
-            <w:tcW w:type="dxa" w:w="2124"/>
+            <w:tcW w:type="dxa" w:w="1827"/>
           </w:tcPr>
           <w:p>
             <w:pPr>
@@ -11452,7 +12073,7 @@
         </w:tc>
         <w:tc>
           <w:tcPr>
-            <w:tcW w:type="dxa" w:w="1416"/>
+            <w:tcW w:type="dxa" w:w="1218"/>
           </w:tcPr>
           <w:p>
             <w:pPr>
@@ -11472,7 +12093,7 @@
         </w:tc>
         <w:tc>
           <w:tcPr>
-            <w:tcW w:type="dxa" w:w="1416"/>
+            <w:tcW w:type="dxa" w:w="1218"/>
           </w:tcPr>
           <w:p>
             <w:pPr>
@@ -11492,7 +12113,27 @@
         </w:tc>
         <w:tc>
           <w:tcPr>
-            <w:tcW w:type="dxa" w:w="2360"/>
+            <w:tcW w:type="dxa" w:w="1218"/>
+          </w:tcPr>
+          <w:p>
+            <w:pPr>
+              <w:pStyle w:val="Compact"/>
+              <w:spacing w:line="276" w:lineRule="auto" w:after="0"/>
+              <w:ind w:firstLine="0" w:left="0"/>
+              <w:jc w:val="center"/>
+            </w:pPr>
+            <w:r>
+              <w:rPr>
+                <w:rFonts w:ascii="Times New Roman" w:hAnsi="Times New Roman" w:cs="Times New Roman" w:eastAsia="宋体"/>
+                <w:sz w:val="18"/>
+              </w:rPr>
+              <w:t xml:space="preserve">0.93</w:t>
+            </w:r>
+          </w:p>
+        </w:tc>
+        <w:tc>
+          <w:tcPr>
+            <w:tcW w:type="dxa" w:w="2030"/>
           </w:tcPr>
           <w:p>
             <w:pPr>
@@ -11512,7 +12153,7 @@
         </w:tc>
         <w:tc>
           <w:tcPr>
-            <w:tcW w:type="dxa" w:w="1416"/>
+            <w:tcW w:type="dxa" w:w="1218"/>
           </w:tcPr>
           <w:p>
             <w:pPr>
@@ -11559,690 +12200,62 @@
           <w:rFonts w:hint="eastAsia" w:ascii="Times New Roman" w:hAnsi="Times New Roman" w:cs="Times New Roman" w:eastAsia="宋体"/>
           <w:sz w:val="18"/>
         </w:rPr>
-        <w:t xml:space="preserve">&gt;0.10剔除）；未改善组31例，事件数与候选变量数之比约为3.9，结果存在过拟合风险</w:t>
-      </w:r>
-    </w:p>
-    <w:bookmarkEnd w:id="20"/>
-    <w:bookmarkEnd w:id="21"/>
-    <w:bookmarkStart w:id="22" w:name="讨论"/>
-    <w:p>
-      <w:pPr>
-        <w:pStyle w:val="Heading2"/>
-        <w:spacing w:before="240" w:after="120"/>
-      </w:pPr>
-      <w:r>
-        <w:rPr>
-          <w:rFonts w:ascii="Times New Roman" w:hAnsi="Times New Roman" w:cs="Times New Roman" w:eastAsia="黑体"/>
-          <w:b/>
-          <w:color w:val="000000"/>
-          <w:sz w:val="24"/>
-        </w:rPr>
-        <w:t xml:space="preserve">3　</w:t>
-      </w:r>
-      <w:r>
-        <w:rPr>
-          <w:rFonts w:hint="eastAsia" w:ascii="Times New Roman" w:hAnsi="Times New Roman" w:cs="Times New Roman" w:eastAsia="黑体"/>
-          <w:b/>
-          <w:color w:val="000000"/>
-          <w:sz w:val="24"/>
-        </w:rPr>
-        <w:t xml:space="preserve">讨论</w:t>
-      </w:r>
-    </w:p>
-    <w:p>
-      <w:pPr>
-        <w:pStyle w:val="FirstParagraph"/>
-        <w:spacing w:line="360" w:lineRule="auto" w:after="60"/>
-        <w:ind w:firstLine="420"/>
-      </w:pPr>
-      <w:r>
-        <w:rPr>
-          <w:rFonts w:hint="eastAsia" w:ascii="Times New Roman" w:hAnsi="Times New Roman" w:cs="Times New Roman" w:eastAsia="宋体"/>
-          <w:sz w:val="21"/>
-        </w:rPr>
-        <w:t xml:space="preserve">本研究显示，在高原地区长期居住的肥胖伴反流症状就诊患者中，GerdQ总分识别GERD复合诊断的AUC为0.701，与两项Meta分析报告的汇总AUC（0.789和0.705）相近</w:t>
-      </w:r>
-      <w:r>
-        <w:rPr>
-          <w:rFonts w:ascii="Times New Roman" w:hAnsi="Times New Roman" w:cs="Times New Roman" w:eastAsia="宋体"/>
-          <w:sz w:val="21"/>
-          <w:vertAlign w:val="superscript"/>
-        </w:rPr>
-        <w:t xml:space="preserve">[19,20]</w:t>
-      </w:r>
-      <w:r>
-        <w:rPr>
-          <w:rFonts w:hint="eastAsia" w:ascii="Times New Roman" w:hAnsi="Times New Roman" w:cs="Times New Roman" w:eastAsia="宋体"/>
-          <w:sz w:val="21"/>
-        </w:rPr>
-        <w:t xml:space="preserve">，但95%CI下限仅为0.580，判别能力有限。以≥8分为界值时，本组灵敏度为93.7%，特异度仅29.2%，与GerdQ开发研究（灵敏度65%、特异度71%）</w:t>
-      </w:r>
-      <w:r>
-        <w:rPr>
-          <w:rFonts w:ascii="Times New Roman" w:hAnsi="Times New Roman" w:cs="Times New Roman" w:eastAsia="宋体"/>
-          <w:sz w:val="21"/>
-          <w:vertAlign w:val="superscript"/>
-        </w:rPr>
-        <w:t xml:space="preserve">[13]</w:t>
-      </w:r>
-      <w:r>
-        <w:rPr>
-          <w:rFonts w:hint="eastAsia" w:ascii="Times New Roman" w:hAnsi="Times New Roman" w:cs="Times New Roman" w:eastAsia="宋体"/>
-          <w:sz w:val="21"/>
-        </w:rPr>
-        <w:t xml:space="preserve">和韩国验证研究（灵敏度64.9%、特异度71.4%）</w:t>
-      </w:r>
-      <w:r>
-        <w:rPr>
-          <w:rFonts w:ascii="Times New Roman" w:hAnsi="Times New Roman" w:cs="Times New Roman" w:eastAsia="宋体"/>
-          <w:sz w:val="21"/>
-          <w:vertAlign w:val="superscript"/>
-        </w:rPr>
-        <w:t xml:space="preserve">[16]</w:t>
-      </w:r>
-      <w:r>
-        <w:rPr>
-          <w:rFonts w:hint="eastAsia" w:ascii="Times New Roman" w:hAnsi="Times New Roman" w:cs="Times New Roman" w:eastAsia="宋体"/>
-          <w:sz w:val="21"/>
-        </w:rPr>
-        <w:t xml:space="preserve">相比，呈明显的高灵敏度、低特异度模式。主要原因可能有以下几点。第一，本研究仅纳入门诊GerdQ≥7分的肥胖患者，研究人群症状负荷高，88.3%的患者GerdQ≥8分，导致特异度被系统性压低，且无法评价≤7分患者的诊断效能。第二，胃镜阴性者需通过PPI试验确诊，而PPI试验本身特异度不高，韩国研究中以PPI治疗后任何症状改善作为GERD诊断依据的特异度仅为48.6%</w:t>
-      </w:r>
-      <w:r>
-        <w:rPr>
-          <w:rFonts w:ascii="Times New Roman" w:hAnsi="Times New Roman" w:cs="Times New Roman" w:eastAsia="宋体"/>
-          <w:sz w:val="21"/>
-          <w:vertAlign w:val="superscript"/>
-        </w:rPr>
-        <w:t xml:space="preserve">[16]</w:t>
-      </w:r>
-      <w:r>
-        <w:rPr>
-          <w:rFonts w:hint="eastAsia" w:ascii="Times New Roman" w:hAnsi="Times New Roman" w:cs="Times New Roman" w:eastAsia="宋体"/>
-          <w:sz w:val="21"/>
-        </w:rPr>
-        <w:t xml:space="preserve">，复合参考标准可能将部分非GERD患者归为GERD。第三，胃镜阴性不能排除非糜烂性反流病，确诊需依赖反流监测</w:t>
-      </w:r>
-      <w:r>
-        <w:rPr>
-          <w:rFonts w:ascii="Times New Roman" w:hAnsi="Times New Roman" w:cs="Times New Roman" w:eastAsia="宋体"/>
-          <w:sz w:val="21"/>
-          <w:vertAlign w:val="superscript"/>
-        </w:rPr>
-        <w:t xml:space="preserve">[23,24]</w:t>
-      </w:r>
-      <w:r>
-        <w:rPr>
-          <w:rFonts w:hint="eastAsia" w:ascii="Times New Roman" w:hAnsi="Times New Roman" w:cs="Times New Roman" w:eastAsia="宋体"/>
-          <w:sz w:val="21"/>
-        </w:rPr>
-        <w:t xml:space="preserve">；本研究所在地区尚未常规开展24</w:t>
-      </w:r>
-      <w:r>
-        <w:rPr>
-          <w:rFonts w:ascii="Times New Roman" w:hAnsi="Times New Roman" w:cs="Times New Roman" w:eastAsia="宋体"/>
-          <w:sz w:val="21"/>
-        </w:rPr>
-        <w:t xml:space="preserve"> </w:t>
-      </w:r>
-      <w:r>
-        <w:rPr>
-          <w:rFonts w:hint="eastAsia" w:ascii="Times New Roman" w:hAnsi="Times New Roman" w:cs="Times New Roman" w:eastAsia="宋体"/>
-          <w:sz w:val="21"/>
-        </w:rPr>
-        <w:t xml:space="preserve">h食管pH-阻抗监测，无法对复合诊断进行进一步核实。我国多中心研究亦显示，在接受胃镜检查的上消化道症状患者中，GerdQ≥8分者仅30.6%存在反流性食管炎，而GerdQ≤2分者中仍有22.2%存在反流性食管炎</w:t>
-      </w:r>
-      <w:r>
-        <w:rPr>
-          <w:rFonts w:ascii="Times New Roman" w:hAnsi="Times New Roman" w:cs="Times New Roman" w:eastAsia="宋体"/>
-          <w:sz w:val="21"/>
-          <w:vertAlign w:val="superscript"/>
-        </w:rPr>
-        <w:t xml:space="preserve">[17]</w:t>
-      </w:r>
-      <w:r>
-        <w:rPr>
-          <w:rFonts w:hint="eastAsia" w:ascii="Times New Roman" w:hAnsi="Times New Roman" w:cs="Times New Roman" w:eastAsia="宋体"/>
-          <w:sz w:val="21"/>
-        </w:rPr>
-        <w:t xml:space="preserve">。分层似然比分析进一步显示，GerdQ的诊断信息主要集中在两端：7分者GERD可能性明显降低（似然比0.22），≥10分者升高（似然比2.13），而8~9分区间的似然比接近1，基本不改变验前概率。这正是≥8分界值在本组特异度偏低的原因——该界值将信息量很少的8~9分患者全部判为阳性。此外，GerdQ≥10分的比例在胃镜异常者中最高，在胃镜阴性且PPI试验阴性者中最低，而在确诊路径相同的胃镜阴性亚组中，GerdQ识别PPI试验阳性的能力较弱，提示全人群AUC中有相当部分来自胃镜异常者的高评分。因此，GerdQ在本人群中宜作为症状评估和随访工具，可按≤7分、8~9分和≥10分分层解读，而不宜单独用于诊断或排除GERD，临床上仍需结合内镜检查及有条件时的反流监测综合判断</w:t>
-      </w:r>
-      <w:r>
-        <w:rPr>
-          <w:rFonts w:ascii="Times New Roman" w:hAnsi="Times New Roman" w:cs="Times New Roman" w:eastAsia="宋体"/>
-          <w:sz w:val="21"/>
-          <w:vertAlign w:val="superscript"/>
-        </w:rPr>
-        <w:t xml:space="preserve">[18,23]</w:t>
-      </w:r>
-      <w:r>
-        <w:rPr>
-          <w:rFonts w:hint="eastAsia" w:ascii="Times New Roman" w:hAnsi="Times New Roman" w:cs="Times New Roman" w:eastAsia="宋体"/>
-          <w:sz w:val="21"/>
-        </w:rPr>
-        <w:t xml:space="preserve">。由于入组要求GerdQ≥7分，7分组仅12例，上述分层似然比的估计精度有限，需在纳入低分患者的人群中验证。</w:t>
-      </w:r>
-    </w:p>
-    <w:p>
-      <w:pPr>
-        <w:pStyle w:val="BodyText"/>
-        <w:spacing w:line="360" w:lineRule="auto" w:after="60"/>
-        <w:ind w:firstLine="420"/>
-      </w:pPr>
-      <w:r>
-        <w:rPr>
-          <w:rFonts w:hint="eastAsia" w:ascii="Times New Roman" w:hAnsi="Times New Roman" w:cs="Times New Roman" w:eastAsia="宋体"/>
-          <w:sz w:val="21"/>
-        </w:rPr>
-        <w:t xml:space="preserve">本组患者GerdQ≥8分者占88.3%，而胃镜异常仅占37.9%，且胃镜异常的定义包含LA</w:t>
-      </w:r>
-      <w:r>
-        <w:rPr>
-          <w:rFonts w:ascii="Times New Roman" w:hAnsi="Times New Roman" w:cs="Times New Roman" w:eastAsia="宋体"/>
-          <w:sz w:val="21"/>
-        </w:rPr>
-        <w:t xml:space="preserve"> </w:t>
-      </w:r>
-      <w:r>
-        <w:rPr>
-          <w:rFonts w:hint="eastAsia" w:ascii="Times New Roman" w:hAnsi="Times New Roman" w:cs="Times New Roman" w:eastAsia="宋体"/>
-          <w:sz w:val="21"/>
-        </w:rPr>
-        <w:t xml:space="preserve">A级食管炎和食管裂孔疝；如按里昂共识2.0仅以LA</w:t>
-      </w:r>
-      <w:r>
-        <w:rPr>
-          <w:rFonts w:ascii="Times New Roman" w:hAnsi="Times New Roman" w:cs="Times New Roman" w:eastAsia="宋体"/>
-          <w:sz w:val="21"/>
-        </w:rPr>
-        <w:t xml:space="preserve"> </w:t>
-      </w:r>
-      <w:r>
-        <w:rPr>
-          <w:rFonts w:hint="eastAsia" w:ascii="Times New Roman" w:hAnsi="Times New Roman" w:cs="Times New Roman" w:eastAsia="宋体"/>
-          <w:sz w:val="21"/>
-        </w:rPr>
-        <w:t xml:space="preserve">B~D级食管炎作为确证性证据</w:t>
-      </w:r>
-      <w:r>
-        <w:rPr>
-          <w:rFonts w:ascii="Times New Roman" w:hAnsi="Times New Roman" w:cs="Times New Roman" w:eastAsia="宋体"/>
-          <w:sz w:val="21"/>
-          <w:vertAlign w:val="superscript"/>
-        </w:rPr>
-        <w:t xml:space="preserve">[23]</w:t>
-      </w:r>
-      <w:r>
-        <w:rPr>
-          <w:rFonts w:hint="eastAsia" w:ascii="Times New Roman" w:hAnsi="Times New Roman" w:cs="Times New Roman" w:eastAsia="宋体"/>
-          <w:sz w:val="21"/>
-        </w:rPr>
-        <w:t xml:space="preserve">，客观黏膜损伤比例可能更低，但本研究未分别记录各级别例数，无法据此进行敏感性分析。症状负荷与黏膜损伤不一致，一方面与入组标准导致的症状富集有关，另一方面也提示部分患者可能存在非糜烂性反流病、反流高敏感或功能性烧心，需要反流监测加以区分</w:t>
-      </w:r>
-      <w:r>
-        <w:rPr>
-          <w:rFonts w:ascii="Times New Roman" w:hAnsi="Times New Roman" w:cs="Times New Roman" w:eastAsia="宋体"/>
-          <w:sz w:val="21"/>
-          <w:vertAlign w:val="superscript"/>
-        </w:rPr>
-        <w:t xml:space="preserve">[23,25]</w:t>
-      </w:r>
-      <w:r>
-        <w:rPr>
-          <w:rFonts w:hint="eastAsia" w:ascii="Times New Roman" w:hAnsi="Times New Roman" w:cs="Times New Roman" w:eastAsia="宋体"/>
-          <w:sz w:val="21"/>
-        </w:rPr>
-        <w:t xml:space="preserve">。由于本研究未设平原地区或非肥胖对照组，上述特点不能归因于高原环境或肥胖本身。肥胖程度与症状的关系方面，中度肥胖组GerdQ总分高于轻度肥胖组，调整年龄和性别后差异仍存在，但BMI作为连续变量时与GerdQ总分无相关性，且重度肥胖组仅14例、年龄较小，分组差异可能与样本构成有关，不宜据此推断剂量-反应关系。</w:t>
-      </w:r>
-    </w:p>
-    <w:p>
-      <w:pPr>
-        <w:pStyle w:val="BodyText"/>
-        <w:spacing w:line="360" w:lineRule="auto" w:after="60"/>
-        <w:ind w:firstLine="420"/>
-      </w:pPr>
-      <w:r>
-        <w:rPr>
-          <w:rFonts w:hint="eastAsia" w:ascii="Times New Roman" w:hAnsi="Times New Roman" w:cs="Times New Roman" w:eastAsia="宋体"/>
-          <w:sz w:val="21"/>
-        </w:rPr>
-        <w:t xml:space="preserve">本研究中69.9%的患者在4周PPI联合减重管理后4GerdQ下降≥1分。需要指出，该标准阈值较低，GerdQ尚无公认的最小临床重要差值，问卷用于疗效评价时需具备对短期变化的反应度</w:t>
-      </w:r>
-      <w:r>
-        <w:rPr>
-          <w:rFonts w:ascii="Times New Roman" w:hAnsi="Times New Roman" w:cs="Times New Roman" w:eastAsia="宋体"/>
-          <w:sz w:val="21"/>
-          <w:vertAlign w:val="superscript"/>
-        </w:rPr>
-        <w:t xml:space="preserve">[26]</w:t>
-      </w:r>
-      <w:r>
-        <w:rPr>
-          <w:rFonts w:hint="eastAsia" w:ascii="Times New Roman" w:hAnsi="Times New Roman" w:cs="Times New Roman" w:eastAsia="宋体"/>
-          <w:sz w:val="21"/>
-        </w:rPr>
-        <w:t xml:space="preserve">；SAKURAI等</w:t>
-      </w:r>
-      <w:r>
-        <w:rPr>
-          <w:rFonts w:ascii="Times New Roman" w:hAnsi="Times New Roman" w:cs="Times New Roman" w:eastAsia="宋体"/>
-          <w:sz w:val="21"/>
-          <w:vertAlign w:val="superscript"/>
-        </w:rPr>
-        <w:t xml:space="preserve">[14]</w:t>
-      </w:r>
-      <w:r>
-        <w:rPr>
-          <w:rFonts w:hint="eastAsia" w:ascii="Times New Roman" w:hAnsi="Times New Roman" w:cs="Times New Roman" w:eastAsia="宋体"/>
-          <w:sz w:val="21"/>
-        </w:rPr>
-        <w:t xml:space="preserve">采用治疗后第1、2、5、6条得分均≤1分作为症状充分缓解标准，本研究未记录治疗后各条目得分，无法按此标准评价。治疗后4GerdQ≤1分者仅7.8%，提示多数患者仍有残余症状，这与约半数疑似GERD患者对抑酸治疗反应不佳的报道相符</w:t>
-      </w:r>
-      <w:r>
-        <w:rPr>
-          <w:rFonts w:ascii="Times New Roman" w:hAnsi="Times New Roman" w:cs="Times New Roman" w:eastAsia="宋体"/>
-          <w:sz w:val="21"/>
-          <w:vertAlign w:val="superscript"/>
-        </w:rPr>
-        <w:t xml:space="preserve">[25]</w:t>
-      </w:r>
-      <w:r>
-        <w:rPr>
-          <w:rFonts w:hint="eastAsia" w:ascii="Times New Roman" w:hAnsi="Times New Roman" w:cs="Times New Roman" w:eastAsia="宋体"/>
-          <w:sz w:val="21"/>
-        </w:rPr>
-        <w:t xml:space="preserve">。另一方面，GerdQ总分的下降几乎全部来自4个阳性预测条目，上腹痛与恶心条目治疗前后基本不变，与这2个条目用于识别非反流症状的设计一致，也支持以4GerdQ而非总分评价疗效。</w:t>
-      </w:r>
-    </w:p>
-    <w:p>
-      <w:pPr>
-        <w:pStyle w:val="BodyText"/>
-        <w:spacing w:line="360" w:lineRule="auto" w:after="60"/>
-        <w:ind w:firstLine="420"/>
-      </w:pPr>
-      <w:r>
-        <w:rPr>
-          <w:rFonts w:hint="eastAsia" w:ascii="Times New Roman" w:hAnsi="Times New Roman" w:cs="Times New Roman" w:eastAsia="宋体"/>
-          <w:sz w:val="21"/>
-        </w:rPr>
-        <w:t xml:space="preserve">减重幅度与症状改善独立相关（每1</w:t>
-      </w:r>
-      <w:r>
-        <w:rPr>
-          <w:rFonts w:ascii="Times New Roman" w:hAnsi="Times New Roman" w:cs="Times New Roman" w:eastAsia="宋体"/>
-          <w:sz w:val="21"/>
-        </w:rPr>
-        <w:t xml:space="preserve"> </w:t>
-      </w:r>
-      <w:r>
-        <w:rPr>
-          <w:rFonts w:hint="eastAsia" w:ascii="Times New Roman" w:hAnsi="Times New Roman" w:cs="Times New Roman" w:eastAsia="宋体"/>
-          <w:sz w:val="21"/>
-        </w:rPr>
-        <w:t xml:space="preserve">kg，</w:t>
+        <w:t xml:space="preserve">&gt;0.10剔除）；Wald</w:t>
+      </w:r>
+      <w:r>
+        <w:rPr>
+          <w:rFonts w:ascii="Times New Roman" w:hAnsi="Times New Roman" w:cs="Times New Roman" w:eastAsia="宋体"/>
+          <w:sz w:val="18"/>
+        </w:rPr>
+        <w:t xml:space="preserve"> χ²、</w:t>
       </w:r>
       <w:r>
         <w:rPr>
           <w:rFonts w:ascii="Times New Roman" w:hAnsi="Times New Roman" w:cs="Times New Roman" w:eastAsia="宋体"/>
           <w:i/>
           <w:iCs/>
-          <w:sz w:val="21"/>
+          <w:sz w:val="18"/>
         </w:rPr>
         <w:t xml:space="preserve">OR</w:t>
       </w:r>
       <w:r>
         <w:rPr>
           <w:rFonts w:hint="eastAsia" w:ascii="Times New Roman" w:hAnsi="Times New Roman" w:cs="Times New Roman" w:eastAsia="宋体"/>
-          <w:sz w:val="21"/>
-        </w:rPr>
-        <w:t xml:space="preserve">=1.82）。减重可降低腹内压和胃食管交界处压力梯度，从而减少反流</w:t>
-      </w:r>
-      <w:r>
-        <w:rPr>
-          <w:rFonts w:ascii="Times New Roman" w:hAnsi="Times New Roman" w:cs="Times New Roman" w:eastAsia="宋体"/>
-          <w:sz w:val="21"/>
-          <w:vertAlign w:val="superscript"/>
-        </w:rPr>
-        <w:t xml:space="preserve">[5,6]</w:t>
-      </w:r>
-      <w:r>
-        <w:rPr>
-          <w:rFonts w:hint="eastAsia" w:ascii="Times New Roman" w:hAnsi="Times New Roman" w:cs="Times New Roman" w:eastAsia="宋体"/>
-          <w:sz w:val="21"/>
-        </w:rPr>
-        <w:t xml:space="preserve">；ACG指南亦建议超重或肥胖的GERD患者减重以改善症状</w:t>
-      </w:r>
-      <w:r>
-        <w:rPr>
-          <w:rFonts w:ascii="Times New Roman" w:hAnsi="Times New Roman" w:cs="Times New Roman" w:eastAsia="宋体"/>
-          <w:sz w:val="21"/>
-          <w:vertAlign w:val="superscript"/>
-        </w:rPr>
-        <w:t xml:space="preserve">[24]</w:t>
-      </w:r>
-      <w:r>
-        <w:rPr>
-          <w:rFonts w:ascii="Times New Roman" w:hAnsi="Times New Roman" w:cs="Times New Roman" w:eastAsia="宋体"/>
-          <w:sz w:val="21"/>
-        </w:rPr>
-        <w:t xml:space="preserve">。DE </w:t>
-      </w:r>
-      <w:r>
-        <w:rPr>
-          <w:rFonts w:hint="eastAsia" w:ascii="Times New Roman" w:hAnsi="Times New Roman" w:cs="Times New Roman" w:eastAsia="宋体"/>
-          <w:sz w:val="21"/>
-        </w:rPr>
-        <w:t xml:space="preserve">BORTOLI等</w:t>
-      </w:r>
-      <w:r>
-        <w:rPr>
-          <w:rFonts w:ascii="Times New Roman" w:hAnsi="Times New Roman" w:cs="Times New Roman" w:eastAsia="宋体"/>
-          <w:sz w:val="21"/>
-          <w:vertAlign w:val="superscript"/>
-        </w:rPr>
-        <w:t xml:space="preserve">[27]</w:t>
-      </w:r>
-      <w:r>
-        <w:rPr>
-          <w:rFonts w:hint="eastAsia" w:ascii="Times New Roman" w:hAnsi="Times New Roman" w:cs="Times New Roman" w:eastAsia="宋体"/>
-          <w:sz w:val="21"/>
-        </w:rPr>
-        <w:t xml:space="preserve">在有对照的研究中发现，6个月内减重≥10%可减轻GERD症状并减少PPI用量。本研究治疗期减重幅度很小（中位数1.5</w:t>
-      </w:r>
-      <w:r>
-        <w:rPr>
-          <w:rFonts w:ascii="Times New Roman" w:hAnsi="Times New Roman" w:cs="Times New Roman" w:eastAsia="宋体"/>
-          <w:sz w:val="21"/>
-        </w:rPr>
-        <w:t xml:space="preserve"> </w:t>
-      </w:r>
-      <w:r>
-        <w:rPr>
-          <w:rFonts w:hint="eastAsia" w:ascii="Times New Roman" w:hAnsi="Times New Roman" w:cs="Times New Roman" w:eastAsia="宋体"/>
-          <w:sz w:val="21"/>
-        </w:rPr>
-        <w:t xml:space="preserve">kg，约占体重的2%），观察期仅4周，减重与饮食控制、运动及用药依从性同属联合干预，难以分离，减重与症状改善的关联可能部分反映依从性这一共同因素，也可能与饮食调整（如减少酥油茶、青稞酒摄入）的直接作用有关。E值分析显示，减重幅度</w:t>
+          <w:sz w:val="18"/>
+        </w:rPr>
+        <w:t xml:space="preserve">及95%CI由</w:t>
       </w:r>
       <w:r>
         <w:rPr>
           <w:rFonts w:ascii="Times New Roman" w:hAnsi="Times New Roman" w:cs="Times New Roman" w:eastAsia="宋体"/>
           <w:i/>
           <w:iCs/>
-          <w:sz w:val="21"/>
-        </w:rPr>
-        <w:t xml:space="preserve">OR</w:t>
-      </w:r>
-      <w:r>
-        <w:rPr>
-          <w:rFonts w:hint="eastAsia" w:ascii="Times New Roman" w:hAnsi="Times New Roman" w:cs="Times New Roman" w:eastAsia="宋体"/>
-          <w:sz w:val="21"/>
-        </w:rPr>
-        <w:t xml:space="preserve">的95%CI下限对应的E值仅为1.38，即与减重和症状改善均存在约1.4倍关联的未测混杂因素即可使该关联失去统计学意义。减重幅度是治疗期间同步发生的变量，治疗开始前无法获得，因此不能用于治疗前预测疗效，本研究亦未据此构建预测模型。</w:t>
-      </w:r>
-    </w:p>
-    <w:p>
-      <w:pPr>
-        <w:pStyle w:val="BodyText"/>
-        <w:spacing w:line="360" w:lineRule="auto" w:after="60"/>
-        <w:ind w:firstLine="420"/>
-      </w:pPr>
-      <w:r>
-        <w:rPr>
-          <w:rFonts w:hint="eastAsia" w:ascii="Times New Roman" w:hAnsi="Times New Roman" w:cs="Times New Roman" w:eastAsia="宋体"/>
-          <w:sz w:val="21"/>
-        </w:rPr>
-        <w:t xml:space="preserve">胃镜异常者症状改善比例较高（</w:t>
+          <w:sz w:val="18"/>
+        </w:rPr>
+        <w:t xml:space="preserve">β</w:t>
+      </w:r>
+      <w:r>
+        <w:rPr>
+          <w:rFonts w:hint="eastAsia" w:ascii="Times New Roman" w:hAnsi="Times New Roman" w:cs="Times New Roman" w:eastAsia="宋体"/>
+          <w:sz w:val="18"/>
+        </w:rPr>
+        <w:t xml:space="preserve">和</w:t>
       </w:r>
       <w:r>
         <w:rPr>
           <w:rFonts w:ascii="Times New Roman" w:hAnsi="Times New Roman" w:cs="Times New Roman" w:eastAsia="宋体"/>
           <w:i/>
           <w:iCs/>
-          <w:sz w:val="21"/>
-        </w:rPr>
-        <w:t xml:space="preserve">OR</w:t>
-      </w:r>
-      <w:r>
-        <w:rPr>
-          <w:rFonts w:hint="eastAsia" w:ascii="Times New Roman" w:hAnsi="Times New Roman" w:cs="Times New Roman" w:eastAsia="宋体"/>
-          <w:sz w:val="21"/>
-        </w:rPr>
-        <w:t xml:space="preserve">=3.20），可能是由于其症状主要由酸反流和黏膜损伤驱动，对抑酸治疗反应较好；而胃镜阴性者中可能混杂功能性消化不良或非酸相关机制</w:t>
-      </w:r>
-      <w:r>
-        <w:rPr>
-          <w:rFonts w:ascii="Times New Roman" w:hAnsi="Times New Roman" w:cs="Times New Roman" w:eastAsia="宋体"/>
-          <w:sz w:val="21"/>
-          <w:vertAlign w:val="superscript"/>
-        </w:rPr>
-        <w:t xml:space="preserve">[28]</w:t>
-      </w:r>
-      <w:r>
-        <w:rPr>
-          <w:rFonts w:hint="eastAsia" w:ascii="Times New Roman" w:hAnsi="Times New Roman" w:cs="Times New Roman" w:eastAsia="宋体"/>
-          <w:sz w:val="21"/>
-        </w:rPr>
-        <w:t xml:space="preserve">，单纯抑酸效果有限。按诊断路径分层后，症状改善率由胃镜异常者的84.6%依次降至胃镜阴性且PPI试验阳性者的65.0%和PPI试验阴性者的54.2%，呈梯度变化，支持上述解释。值得注意的是，PPI试验阴性者中仍有半数以上在4周时改善，且胃镜阴性者的PPI试验结果与4周症状改善几乎不一致（κ=0.11），可能与两次评价的工具或时间点不同、安慰剂效应和回归均值，以及4GerdQ下降≥1分这一标准较宽松有关，也提示单次PPI试验作为参考标准的可靠性有限。GerdQ将上腹痛和恶心设为阴性预测条目，正是为了区分此类非反流症状</w:t>
-      </w:r>
-      <w:r>
-        <w:rPr>
-          <w:rFonts w:ascii="Times New Roman" w:hAnsi="Times New Roman" w:cs="Times New Roman" w:eastAsia="宋体"/>
-          <w:sz w:val="21"/>
-          <w:vertAlign w:val="superscript"/>
-        </w:rPr>
-        <w:t xml:space="preserve">[13]</w:t>
-      </w:r>
-      <w:r>
-        <w:rPr>
-          <w:rFonts w:hint="eastAsia" w:ascii="Times New Roman" w:hAnsi="Times New Roman" w:cs="Times New Roman" w:eastAsia="宋体"/>
-          <w:sz w:val="21"/>
-        </w:rPr>
-        <w:t xml:space="preserve">，但本研究中上腹痛和恶心条目均未进入多因素模型。</w:t>
-      </w:r>
-    </w:p>
-    <w:p>
-      <w:pPr>
-        <w:pStyle w:val="BodyText"/>
-        <w:spacing w:line="360" w:lineRule="auto" w:after="60"/>
-        <w:ind w:firstLine="420"/>
-      </w:pPr>
-      <w:r>
-        <w:rPr>
-          <w:rFonts w:hint="eastAsia" w:ascii="Times New Roman" w:hAnsi="Times New Roman" w:cs="Times New Roman" w:eastAsia="宋体"/>
-          <w:sz w:val="21"/>
-        </w:rPr>
-        <w:t xml:space="preserve">本研究存在以下局限性：（1）单中心、小样本观察性研究，重度肥胖组仅14例，未改善组仅31例，多因素模型事件数与候选变量数之比偏低，存在过拟合风险；（2）入组要求门诊GerdQ≥7分，存在谱偏倚，GerdQ阳性率不能外推为人群患病率；（3）复合参考标准中PPI试验特异度有限，且与4周症状改善的一致性差，胃镜阳性与阴性患者的确诊路径不同，未行24</w:t>
-      </w:r>
-      <w:r>
-        <w:rPr>
-          <w:rFonts w:ascii="Times New Roman" w:hAnsi="Times New Roman" w:cs="Times New Roman" w:eastAsia="宋体"/>
-          <w:sz w:val="21"/>
-        </w:rPr>
-        <w:t xml:space="preserve"> </w:t>
-      </w:r>
-      <w:r>
-        <w:rPr>
-          <w:rFonts w:hint="eastAsia" w:ascii="Times New Roman" w:hAnsi="Times New Roman" w:cs="Times New Roman" w:eastAsia="宋体"/>
-          <w:sz w:val="21"/>
-        </w:rPr>
-        <w:t xml:space="preserve">h食管pH-阻抗监测，也未分别记录LA分级及食管裂孔疝例数；（4）为无对照的单组前后比较，症状改善不能单独归因于PPI或减重，亦不能排除回归均值和安慰剂效应；治疗后未记录各条目得分，无法按症状充分缓解标准评价疗效；（5）未量化饮食、运动及用药依从性；（6）缺乏平原地区或非肥胖对照组，无法评价高原暴露本身的作用；（7）未保存筛查及排除病例记录，无法评估选择偏倚的程度。</w:t>
-      </w:r>
-    </w:p>
-    <w:bookmarkEnd w:id="22"/>
-    <w:bookmarkStart w:id="23" w:name="结论"/>
-    <w:p>
-      <w:pPr>
-        <w:pStyle w:val="Heading2"/>
-        <w:spacing w:before="240" w:after="120"/>
-      </w:pPr>
-      <w:r>
-        <w:rPr>
-          <w:rFonts w:ascii="Times New Roman" w:hAnsi="Times New Roman" w:cs="Times New Roman" w:eastAsia="黑体"/>
-          <w:b/>
-          <w:color w:val="000000"/>
-          <w:sz w:val="24"/>
-        </w:rPr>
-        <w:t xml:space="preserve">4　</w:t>
-      </w:r>
-      <w:r>
-        <w:rPr>
-          <w:rFonts w:hint="eastAsia" w:ascii="Times New Roman" w:hAnsi="Times New Roman" w:cs="Times New Roman" w:eastAsia="黑体"/>
-          <w:b/>
-          <w:color w:val="000000"/>
-          <w:sz w:val="24"/>
-        </w:rPr>
-        <w:t xml:space="preserve">结论</w:t>
-      </w:r>
-    </w:p>
-    <w:p>
-      <w:pPr>
-        <w:pStyle w:val="FirstParagraph"/>
-        <w:spacing w:line="360" w:lineRule="auto" w:after="60"/>
-        <w:ind w:firstLine="420"/>
-      </w:pPr>
-      <w:r>
-        <w:rPr>
-          <w:rFonts w:hint="eastAsia" w:ascii="Times New Roman" w:hAnsi="Times New Roman" w:cs="Times New Roman" w:eastAsia="宋体"/>
-          <w:sz w:val="21"/>
-        </w:rPr>
-        <w:t xml:space="preserve">在高原地区长期居住的肥胖伴反流症状就诊患者中，GerdQ总分对GERD的判别能力有限，≥8分界值特异度低，8~9分基本不提供诊断信息，不宜单独作为诊断依据，可作为症状评估和随访的辅助工具。4周PPI联合减重管理后多数患者症状有所改善，但残余症状常见；治疗期减重幅度较大和胃镜异常与短期症状改善相关，症状改善率按胃镜异常、胃镜阴性且PPI试验阳性、PPI试验阴性的顺序递减。上述结果尚需设立对照、采用反流监测和标准化疗效评价的多中心前瞻性研究验证。</w:t>
-      </w:r>
-    </w:p>
-    <w:p>
-      <w:pPr>
-        <w:spacing w:line="360" w:lineRule="auto" w:after="60"/>
-      </w:pPr>
-      <w:r>
-        <w:rPr>
-          <w:rFonts w:ascii="Times New Roman" w:hAnsi="Times New Roman" w:cs="Times New Roman" w:eastAsia="宋体"/>
-          <w:sz w:val="21"/>
-        </w:rPr>
-        <w:pict>
-          <v:rect style="width:0;height:1.5pt" o:hralign="center" o:hrstd="t" o:hr="t"/>
-        </w:pict>
-      </w:r>
-    </w:p>
-    <w:p>
-      <w:pPr>
-        <w:pStyle w:val="FirstParagraph"/>
-        <w:spacing w:line="360" w:lineRule="auto" w:after="60"/>
-      </w:pPr>
-      <w:r>
-        <w:rPr>
-          <w:rFonts w:hint="eastAsia" w:ascii="Times New Roman" w:hAnsi="Times New Roman" w:cs="Times New Roman" w:eastAsia="宋体"/>
-          <w:b/>
-          <w:bCs/>
-          <w:sz w:val="21"/>
-        </w:rPr>
-        <w:t xml:space="preserve">利益冲突</w:t>
-      </w:r>
-      <w:r>
-        <w:rPr>
-          <w:rFonts w:ascii="Times New Roman" w:hAnsi="Times New Roman" w:cs="Times New Roman" w:eastAsia="宋体"/>
-          <w:sz w:val="21"/>
-        </w:rPr>
-        <w:t xml:space="preserve">　</w:t>
-      </w:r>
-      <w:r>
-        <w:rPr>
-          <w:rFonts w:hint="eastAsia" w:ascii="Times New Roman" w:hAnsi="Times New Roman" w:cs="Times New Roman" w:eastAsia="宋体"/>
-          <w:sz w:val="21"/>
-        </w:rPr>
-        <w:t xml:space="preserve">所有作者均声明不存在利益冲突。</w:t>
-      </w:r>
-    </w:p>
-    <w:p>
-      <w:pPr>
-        <w:pStyle w:val="BodyText"/>
-        <w:spacing w:line="360" w:lineRule="auto" w:after="60"/>
-        <w:ind w:firstLine="420"/>
-      </w:pPr>
-      <w:r>
-        <w:rPr>
-          <w:rFonts w:hint="eastAsia" w:ascii="Times New Roman" w:hAnsi="Times New Roman" w:cs="Times New Roman" w:eastAsia="宋体"/>
-          <w:b/>
-          <w:bCs/>
-          <w:sz w:val="21"/>
-        </w:rPr>
-        <w:t xml:space="preserve">作者贡献声明</w:t>
-      </w:r>
-      <w:r>
-        <w:rPr>
-          <w:rFonts w:ascii="Times New Roman" w:hAnsi="Times New Roman" w:cs="Times New Roman" w:eastAsia="宋体"/>
-          <w:sz w:val="21"/>
-        </w:rPr>
-        <w:t xml:space="preserve">　</w:t>
-      </w:r>
-      <w:r>
-        <w:rPr>
-          <w:rFonts w:hint="eastAsia" w:ascii="Times New Roman" w:hAnsi="Times New Roman" w:cs="Times New Roman" w:eastAsia="宋体"/>
-          <w:sz w:val="21"/>
-        </w:rPr>
-        <w:t xml:space="preserve">路源：研究设计、数据分析、论文撰写；杨帅通、沈起莲、张成强、李晓峰、戴勇：病例收集、数据整理与核对；姜超：研究指导、论文审阅、经费支持。</w:t>
-      </w:r>
-    </w:p>
-    <w:bookmarkEnd w:id="23"/>
-    <w:bookmarkStart w:id="30" w:name="图题图件由作者按修改要求重新提交"/>
-    <w:p>
-      <w:pPr>
-        <w:pStyle w:val="Heading2"/>
-        <w:spacing w:before="240" w:after="120"/>
-      </w:pPr>
-      <w:r>
-        <w:rPr>
-          <w:rFonts w:hint="eastAsia" w:ascii="Times New Roman" w:hAnsi="Times New Roman" w:cs="Times New Roman" w:eastAsia="黑体"/>
-          <w:b/>
-          <w:color w:val="000000"/>
-          <w:sz w:val="24"/>
-        </w:rPr>
-        <w:t xml:space="preserve">图题（图件由作者按修改要求重新提交）</w:t>
-      </w:r>
-    </w:p>
-    <w:p>
-      <w:pPr>
-        <w:pStyle w:val="FirstParagraph"/>
-        <w:spacing w:line="360" w:lineRule="auto" w:after="60"/>
-        <w:ind w:firstLine="420"/>
-      </w:pPr>
-      <w:r>
-        <w:rPr>
-          <w:rFonts w:hint="eastAsia" w:ascii="Times New Roman" w:hAnsi="Times New Roman" w:cs="Times New Roman" w:eastAsia="宋体"/>
-          <w:b/>
-          <w:bCs/>
-          <w:sz w:val="21"/>
-        </w:rPr>
-        <w:t xml:space="preserve">图1</w:t>
-      </w:r>
-      <w:r>
-        <w:rPr>
-          <w:rFonts w:ascii="Times New Roman" w:hAnsi="Times New Roman" w:cs="Times New Roman" w:eastAsia="宋体"/>
-          <w:b/>
-          <w:bCs/>
-          <w:sz w:val="21"/>
-        </w:rPr>
-        <w:t xml:space="preserve">　</w:t>
-      </w:r>
-      <w:r>
-        <w:rPr>
-          <w:rFonts w:hint="eastAsia" w:ascii="Times New Roman" w:hAnsi="Times New Roman" w:cs="Times New Roman" w:eastAsia="宋体"/>
-          <w:b/>
-          <w:bCs/>
-          <w:sz w:val="21"/>
-        </w:rPr>
-        <w:t xml:space="preserve">基线GerdQ总分分布（A）、各条目得分（B）及条目-总分相关性（C）</w:t>
-      </w:r>
-      <w:r>
-        <w:rPr>
-          <w:rFonts w:ascii="Times New Roman" w:hAnsi="Times New Roman" w:cs="Times New Roman" w:eastAsia="宋体"/>
-          <w:sz w:val="21"/>
-        </w:rPr>
-        <w:t xml:space="preserve">　</w:t>
-      </w:r>
-      <w:r>
-        <w:rPr>
-          <w:rFonts w:hint="eastAsia" w:ascii="Times New Roman" w:hAnsi="Times New Roman" w:cs="Times New Roman" w:eastAsia="宋体"/>
-          <w:sz w:val="21"/>
-        </w:rPr>
-        <w:t xml:space="preserve">（原稿图1；B、C图中"上腹痛""恶心"须标注为反向计分条目）</w:t>
+          <w:sz w:val="18"/>
+        </w:rPr>
+        <w:t xml:space="preserve">SE</w:t>
+      </w:r>
+      <w:r>
+        <w:rPr>
+          <w:rFonts w:hint="eastAsia" w:ascii="Times New Roman" w:hAnsi="Times New Roman" w:cs="Times New Roman" w:eastAsia="宋体"/>
+          <w:sz w:val="18"/>
+        </w:rPr>
+        <w:t xml:space="preserve">重新计算；未改善组31例，事件数与候选变量数之比约为3.9，结果存在过拟合风险</w:t>
       </w:r>
     </w:p>
     <w:p>
@@ -12252,245 +12265,25 @@
       </w:pPr>
       <w:r>
         <w:rPr>
-          <w:rFonts w:hint="eastAsia" w:ascii="Times New Roman" w:hAnsi="Times New Roman" w:cs="Times New Roman" w:eastAsia="宋体"/>
-          <w:b/>
-          <w:bCs/>
-          <w:sz w:val="21"/>
-        </w:rPr>
-        <w:t xml:space="preserve">图2</w:t>
-      </w:r>
-      <w:r>
-        <w:rPr>
-          <w:rFonts w:ascii="Times New Roman" w:hAnsi="Times New Roman" w:cs="Times New Roman" w:eastAsia="宋体"/>
-          <w:b/>
-          <w:bCs/>
-          <w:sz w:val="21"/>
-        </w:rPr>
-        <w:t xml:space="preserve">　</w:t>
-      </w:r>
-      <w:r>
-        <w:rPr>
-          <w:rFonts w:hint="eastAsia" w:ascii="Times New Roman" w:hAnsi="Times New Roman" w:cs="Times New Roman" w:eastAsia="宋体"/>
-          <w:b/>
-          <w:bCs/>
-          <w:sz w:val="21"/>
-        </w:rPr>
-        <w:t xml:space="preserve">不同肥胖程度组基线GerdQ总分比较（A）及BMI与基线GerdQ总分的关系（B）</w:t>
-      </w:r>
-      <w:r>
-        <w:rPr>
-          <w:rFonts w:ascii="Times New Roman" w:hAnsi="Times New Roman" w:cs="Times New Roman" w:eastAsia="宋体"/>
-          <w:sz w:val="21"/>
-        </w:rPr>
-        <w:t xml:space="preserve">　</w:t>
-      </w:r>
-      <w:r>
-        <w:rPr>
-          <w:rFonts w:hint="eastAsia" w:ascii="Times New Roman" w:hAnsi="Times New Roman" w:cs="Times New Roman" w:eastAsia="宋体"/>
-          <w:sz w:val="21"/>
-        </w:rPr>
-        <w:t xml:space="preserve">（原稿图3）</w:t>
-      </w:r>
-    </w:p>
-    <w:p>
-      <w:pPr>
-        <w:pStyle w:val="BodyText"/>
-        <w:spacing w:line="360" w:lineRule="auto" w:after="60"/>
-      </w:pPr>
-      <w:r>
-        <w:rPr>
-          <w:rFonts w:hint="eastAsia" w:ascii="Times New Roman" w:hAnsi="Times New Roman" w:cs="Times New Roman" w:eastAsia="宋体"/>
-          <w:b/>
-          <w:bCs/>
-          <w:sz w:val="21"/>
-        </w:rPr>
-        <w:t xml:space="preserve">图3</w:t>
-      </w:r>
-      <w:r>
-        <w:rPr>
-          <w:rFonts w:ascii="Times New Roman" w:hAnsi="Times New Roman" w:cs="Times New Roman" w:eastAsia="宋体"/>
-          <w:b/>
-          <w:bCs/>
-          <w:sz w:val="21"/>
-        </w:rPr>
-        <w:t xml:space="preserve">　</w:t>
-      </w:r>
-      <w:r>
-        <w:rPr>
-          <w:rFonts w:hint="eastAsia" w:ascii="Times New Roman" w:hAnsi="Times New Roman" w:cs="Times New Roman" w:eastAsia="宋体"/>
-          <w:b/>
-          <w:bCs/>
-          <w:sz w:val="21"/>
-        </w:rPr>
-        <w:t xml:space="preserve">GerdQ总分识别GERD复合诊断（A）和胃镜异常（B）的ROC曲线</w:t>
-      </w:r>
-      <w:r>
-        <w:rPr>
-          <w:rFonts w:ascii="Times New Roman" w:hAnsi="Times New Roman" w:cs="Times New Roman" w:eastAsia="宋体"/>
-          <w:sz w:val="21"/>
-        </w:rPr>
-        <w:t xml:space="preserve">　</w:t>
-      </w:r>
-      <w:r>
-        <w:rPr>
-          <w:rFonts w:hint="eastAsia" w:ascii="Times New Roman" w:hAnsi="Times New Roman" w:cs="Times New Roman" w:eastAsia="宋体"/>
-          <w:sz w:val="21"/>
-        </w:rPr>
-        <w:t xml:space="preserve">（原稿图4）</w:t>
-      </w:r>
-    </w:p>
-    <w:p>
-      <w:pPr>
-        <w:pStyle w:val="BodyText"/>
-        <w:spacing w:line="360" w:lineRule="auto" w:after="60"/>
-      </w:pPr>
-      <w:r>
-        <w:rPr>
-          <w:rFonts w:hint="eastAsia" w:ascii="Times New Roman" w:hAnsi="Times New Roman" w:cs="Times New Roman" w:eastAsia="宋体"/>
-          <w:b/>
-          <w:bCs/>
-          <w:sz w:val="21"/>
-        </w:rPr>
-        <w:t xml:space="preserve">图4</w:t>
-      </w:r>
-      <w:r>
-        <w:rPr>
-          <w:rFonts w:ascii="Times New Roman" w:hAnsi="Times New Roman" w:cs="Times New Roman" w:eastAsia="宋体"/>
-          <w:b/>
-          <w:bCs/>
-          <w:sz w:val="21"/>
-        </w:rPr>
-        <w:t xml:space="preserve">　</w:t>
-      </w:r>
-      <w:r>
-        <w:rPr>
-          <w:rFonts w:hint="eastAsia" w:ascii="Times New Roman" w:hAnsi="Times New Roman" w:cs="Times New Roman" w:eastAsia="宋体"/>
-          <w:b/>
-          <w:bCs/>
-          <w:sz w:val="21"/>
-        </w:rPr>
-        <w:t xml:space="preserve">治疗前后4GerdQ评分变化（A）及减重幅度与4GerdQ下降值的关系（B）</w:t>
-      </w:r>
-      <w:r>
-        <w:rPr>
-          <w:rFonts w:ascii="Times New Roman" w:hAnsi="Times New Roman" w:cs="Times New Roman" w:eastAsia="宋体"/>
-          <w:sz w:val="21"/>
-        </w:rPr>
-        <w:t xml:space="preserve">　</w:t>
-      </w:r>
-      <w:r>
-        <w:rPr>
-          <w:rFonts w:hint="eastAsia" w:ascii="Times New Roman" w:hAnsi="Times New Roman" w:cs="Times New Roman" w:eastAsia="宋体"/>
-          <w:sz w:val="21"/>
-        </w:rPr>
-        <w:t xml:space="preserve">（原稿图5）</w:t>
-      </w:r>
-    </w:p>
-    <w:p>
-      <w:pPr>
-        <w:pStyle w:val="BodyText"/>
-        <w:spacing w:line="360" w:lineRule="auto" w:after="60"/>
-      </w:pPr>
-      <w:r>
-        <w:rPr>
-          <w:rFonts w:hint="eastAsia" w:ascii="Times New Roman" w:hAnsi="Times New Roman" w:cs="Times New Roman" w:eastAsia="宋体"/>
-          <w:b/>
-          <w:bCs/>
-          <w:sz w:val="21"/>
-        </w:rPr>
-        <w:t xml:space="preserve">图5</w:t>
-      </w:r>
-      <w:r>
-        <w:rPr>
-          <w:rFonts w:ascii="Times New Roman" w:hAnsi="Times New Roman" w:cs="Times New Roman" w:eastAsia="宋体"/>
-          <w:b/>
-          <w:bCs/>
-          <w:sz w:val="21"/>
-        </w:rPr>
-        <w:t xml:space="preserve">　</w:t>
-      </w:r>
-      <w:r>
-        <w:rPr>
-          <w:rFonts w:hint="eastAsia" w:ascii="Times New Roman" w:hAnsi="Times New Roman" w:cs="Times New Roman" w:eastAsia="宋体"/>
-          <w:b/>
-          <w:bCs/>
-          <w:sz w:val="21"/>
-        </w:rPr>
-        <w:t xml:space="preserve">症状改善相关因素的单因素和多因素分析结果</w:t>
-      </w:r>
-      <w:r>
-        <w:rPr>
-          <w:rFonts w:ascii="Times New Roman" w:hAnsi="Times New Roman" w:cs="Times New Roman" w:eastAsia="宋体"/>
-          <w:sz w:val="21"/>
-        </w:rPr>
-        <w:t xml:space="preserve">　</w:t>
-      </w:r>
-      <w:r>
-        <w:rPr>
-          <w:rFonts w:hint="eastAsia" w:ascii="Times New Roman" w:hAnsi="Times New Roman" w:cs="Times New Roman" w:eastAsia="宋体"/>
-          <w:sz w:val="21"/>
-        </w:rPr>
-        <w:t xml:space="preserve">（原稿图6；建议改为</w:t>
-      </w:r>
-      <w:r>
-        <w:rPr>
-          <w:rFonts w:ascii="Times New Roman" w:hAnsi="Times New Roman" w:cs="Times New Roman" w:eastAsia="宋体"/>
-          <w:i/>
-          <w:iCs/>
-          <w:sz w:val="21"/>
-        </w:rPr>
-        <w:t xml:space="preserve">OR</w:t>
-      </w:r>
-      <w:r>
-        <w:rPr>
-          <w:rFonts w:hint="eastAsia" w:ascii="Times New Roman" w:hAnsi="Times New Roman" w:cs="Times New Roman" w:eastAsia="宋体"/>
-          <w:sz w:val="21"/>
-        </w:rPr>
-        <w:t xml:space="preserve">及95%CI森林图，替代−log₁₀</w:t>
-      </w:r>
-      <w:r>
-        <w:rPr>
-          <w:rFonts w:ascii="Times New Roman" w:hAnsi="Times New Roman" w:cs="Times New Roman" w:eastAsia="宋体"/>
-          <w:i/>
-          <w:iCs/>
-          <w:sz w:val="21"/>
-        </w:rPr>
-        <w:t xml:space="preserve">P</w:t>
-      </w:r>
-      <w:r>
-        <w:rPr>
-          <w:rFonts w:hint="eastAsia" w:ascii="Times New Roman" w:hAnsi="Times New Roman" w:cs="Times New Roman" w:eastAsia="宋体"/>
-          <w:sz w:val="21"/>
-        </w:rPr>
-        <w:t xml:space="preserve">条形图）</w:t>
-      </w:r>
-    </w:p>
-    <w:p>
-      <w:pPr>
-        <w:pStyle w:val="BodyText"/>
-        <w:spacing w:line="360" w:lineRule="auto" w:after="60"/>
-      </w:pPr>
-      <w:r>
-        <w:rPr>
           <w:rFonts w:ascii="Times New Roman" w:hAnsi="Times New Roman" w:cs="Times New Roman" w:eastAsia="宋体"/>
           <w:sz w:val="21"/>
         </w:rPr>
         <w:drawing>
           <wp:inline>
-            <wp:extent cx="5334000" cy="2133600"/>
+            <wp:extent cx="5334000" cy="2100671"/>
             <wp:effectExtent b="0" l="0" r="0" t="0"/>
-            <wp:docPr descr="" title="" id="25" name="Picture"/>
+            <wp:docPr descr="" title="" id="33" name="Picture"/>
             <a:graphic>
               <a:graphicData uri="http://schemas.openxmlformats.org/drawingml/2006/picture">
                 <pic:pic>
                   <pic:nvPicPr>
-                    <pic:cNvPr descr="data_mining/figures/图A_评分分布与分层似然比.png" id="26" name="Picture"/>
+                    <pic:cNvPr descr="stats/output/figures/图5_症状改善相关因素的OR森林图.png" id="34" name="Picture"/>
                     <pic:cNvPicPr>
                       <a:picLocks noChangeArrowheads="1" noChangeAspect="1"/>
                     </pic:cNvPicPr>
                   </pic:nvPicPr>
                   <pic:blipFill>
-                    <a:blip r:embed="rId24"/>
+                    <a:blip r:embed="rId32"/>
                     <a:stretch>
                       <a:fillRect/>
                     </a:stretch>
@@ -12498,7 +12291,7 @@
                   <pic:spPr bwMode="auto">
                     <a:xfrm>
                       <a:off x="0" y="0"/>
-                      <a:ext cx="5334000" cy="2133600"/>
+                      <a:ext cx="5334000" cy="2100671"/>
                     </a:xfrm>
                     <a:prstGeom prst="rect">
                       <a:avLst/>
@@ -12521,7 +12314,6 @@
       <w:pPr>
         <w:pStyle w:val="BodyText"/>
         <w:spacing w:line="360" w:lineRule="auto" w:after="60"/>
-        <w:ind w:firstLine="420"/>
       </w:pPr>
       <w:r>
         <w:rPr>
@@ -12530,7 +12322,7 @@
           <w:bCs/>
           <w:sz w:val="21"/>
         </w:rPr>
-        <w:t xml:space="preserve">图6</w:t>
+        <w:t xml:space="preserve">图5</w:t>
       </w:r>
       <w:r>
         <w:rPr>
@@ -12548,73 +12340,222 @@
           <w:bCs/>
           <w:sz w:val="21"/>
         </w:rPr>
-        <w:t xml:space="preserve">基线GerdQ总分在GERD复合诊断阳性与阴性者中的分布（A）及分层似然比（B）</w:t>
-      </w:r>
-      <w:r>
-        <w:rPr>
-          <w:rFonts w:ascii="Times New Roman" w:hAnsi="Times New Roman" w:cs="Times New Roman" w:eastAsia="宋体"/>
-          <w:sz w:val="21"/>
-        </w:rPr>
-        <w:t xml:space="preserve">　</w:t>
-      </w:r>
-      <w:r>
-        <w:rPr>
-          <w:rFonts w:hint="eastAsia" w:ascii="Times New Roman" w:hAnsi="Times New Roman" w:cs="Times New Roman" w:eastAsia="宋体"/>
-          <w:sz w:val="21"/>
-        </w:rPr>
-        <w:t xml:space="preserve">（新增；各分值例数由表3截断值结果反推，B图误差线为95%CI）</w:t>
+        <w:t xml:space="preserve">症状改善相关因素的单因素与多因素分析</w:t>
       </w:r>
     </w:p>
     <w:p>
       <w:pPr>
         <w:pStyle w:val="BodyText"/>
         <w:spacing w:line="360" w:lineRule="auto" w:after="60"/>
+        <w:ind/>
       </w:pPr>
       <w:r>
         <w:rPr>
-          <w:rFonts w:ascii="Times New Roman" w:hAnsi="Times New Roman" w:cs="Times New Roman" w:eastAsia="宋体"/>
-          <w:sz w:val="21"/>
-        </w:rPr>
-        <w:drawing>
-          <wp:inline>
-            <wp:extent cx="5334000" cy="2133600"/>
-            <wp:effectExtent b="0" l="0" r="0" t="0"/>
-            <wp:docPr descr="" title="" id="28" name="Picture"/>
-            <a:graphic>
-              <a:graphicData uri="http://schemas.openxmlformats.org/drawingml/2006/picture">
-                <pic:pic>
-                  <pic:nvPicPr>
-                    <pic:cNvPr descr="data_mining/figures/图C_诊断路径与疗效.png" id="29" name="Picture"/>
-                    <pic:cNvPicPr>
-                      <a:picLocks noChangeArrowheads="1" noChangeAspect="1"/>
-                    </pic:cNvPicPr>
-                  </pic:nvPicPr>
-                  <pic:blipFill>
-                    <a:blip r:embed="rId27"/>
-                    <a:stretch>
-                      <a:fillRect/>
-                    </a:stretch>
-                  </pic:blipFill>
-                  <pic:spPr bwMode="auto">
-                    <a:xfrm>
-                      <a:off x="0" y="0"/>
-                      <a:ext cx="5334000" cy="2133600"/>
-                    </a:xfrm>
-                    <a:prstGeom prst="rect">
-                      <a:avLst/>
-                    </a:prstGeom>
-                    <a:noFill/>
-                    <a:ln w="9525">
-                      <a:noFill/>
-                      <a:headEnd/>
-                      <a:tailEnd/>
-                    </a:ln>
-                  </pic:spPr>
-                </pic:pic>
-              </a:graphicData>
-            </a:graphic>
-          </wp:inline>
-        </w:drawing>
+          <w:rFonts w:hint="eastAsia" w:ascii="Times New Roman" w:hAnsi="Times New Roman" w:cs="Times New Roman" w:eastAsia="宋体"/>
+          <w:sz w:val="18"/>
+        </w:rPr>
+        <w:t xml:space="preserve">注：单因素</w:t>
+      </w:r>
+      <w:r>
+        <w:rPr>
+          <w:rFonts w:ascii="Times New Roman" w:hAnsi="Times New Roman" w:cs="Times New Roman" w:eastAsia="宋体"/>
+          <w:i/>
+          <w:iCs/>
+          <w:sz w:val="18"/>
+        </w:rPr>
+        <w:t xml:space="preserve">OR</w:t>
+      </w:r>
+      <w:r>
+        <w:rPr>
+          <w:rFonts w:hint="eastAsia" w:ascii="Times New Roman" w:hAnsi="Times New Roman" w:cs="Times New Roman" w:eastAsia="宋体"/>
+          <w:sz w:val="18"/>
+        </w:rPr>
+        <w:t xml:space="preserve">由表6四格表计算（Woolf法95%CI）；多因素</w:t>
+      </w:r>
+      <w:r>
+        <w:rPr>
+          <w:rFonts w:ascii="Times New Roman" w:hAnsi="Times New Roman" w:cs="Times New Roman" w:eastAsia="宋体"/>
+          <w:i/>
+          <w:iCs/>
+          <w:sz w:val="18"/>
+        </w:rPr>
+        <w:t xml:space="preserve">OR</w:t>
+      </w:r>
+      <w:r>
+        <w:rPr>
+          <w:rFonts w:hint="eastAsia" w:ascii="Times New Roman" w:hAnsi="Times New Roman" w:cs="Times New Roman" w:eastAsia="宋体"/>
+          <w:sz w:val="18"/>
+        </w:rPr>
+        <w:t xml:space="preserve">来自表7最终模型；计量资料无原始数据，未计算单因素</w:t>
+      </w:r>
+      <w:r>
+        <w:rPr>
+          <w:rFonts w:ascii="Times New Roman" w:hAnsi="Times New Roman" w:cs="Times New Roman" w:eastAsia="宋体"/>
+          <w:i/>
+          <w:iCs/>
+          <w:sz w:val="18"/>
+        </w:rPr>
+        <w:t xml:space="preserve">OR</w:t>
+      </w:r>
+    </w:p>
+    <w:bookmarkEnd w:id="35"/>
+    <w:bookmarkEnd w:id="36"/>
+    <w:bookmarkStart w:id="37" w:name="讨论"/>
+    <w:p>
+      <w:pPr>
+        <w:pStyle w:val="Heading2"/>
+        <w:spacing w:before="240" w:after="120"/>
+      </w:pPr>
+      <w:r>
+        <w:rPr>
+          <w:rFonts w:ascii="Times New Roman" w:hAnsi="Times New Roman" w:cs="Times New Roman" w:eastAsia="黑体"/>
+          <w:b/>
+          <w:color w:val="000000"/>
+          <w:sz w:val="24"/>
+        </w:rPr>
+        <w:t xml:space="preserve">3　</w:t>
+      </w:r>
+      <w:r>
+        <w:rPr>
+          <w:rFonts w:hint="eastAsia" w:ascii="Times New Roman" w:hAnsi="Times New Roman" w:cs="Times New Roman" w:eastAsia="黑体"/>
+          <w:b/>
+          <w:color w:val="000000"/>
+          <w:sz w:val="24"/>
+        </w:rPr>
+        <w:t xml:space="preserve">讨论</w:t>
+      </w:r>
+    </w:p>
+    <w:p>
+      <w:pPr>
+        <w:pStyle w:val="FirstParagraph"/>
+        <w:spacing w:line="360" w:lineRule="auto" w:after="60"/>
+        <w:ind w:firstLine="420"/>
+      </w:pPr>
+      <w:r>
+        <w:rPr>
+          <w:rFonts w:hint="eastAsia" w:ascii="Times New Roman" w:hAnsi="Times New Roman" w:cs="Times New Roman" w:eastAsia="宋体"/>
+          <w:sz w:val="21"/>
+        </w:rPr>
+        <w:t xml:space="preserve">本研究显示，在高原地区长期居住的肥胖伴反流症状就诊患者中，GerdQ总分识别GERD复合诊断的AUC为0.701，与两项Meta分析报告的汇总AUC（0.789和0.705）相近</w:t>
+      </w:r>
+      <w:r>
+        <w:rPr>
+          <w:rFonts w:ascii="Times New Roman" w:hAnsi="Times New Roman" w:cs="Times New Roman" w:eastAsia="宋体"/>
+          <w:sz w:val="21"/>
+          <w:vertAlign w:val="superscript"/>
+        </w:rPr>
+        <w:t xml:space="preserve">[19,20]</w:t>
+      </w:r>
+      <w:r>
+        <w:rPr>
+          <w:rFonts w:hint="eastAsia" w:ascii="Times New Roman" w:hAnsi="Times New Roman" w:cs="Times New Roman" w:eastAsia="宋体"/>
+          <w:sz w:val="21"/>
+        </w:rPr>
+        <w:t xml:space="preserve">，但95%CI下限仅为0.580，判别能力有限。以≥8分为界值时，本组灵敏度为93.7%，特异度仅29.2%，与GerdQ开发研究（灵敏度65%、特异度71%）</w:t>
+      </w:r>
+      <w:r>
+        <w:rPr>
+          <w:rFonts w:ascii="Times New Roman" w:hAnsi="Times New Roman" w:cs="Times New Roman" w:eastAsia="宋体"/>
+          <w:sz w:val="21"/>
+          <w:vertAlign w:val="superscript"/>
+        </w:rPr>
+        <w:t xml:space="preserve">[13]</w:t>
+      </w:r>
+      <w:r>
+        <w:rPr>
+          <w:rFonts w:hint="eastAsia" w:ascii="Times New Roman" w:hAnsi="Times New Roman" w:cs="Times New Roman" w:eastAsia="宋体"/>
+          <w:sz w:val="21"/>
+        </w:rPr>
+        <w:t xml:space="preserve">和韩国验证研究（灵敏度64.9%、特异度71.4%）</w:t>
+      </w:r>
+      <w:r>
+        <w:rPr>
+          <w:rFonts w:ascii="Times New Roman" w:hAnsi="Times New Roman" w:cs="Times New Roman" w:eastAsia="宋体"/>
+          <w:sz w:val="21"/>
+          <w:vertAlign w:val="superscript"/>
+        </w:rPr>
+        <w:t xml:space="preserve">[16]</w:t>
+      </w:r>
+      <w:r>
+        <w:rPr>
+          <w:rFonts w:hint="eastAsia" w:ascii="Times New Roman" w:hAnsi="Times New Roman" w:cs="Times New Roman" w:eastAsia="宋体"/>
+          <w:sz w:val="21"/>
+        </w:rPr>
+        <w:t xml:space="preserve">相比，呈明显的高灵敏度、低特异度模式。主要原因可能有以下几点。第一，本研究仅纳入门诊GerdQ≥7分的肥胖患者，研究人群症状负荷高，88.3%的患者GerdQ≥8分，导致特异度被系统性压低，且无法评价≤7分患者的诊断效能。第二，胃镜阴性者需通过PPI试验确诊，而PPI试验本身特异度不高，韩国研究中以PPI治疗后任何症状改善作为GERD诊断依据的特异度仅为48.6%</w:t>
+      </w:r>
+      <w:r>
+        <w:rPr>
+          <w:rFonts w:ascii="Times New Roman" w:hAnsi="Times New Roman" w:cs="Times New Roman" w:eastAsia="宋体"/>
+          <w:sz w:val="21"/>
+          <w:vertAlign w:val="superscript"/>
+        </w:rPr>
+        <w:t xml:space="preserve">[16]</w:t>
+      </w:r>
+      <w:r>
+        <w:rPr>
+          <w:rFonts w:hint="eastAsia" w:ascii="Times New Roman" w:hAnsi="Times New Roman" w:cs="Times New Roman" w:eastAsia="宋体"/>
+          <w:sz w:val="21"/>
+        </w:rPr>
+        <w:t xml:space="preserve">，复合参考标准可能将部分非GERD患者归为GERD。第三，胃镜阴性不能排除非糜烂性反流病，确诊需依赖反流监测</w:t>
+      </w:r>
+      <w:r>
+        <w:rPr>
+          <w:rFonts w:ascii="Times New Roman" w:hAnsi="Times New Roman" w:cs="Times New Roman" w:eastAsia="宋体"/>
+          <w:sz w:val="21"/>
+          <w:vertAlign w:val="superscript"/>
+        </w:rPr>
+        <w:t xml:space="preserve">[23,24]</w:t>
+      </w:r>
+      <w:r>
+        <w:rPr>
+          <w:rFonts w:hint="eastAsia" w:ascii="Times New Roman" w:hAnsi="Times New Roman" w:cs="Times New Roman" w:eastAsia="宋体"/>
+          <w:sz w:val="21"/>
+        </w:rPr>
+        <w:t xml:space="preserve">；本研究所在地区尚未常规开展24</w:t>
+      </w:r>
+      <w:r>
+        <w:rPr>
+          <w:rFonts w:ascii="Times New Roman" w:hAnsi="Times New Roman" w:cs="Times New Roman" w:eastAsia="宋体"/>
+          <w:sz w:val="21"/>
+        </w:rPr>
+        <w:t xml:space="preserve"> </w:t>
+      </w:r>
+      <w:r>
+        <w:rPr>
+          <w:rFonts w:hint="eastAsia" w:ascii="Times New Roman" w:hAnsi="Times New Roman" w:cs="Times New Roman" w:eastAsia="宋体"/>
+          <w:sz w:val="21"/>
+        </w:rPr>
+        <w:t xml:space="preserve">h食管pH-阻抗监测，无法对复合诊断进行进一步核实。我国多中心研究亦显示，在接受胃镜检查的上消化道症状患者中，GerdQ≥8分者仅30.6%存在反流性食管炎，而GerdQ≤2分者中仍有22.2%存在反流性食管炎</w:t>
+      </w:r>
+      <w:r>
+        <w:rPr>
+          <w:rFonts w:ascii="Times New Roman" w:hAnsi="Times New Roman" w:cs="Times New Roman" w:eastAsia="宋体"/>
+          <w:sz w:val="21"/>
+          <w:vertAlign w:val="superscript"/>
+        </w:rPr>
+        <w:t xml:space="preserve">[17]</w:t>
+      </w:r>
+      <w:r>
+        <w:rPr>
+          <w:rFonts w:hint="eastAsia" w:ascii="Times New Roman" w:hAnsi="Times New Roman" w:cs="Times New Roman" w:eastAsia="宋体"/>
+          <w:sz w:val="21"/>
+        </w:rPr>
+        <w:t xml:space="preserve">。分层似然比分析进一步显示，GerdQ的诊断信息主要集中在两端：7分者GERD可能性明显降低（似然比0.22），≥10分者升高（似然比2.13），而8~9分区间的似然比接近1，基本不改变验前概率。这正是≥8分界值在本组特异度偏低的原因——该界值将信息量很少的8~9分患者全部判为阳性。此外，GerdQ≥10分的比例在胃镜异常者中最高，在胃镜阴性且PPI试验阴性者中最低，而在确诊路径相同的胃镜阴性亚组中，GerdQ识别PPI试验阳性的能力较弱，提示全人群AUC中有相当部分来自胃镜异常者的高评分。因此，GerdQ在本人群中宜作为症状评估和随访工具，可按≤7分、8~9分和≥10分分层解读，而不宜单独用于诊断或排除GERD，临床上仍需结合内镜检查及有条件时的反流监测综合判断</w:t>
+      </w:r>
+      <w:r>
+        <w:rPr>
+          <w:rFonts w:ascii="Times New Roman" w:hAnsi="Times New Roman" w:cs="Times New Roman" w:eastAsia="宋体"/>
+          <w:sz w:val="21"/>
+          <w:vertAlign w:val="superscript"/>
+        </w:rPr>
+        <w:t xml:space="preserve">[18,23]</w:t>
+      </w:r>
+      <w:r>
+        <w:rPr>
+          <w:rFonts w:hint="eastAsia" w:ascii="Times New Roman" w:hAnsi="Times New Roman" w:cs="Times New Roman" w:eastAsia="宋体"/>
+          <w:sz w:val="21"/>
+        </w:rPr>
+        <w:t xml:space="preserve">。由于入组要求GerdQ≥7分，7分组仅12例，上述分层似然比的估计精度有限，需在纳入低分患者的人群中验证。</w:t>
       </w:r>
     </w:p>
     <w:p>
@@ -12626,47 +12567,457 @@
       <w:r>
         <w:rPr>
           <w:rFonts w:hint="eastAsia" w:ascii="Times New Roman" w:hAnsi="Times New Roman" w:cs="Times New Roman" w:eastAsia="宋体"/>
+          <w:sz w:val="21"/>
+        </w:rPr>
+        <w:t xml:space="preserve">本组患者GerdQ≥8分者占88.3%，而胃镜异常仅占37.9%，且胃镜异常的定义包含LA</w:t>
+      </w:r>
+      <w:r>
+        <w:rPr>
+          <w:rFonts w:ascii="Times New Roman" w:hAnsi="Times New Roman" w:cs="Times New Roman" w:eastAsia="宋体"/>
+          <w:sz w:val="21"/>
+        </w:rPr>
+        <w:t xml:space="preserve"> </w:t>
+      </w:r>
+      <w:r>
+        <w:rPr>
+          <w:rFonts w:hint="eastAsia" w:ascii="Times New Roman" w:hAnsi="Times New Roman" w:cs="Times New Roman" w:eastAsia="宋体"/>
+          <w:sz w:val="21"/>
+        </w:rPr>
+        <w:t xml:space="preserve">A级食管炎和食管裂孔疝；如按里昂共识2.0仅以LA</w:t>
+      </w:r>
+      <w:r>
+        <w:rPr>
+          <w:rFonts w:ascii="Times New Roman" w:hAnsi="Times New Roman" w:cs="Times New Roman" w:eastAsia="宋体"/>
+          <w:sz w:val="21"/>
+        </w:rPr>
+        <w:t xml:space="preserve"> </w:t>
+      </w:r>
+      <w:r>
+        <w:rPr>
+          <w:rFonts w:hint="eastAsia" w:ascii="Times New Roman" w:hAnsi="Times New Roman" w:cs="Times New Roman" w:eastAsia="宋体"/>
+          <w:sz w:val="21"/>
+        </w:rPr>
+        <w:t xml:space="preserve">B~D级食管炎作为确证性证据</w:t>
+      </w:r>
+      <w:r>
+        <w:rPr>
+          <w:rFonts w:ascii="Times New Roman" w:hAnsi="Times New Roman" w:cs="Times New Roman" w:eastAsia="宋体"/>
+          <w:sz w:val="21"/>
+          <w:vertAlign w:val="superscript"/>
+        </w:rPr>
+        <w:t xml:space="preserve">[23]</w:t>
+      </w:r>
+      <w:r>
+        <w:rPr>
+          <w:rFonts w:hint="eastAsia" w:ascii="Times New Roman" w:hAnsi="Times New Roman" w:cs="Times New Roman" w:eastAsia="宋体"/>
+          <w:sz w:val="21"/>
+        </w:rPr>
+        <w:t xml:space="preserve">，客观黏膜损伤比例可能更低，但本研究未分别记录各级别例数，无法据此进行敏感性分析。症状负荷与黏膜损伤不一致，一方面与入组标准导致的症状富集有关，另一方面也提示部分患者可能存在非糜烂性反流病、反流高敏感或功能性烧心，需要反流监测加以区分</w:t>
+      </w:r>
+      <w:r>
+        <w:rPr>
+          <w:rFonts w:ascii="Times New Roman" w:hAnsi="Times New Roman" w:cs="Times New Roman" w:eastAsia="宋体"/>
+          <w:sz w:val="21"/>
+          <w:vertAlign w:val="superscript"/>
+        </w:rPr>
+        <w:t xml:space="preserve">[23,25]</w:t>
+      </w:r>
+      <w:r>
+        <w:rPr>
+          <w:rFonts w:hint="eastAsia" w:ascii="Times New Roman" w:hAnsi="Times New Roman" w:cs="Times New Roman" w:eastAsia="宋体"/>
+          <w:sz w:val="21"/>
+        </w:rPr>
+        <w:t xml:space="preserve">。由于本研究未设平原地区或非肥胖对照组，上述特点不能归因于高原环境或肥胖本身。肥胖程度与症状的关系方面，中度肥胖组GerdQ总分高于轻度肥胖组，调整年龄和性别后差异仍存在，但BMI作为连续变量时与GerdQ总分无相关性，且重度肥胖组仅14例、年龄较小，分组差异可能与样本构成有关，不宜据此推断剂量-反应关系。</w:t>
+      </w:r>
+    </w:p>
+    <w:p>
+      <w:pPr>
+        <w:pStyle w:val="BodyText"/>
+        <w:spacing w:line="360" w:lineRule="auto" w:after="60"/>
+        <w:ind w:firstLine="420"/>
+      </w:pPr>
+      <w:r>
+        <w:rPr>
+          <w:rFonts w:hint="eastAsia" w:ascii="Times New Roman" w:hAnsi="Times New Roman" w:cs="Times New Roman" w:eastAsia="宋体"/>
+          <w:sz w:val="21"/>
+        </w:rPr>
+        <w:t xml:space="preserve">本研究中69.9%的患者在4周PPI联合减重管理后4GerdQ下降≥1分。需要指出，该标准阈值较低，GerdQ尚无公认的最小临床重要差值，问卷用于疗效评价时需具备对短期变化的反应度</w:t>
+      </w:r>
+      <w:r>
+        <w:rPr>
+          <w:rFonts w:ascii="Times New Roman" w:hAnsi="Times New Roman" w:cs="Times New Roman" w:eastAsia="宋体"/>
+          <w:sz w:val="21"/>
+          <w:vertAlign w:val="superscript"/>
+        </w:rPr>
+        <w:t xml:space="preserve">[26]</w:t>
+      </w:r>
+      <w:r>
+        <w:rPr>
+          <w:rFonts w:hint="eastAsia" w:ascii="Times New Roman" w:hAnsi="Times New Roman" w:cs="Times New Roman" w:eastAsia="宋体"/>
+          <w:sz w:val="21"/>
+        </w:rPr>
+        <w:t xml:space="preserve">；SAKURAI等</w:t>
+      </w:r>
+      <w:r>
+        <w:rPr>
+          <w:rFonts w:ascii="Times New Roman" w:hAnsi="Times New Roman" w:cs="Times New Roman" w:eastAsia="宋体"/>
+          <w:sz w:val="21"/>
+          <w:vertAlign w:val="superscript"/>
+        </w:rPr>
+        <w:t xml:space="preserve">[14]</w:t>
+      </w:r>
+      <w:r>
+        <w:rPr>
+          <w:rFonts w:hint="eastAsia" w:ascii="Times New Roman" w:hAnsi="Times New Roman" w:cs="Times New Roman" w:eastAsia="宋体"/>
+          <w:sz w:val="21"/>
+        </w:rPr>
+        <w:t xml:space="preserve">采用治疗后第1、2、5、6条得分均≤1分作为症状充分缓解标准，本研究未记录治疗后各条目得分，无法按此标准评价。治疗后4GerdQ≤1分者仅7.8%，提示多数患者仍有残余症状，这与约半数疑似GERD患者对抑酸治疗反应不佳的报道相符</w:t>
+      </w:r>
+      <w:r>
+        <w:rPr>
+          <w:rFonts w:ascii="Times New Roman" w:hAnsi="Times New Roman" w:cs="Times New Roman" w:eastAsia="宋体"/>
+          <w:sz w:val="21"/>
+          <w:vertAlign w:val="superscript"/>
+        </w:rPr>
+        <w:t xml:space="preserve">[25]</w:t>
+      </w:r>
+      <w:r>
+        <w:rPr>
+          <w:rFonts w:hint="eastAsia" w:ascii="Times New Roman" w:hAnsi="Times New Roman" w:cs="Times New Roman" w:eastAsia="宋体"/>
+          <w:sz w:val="21"/>
+        </w:rPr>
+        <w:t xml:space="preserve">。另一方面，GerdQ总分的下降几乎全部来自4个阳性预测条目，上腹痛与恶心条目治疗前后基本不变，与这2个条目用于识别非反流症状的设计一致，也支持以4GerdQ而非总分评价疗效。</w:t>
+      </w:r>
+    </w:p>
+    <w:p>
+      <w:pPr>
+        <w:pStyle w:val="BodyText"/>
+        <w:spacing w:line="360" w:lineRule="auto" w:after="60"/>
+        <w:ind w:firstLine="420"/>
+      </w:pPr>
+      <w:r>
+        <w:rPr>
+          <w:rFonts w:hint="eastAsia" w:ascii="Times New Roman" w:hAnsi="Times New Roman" w:cs="Times New Roman" w:eastAsia="宋体"/>
+          <w:sz w:val="21"/>
+        </w:rPr>
+        <w:t xml:space="preserve">减重幅度与症状改善独立相关（每1</w:t>
+      </w:r>
+      <w:r>
+        <w:rPr>
+          <w:rFonts w:ascii="Times New Roman" w:hAnsi="Times New Roman" w:cs="Times New Roman" w:eastAsia="宋体"/>
+          <w:sz w:val="21"/>
+        </w:rPr>
+        <w:t xml:space="preserve"> </w:t>
+      </w:r>
+      <w:r>
+        <w:rPr>
+          <w:rFonts w:hint="eastAsia" w:ascii="Times New Roman" w:hAnsi="Times New Roman" w:cs="Times New Roman" w:eastAsia="宋体"/>
+          <w:sz w:val="21"/>
+        </w:rPr>
+        <w:t xml:space="preserve">kg，</w:t>
+      </w:r>
+      <w:r>
+        <w:rPr>
+          <w:rFonts w:ascii="Times New Roman" w:hAnsi="Times New Roman" w:cs="Times New Roman" w:eastAsia="宋体"/>
+          <w:i/>
+          <w:iCs/>
+          <w:sz w:val="21"/>
+        </w:rPr>
+        <w:t xml:space="preserve">OR</w:t>
+      </w:r>
+      <w:r>
+        <w:rPr>
+          <w:rFonts w:hint="eastAsia" w:ascii="Times New Roman" w:hAnsi="Times New Roman" w:cs="Times New Roman" w:eastAsia="宋体"/>
+          <w:sz w:val="21"/>
+        </w:rPr>
+        <w:t xml:space="preserve">=1.82）。减重可降低腹内压和胃食管交界处压力梯度，从而减少反流</w:t>
+      </w:r>
+      <w:r>
+        <w:rPr>
+          <w:rFonts w:ascii="Times New Roman" w:hAnsi="Times New Roman" w:cs="Times New Roman" w:eastAsia="宋体"/>
+          <w:sz w:val="21"/>
+          <w:vertAlign w:val="superscript"/>
+        </w:rPr>
+        <w:t xml:space="preserve">[5,6]</w:t>
+      </w:r>
+      <w:r>
+        <w:rPr>
+          <w:rFonts w:hint="eastAsia" w:ascii="Times New Roman" w:hAnsi="Times New Roman" w:cs="Times New Roman" w:eastAsia="宋体"/>
+          <w:sz w:val="21"/>
+        </w:rPr>
+        <w:t xml:space="preserve">；ACG指南亦建议超重或肥胖的GERD患者减重以改善症状</w:t>
+      </w:r>
+      <w:r>
+        <w:rPr>
+          <w:rFonts w:ascii="Times New Roman" w:hAnsi="Times New Roman" w:cs="Times New Roman" w:eastAsia="宋体"/>
+          <w:sz w:val="21"/>
+          <w:vertAlign w:val="superscript"/>
+        </w:rPr>
+        <w:t xml:space="preserve">[24]</w:t>
+      </w:r>
+      <w:r>
+        <w:rPr>
+          <w:rFonts w:ascii="Times New Roman" w:hAnsi="Times New Roman" w:cs="Times New Roman" w:eastAsia="宋体"/>
+          <w:sz w:val="21"/>
+        </w:rPr>
+        <w:t xml:space="preserve">。DE </w:t>
+      </w:r>
+      <w:r>
+        <w:rPr>
+          <w:rFonts w:hint="eastAsia" w:ascii="Times New Roman" w:hAnsi="Times New Roman" w:cs="Times New Roman" w:eastAsia="宋体"/>
+          <w:sz w:val="21"/>
+        </w:rPr>
+        <w:t xml:space="preserve">BORTOLI等</w:t>
+      </w:r>
+      <w:r>
+        <w:rPr>
+          <w:rFonts w:ascii="Times New Roman" w:hAnsi="Times New Roman" w:cs="Times New Roman" w:eastAsia="宋体"/>
+          <w:sz w:val="21"/>
+          <w:vertAlign w:val="superscript"/>
+        </w:rPr>
+        <w:t xml:space="preserve">[27]</w:t>
+      </w:r>
+      <w:r>
+        <w:rPr>
+          <w:rFonts w:hint="eastAsia" w:ascii="Times New Roman" w:hAnsi="Times New Roman" w:cs="Times New Roman" w:eastAsia="宋体"/>
+          <w:sz w:val="21"/>
+        </w:rPr>
+        <w:t xml:space="preserve">在有对照的研究中发现，6个月内减重≥10%可减轻GERD症状并减少PPI用量。本研究治疗期减重幅度很小（中位数1.5</w:t>
+      </w:r>
+      <w:r>
+        <w:rPr>
+          <w:rFonts w:ascii="Times New Roman" w:hAnsi="Times New Roman" w:cs="Times New Roman" w:eastAsia="宋体"/>
+          <w:sz w:val="21"/>
+        </w:rPr>
+        <w:t xml:space="preserve"> </w:t>
+      </w:r>
+      <w:r>
+        <w:rPr>
+          <w:rFonts w:hint="eastAsia" w:ascii="Times New Roman" w:hAnsi="Times New Roman" w:cs="Times New Roman" w:eastAsia="宋体"/>
+          <w:sz w:val="21"/>
+        </w:rPr>
+        <w:t xml:space="preserve">kg，约占体重的2%），观察期仅4周，减重与饮食控制、运动及用药依从性同属联合干预，难以分离，减重与症状改善的关联可能部分反映依从性这一共同因素，也可能与饮食调整（如减少酥油茶、青稞酒摄入）的直接作用有关。E值分析显示，减重幅度</w:t>
+      </w:r>
+      <w:r>
+        <w:rPr>
+          <w:rFonts w:ascii="Times New Roman" w:hAnsi="Times New Roman" w:cs="Times New Roman" w:eastAsia="宋体"/>
+          <w:i/>
+          <w:iCs/>
+          <w:sz w:val="21"/>
+        </w:rPr>
+        <w:t xml:space="preserve">OR</w:t>
+      </w:r>
+      <w:r>
+        <w:rPr>
+          <w:rFonts w:hint="eastAsia" w:ascii="Times New Roman" w:hAnsi="Times New Roman" w:cs="Times New Roman" w:eastAsia="宋体"/>
+          <w:sz w:val="21"/>
+        </w:rPr>
+        <w:t xml:space="preserve">的95%CI下限对应的E值仅为1.38，即与减重和症状改善均存在约1.4倍关联的未测混杂因素即可使该关联失去统计学意义。减重幅度是治疗期间同步发生的变量，治疗开始前无法获得，因此不能用于治疗前预测疗效，本研究亦未据此构建预测模型。</w:t>
+      </w:r>
+    </w:p>
+    <w:p>
+      <w:pPr>
+        <w:pStyle w:val="BodyText"/>
+        <w:spacing w:line="360" w:lineRule="auto" w:after="60"/>
+        <w:ind w:firstLine="420"/>
+      </w:pPr>
+      <w:r>
+        <w:rPr>
+          <w:rFonts w:hint="eastAsia" w:ascii="Times New Roman" w:hAnsi="Times New Roman" w:cs="Times New Roman" w:eastAsia="宋体"/>
+          <w:sz w:val="21"/>
+        </w:rPr>
+        <w:t xml:space="preserve">胃镜异常者症状改善比例较高（</w:t>
+      </w:r>
+      <w:r>
+        <w:rPr>
+          <w:rFonts w:ascii="Times New Roman" w:hAnsi="Times New Roman" w:cs="Times New Roman" w:eastAsia="宋体"/>
+          <w:i/>
+          <w:iCs/>
+          <w:sz w:val="21"/>
+        </w:rPr>
+        <w:t xml:space="preserve">OR</w:t>
+      </w:r>
+      <w:r>
+        <w:rPr>
+          <w:rFonts w:hint="eastAsia" w:ascii="Times New Roman" w:hAnsi="Times New Roman" w:cs="Times New Roman" w:eastAsia="宋体"/>
+          <w:sz w:val="21"/>
+        </w:rPr>
+        <w:t xml:space="preserve">=3.20），可能是由于其症状主要由酸反流和黏膜损伤驱动，对抑酸治疗反应较好；而胃镜阴性者中可能混杂功能性消化不良或非酸相关机制</w:t>
+      </w:r>
+      <w:r>
+        <w:rPr>
+          <w:rFonts w:ascii="Times New Roman" w:hAnsi="Times New Roman" w:cs="Times New Roman" w:eastAsia="宋体"/>
+          <w:sz w:val="21"/>
+          <w:vertAlign w:val="superscript"/>
+        </w:rPr>
+        <w:t xml:space="preserve">[28]</w:t>
+      </w:r>
+      <w:r>
+        <w:rPr>
+          <w:rFonts w:hint="eastAsia" w:ascii="Times New Roman" w:hAnsi="Times New Roman" w:cs="Times New Roman" w:eastAsia="宋体"/>
+          <w:sz w:val="21"/>
+        </w:rPr>
+        <w:t xml:space="preserve">，单纯抑酸效果有限。按诊断路径分层后，症状改善率由胃镜异常者的84.6%依次降至胃镜阴性且PPI试验阳性者的65.0%和PPI试验阴性者的54.2%，呈梯度变化，支持上述解释。值得注意的是，PPI试验阴性者中仍有半数以上在4周时改善，且胃镜阴性者的PPI试验结果与4周症状改善几乎不一致（κ=0.11），可能与两次评价的工具或时间点不同、安慰剂效应和回归均值，以及4GerdQ下降≥1分这一标准较宽松有关，也提示单次PPI试验作为参考标准的可靠性有限。GerdQ将上腹痛和恶心设为阴性预测条目，正是为了区分此类非反流症状</w:t>
+      </w:r>
+      <w:r>
+        <w:rPr>
+          <w:rFonts w:ascii="Times New Roman" w:hAnsi="Times New Roman" w:cs="Times New Roman" w:eastAsia="宋体"/>
+          <w:sz w:val="21"/>
+          <w:vertAlign w:val="superscript"/>
+        </w:rPr>
+        <w:t xml:space="preserve">[13]</w:t>
+      </w:r>
+      <w:r>
+        <w:rPr>
+          <w:rFonts w:hint="eastAsia" w:ascii="Times New Roman" w:hAnsi="Times New Roman" w:cs="Times New Roman" w:eastAsia="宋体"/>
+          <w:sz w:val="21"/>
+        </w:rPr>
+        <w:t xml:space="preserve">，但本研究中上腹痛和恶心条目均未进入多因素模型。</w:t>
+      </w:r>
+    </w:p>
+    <w:p>
+      <w:pPr>
+        <w:pStyle w:val="BodyText"/>
+        <w:spacing w:line="360" w:lineRule="auto" w:after="60"/>
+        <w:ind w:firstLine="420"/>
+      </w:pPr>
+      <w:r>
+        <w:rPr>
+          <w:rFonts w:hint="eastAsia" w:ascii="Times New Roman" w:hAnsi="Times New Roman" w:cs="Times New Roman" w:eastAsia="宋体"/>
+          <w:sz w:val="21"/>
+        </w:rPr>
+        <w:t xml:space="preserve">本研究存在以下局限性：（1）单中心、小样本观察性研究，重度肥胖组仅14例，未改善组仅31例，多因素模型事件数与候选变量数之比偏低，存在过拟合风险；（2）入组要求门诊GerdQ≥7分，存在谱偏倚，GerdQ阳性率不能外推为人群患病率；（3）复合参考标准中PPI试验特异度有限，且与4周症状改善的一致性差，胃镜阳性与阴性患者的确诊路径不同，未行24</w:t>
+      </w:r>
+      <w:r>
+        <w:rPr>
+          <w:rFonts w:ascii="Times New Roman" w:hAnsi="Times New Roman" w:cs="Times New Roman" w:eastAsia="宋体"/>
+          <w:sz w:val="21"/>
+        </w:rPr>
+        <w:t xml:space="preserve"> </w:t>
+      </w:r>
+      <w:r>
+        <w:rPr>
+          <w:rFonts w:hint="eastAsia" w:ascii="Times New Roman" w:hAnsi="Times New Roman" w:cs="Times New Roman" w:eastAsia="宋体"/>
+          <w:sz w:val="21"/>
+        </w:rPr>
+        <w:t xml:space="preserve">h食管pH-阻抗监测，也未分别记录LA分级及食管裂孔疝例数；（4）为无对照的单组前后比较，症状改善不能单独归因于PPI或减重，亦不能排除回归均值和安慰剂效应；治疗后未记录各条目得分，无法按症状充分缓解标准评价疗效；（5）未量化饮食、运动及用药依从性；（6）缺乏平原地区或非肥胖对照组，无法评价高原暴露本身的作用；（7）未保存筛查及排除病例记录，无法评估选择偏倚的程度。</w:t>
+      </w:r>
+    </w:p>
+    <w:bookmarkEnd w:id="37"/>
+    <w:bookmarkStart w:id="38" w:name="结论"/>
+    <w:p>
+      <w:pPr>
+        <w:pStyle w:val="Heading2"/>
+        <w:spacing w:before="240" w:after="120"/>
+      </w:pPr>
+      <w:r>
+        <w:rPr>
+          <w:rFonts w:ascii="Times New Roman" w:hAnsi="Times New Roman" w:cs="Times New Roman" w:eastAsia="黑体"/>
+          <w:b/>
+          <w:color w:val="000000"/>
+          <w:sz w:val="24"/>
+        </w:rPr>
+        <w:t xml:space="preserve">4　</w:t>
+      </w:r>
+      <w:r>
+        <w:rPr>
+          <w:rFonts w:hint="eastAsia" w:ascii="Times New Roman" w:hAnsi="Times New Roman" w:cs="Times New Roman" w:eastAsia="黑体"/>
+          <w:b/>
+          <w:color w:val="000000"/>
+          <w:sz w:val="24"/>
+        </w:rPr>
+        <w:t xml:space="preserve">结论</w:t>
+      </w:r>
+    </w:p>
+    <w:p>
+      <w:pPr>
+        <w:pStyle w:val="FirstParagraph"/>
+        <w:spacing w:line="360" w:lineRule="auto" w:after="60"/>
+        <w:ind w:firstLine="420"/>
+      </w:pPr>
+      <w:r>
+        <w:rPr>
+          <w:rFonts w:hint="eastAsia" w:ascii="Times New Roman" w:hAnsi="Times New Roman" w:cs="Times New Roman" w:eastAsia="宋体"/>
+          <w:sz w:val="21"/>
+        </w:rPr>
+        <w:t xml:space="preserve">在高原地区长期居住的肥胖伴反流症状就诊患者中，GerdQ总分对GERD的判别能力有限，≥8分界值特异度低，8~9分基本不提供诊断信息，不宜单独作为诊断依据，可作为症状评估和随访的辅助工具。4周PPI联合减重管理后多数患者症状有所改善，但残余症状常见；治疗期减重幅度较大和胃镜异常与短期症状改善相关，症状改善率按胃镜异常、胃镜阴性且PPI试验阳性、PPI试验阴性的顺序递减。上述结果尚需设立对照、采用反流监测和标准化疗效评价的多中心前瞻性研究验证。</w:t>
+      </w:r>
+    </w:p>
+    <w:p>
+      <w:pPr>
+        <w:spacing w:line="360" w:lineRule="auto" w:after="60"/>
+      </w:pPr>
+      <w:r>
+        <w:rPr>
+          <w:rFonts w:ascii="Times New Roman" w:hAnsi="Times New Roman" w:cs="Times New Roman" w:eastAsia="宋体"/>
+          <w:sz w:val="21"/>
+        </w:rPr>
+        <w:pict>
+          <v:rect style="width:0;height:1.5pt" o:hralign="center" o:hrstd="t" o:hr="t"/>
+        </w:pict>
+      </w:r>
+    </w:p>
+    <w:p>
+      <w:pPr>
+        <w:pStyle w:val="FirstParagraph"/>
+        <w:spacing w:line="360" w:lineRule="auto" w:after="60"/>
+      </w:pPr>
+      <w:r>
+        <w:rPr>
+          <w:rFonts w:hint="eastAsia" w:ascii="Times New Roman" w:hAnsi="Times New Roman" w:cs="Times New Roman" w:eastAsia="宋体"/>
           <w:b/>
           <w:bCs/>
           <w:sz w:val="21"/>
         </w:rPr>
-        <w:t xml:space="preserve">图7</w:t>
-      </w:r>
-      <w:r>
-        <w:rPr>
-          <w:rFonts w:ascii="Times New Roman" w:hAnsi="Times New Roman" w:cs="Times New Roman" w:eastAsia="宋体"/>
+        <w:t xml:space="preserve">利益冲突</w:t>
+      </w:r>
+      <w:r>
+        <w:rPr>
+          <w:rFonts w:ascii="Times New Roman" w:hAnsi="Times New Roman" w:cs="Times New Roman" w:eastAsia="宋体"/>
+          <w:sz w:val="21"/>
+        </w:rPr>
+        <w:t xml:space="preserve">　</w:t>
+      </w:r>
+      <w:r>
+        <w:rPr>
+          <w:rFonts w:hint="eastAsia" w:ascii="Times New Roman" w:hAnsi="Times New Roman" w:cs="Times New Roman" w:eastAsia="宋体"/>
+          <w:sz w:val="21"/>
+        </w:rPr>
+        <w:t xml:space="preserve">所有作者均声明不存在利益冲突。</w:t>
+      </w:r>
+    </w:p>
+    <w:p>
+      <w:pPr>
+        <w:pStyle w:val="BodyText"/>
+        <w:spacing w:line="360" w:lineRule="auto" w:after="60"/>
+        <w:ind w:firstLine="420"/>
+      </w:pPr>
+      <w:r>
+        <w:rPr>
+          <w:rFonts w:hint="eastAsia" w:ascii="Times New Roman" w:hAnsi="Times New Roman" w:cs="Times New Roman" w:eastAsia="宋体"/>
           <w:b/>
           <w:bCs/>
           <w:sz w:val="21"/>
         </w:rPr>
+        <w:t xml:space="preserve">作者贡献声明</w:t>
+      </w:r>
+      <w:r>
+        <w:rPr>
+          <w:rFonts w:ascii="Times New Roman" w:hAnsi="Times New Roman" w:cs="Times New Roman" w:eastAsia="宋体"/>
+          <w:sz w:val="21"/>
+        </w:rPr>
         <w:t xml:space="preserve">　</w:t>
       </w:r>
       <w:r>
         <w:rPr>
           <w:rFonts w:hint="eastAsia" w:ascii="Times New Roman" w:hAnsi="Times New Roman" w:cs="Times New Roman" w:eastAsia="宋体"/>
-          <w:b/>
-          <w:bCs/>
-          <w:sz w:val="21"/>
-        </w:rPr>
-        <w:t xml:space="preserve">不同诊断路径患者的4周症状改善率（A）及胃镜阴性者PPI试验与4周症状改善的一致性（B）</w:t>
-      </w:r>
-      <w:r>
-        <w:rPr>
-          <w:rFonts w:ascii="Times New Roman" w:hAnsi="Times New Roman" w:cs="Times New Roman" w:eastAsia="宋体"/>
-          <w:sz w:val="21"/>
-        </w:rPr>
-        <w:t xml:space="preserve">　</w:t>
-      </w:r>
-      <w:r>
-        <w:rPr>
-          <w:rFonts w:hint="eastAsia" w:ascii="Times New Roman" w:hAnsi="Times New Roman" w:cs="Times New Roman" w:eastAsia="宋体"/>
-          <w:sz w:val="21"/>
-        </w:rPr>
-        <w:t xml:space="preserve">（新增；A图误差线为Wilson法95%CI）</w:t>
+          <w:sz w:val="21"/>
+        </w:rPr>
+        <w:t xml:space="preserve">路源：研究设计、数据分析、论文撰写；杨帅通、沈起莲、张成强、李晓峰、戴勇：病例收集、数据整理与核对；姜超：研究指导、论文审阅、经费支持。</w:t>
       </w:r>
     </w:p>
-    <w:bookmarkEnd w:id="30"/>
-    <w:bookmarkStart w:id="31" w:name="参考文献"/>
+    <w:bookmarkEnd w:id="38"/>
+    <w:bookmarkStart w:id="39" w:name="参考文献"/>
     <w:p>
       <w:pPr>
         <w:pStyle w:val="Heading2"/>
@@ -13424,8 +13775,8 @@
         <w:t xml:space="preserve">[28] TACK J, TALLEY N J, CAMILLERI M, et al. Functional gastroduodenal disorders[J]. Gastroenterology, 2006, 130(5): 1466-1479. DOI: 10.1053/j.gastro.2005.11.059.</w:t>
       </w:r>
     </w:p>
-    <w:bookmarkEnd w:id="31"/>
-    <w:bookmarkEnd w:id="32"/>
+    <w:bookmarkEnd w:id="39"/>
+    <w:bookmarkEnd w:id="40"/>
     <w:sectPr>
       <w:footnotePr>
         <w:numRestart w:val="eachSect"/>

</xml_diff>